<commit_message>
Revisa anteprojeto aplicando estratégias de apresentação (Motta-Roth; Hendges)
- Quantifica letalidade policial na Bahia (Anuário FBSP 2025)
- Cita a dissertação SOUSA (2024) e liga a hipótese aos seus achados
- Fundamenta a lacuna do controle como sistema com a literatura
- Explicita limitações metodológicas e medidas de contorno

Co-Authored-By: Claude Opus 5.5 <noreply@anthropic.com>
Claude-Session: https://claude.ai/code/session_01Qr8VTDqrsRmu6Ph9ZQrmh3
</commit_message>
<xml_diff>
--- a/entregas/anteprojeto.docx
+++ b/entregas/anteprojeto.docx
@@ -155,7 +155,7 @@
           <w:rFonts w:ascii="Times New Roman" w:hAnsi="Times New Roman" w:eastAsia="Times New Roman" w:cs="Times New Roman"/>
           <w:sz w:val="24"/>
         </w:rPr>
-        <w:t xml:space="preserve">Ocorre que, na prática, a gestão desses programas apoia-se sobretudo em metas quantitativas, como a redução dos Crimes Violentos Letais e Intencionais (CVLI) e dos Crimes Violentos contra o Patrimônio (CVP), em registros de produtividade e em premiações por desempenho. Em outras palavras, tais instrumentos dizem muito sobre o que a polícia faz, mas pouco sobre como ela trata as pessoas com quem interage. Esse descompasso torna-se ainda mais grave quando se observa que a Bahia figura, nos últimos anos, entre os estados com maior número de mortes decorrentes de intervenção policial (FÓRUM BRASILEIRO DE SEGURANÇA PÚBLICA, 2025). A distância entre a retórica comunitária e os mecanismos efetivos de controle é, portanto, o ponto de partida desta proposta.</w:t>
+        <w:t xml:space="preserve">Ocorre que, na prática, a gestão desses programas apoia-se sobretudo em metas quantitativas, como a redução dos Crimes Violentos Letais e Intencionais (CVLI) e dos Crimes Violentos contra o Patrimônio (CVP), em registros de produtividade e em premiações por desempenho. Em outras palavras, tais instrumentos dizem muito sobre o que a polícia faz, mas pouco sobre como ela trata as pessoas com quem interage. Esse descompasso torna-se ainda mais grave quando se observa que a Bahia figura, nos últimos anos, entre os estados com maior número de mortes decorrentes de intervenção policial: somente em 2024, foram 1.556 vítimas, o equivalente a cerca de quatro mortes por dia (FÓRUM BRASILEIRO DE SEGURANÇA PÚBLICA, 2025). A distância entre a retórica comunitária e os mecanismos efetivos de controle é, portanto, o ponto de partida desta proposta.</w:t>
       </w:r>
     </w:p>
     <w:p>
@@ -170,7 +170,7 @@
           <w:rFonts w:ascii="Times New Roman" w:hAnsi="Times New Roman" w:eastAsia="Times New Roman" w:cs="Times New Roman"/>
           <w:sz w:val="24"/>
         </w:rPr>
-        <w:t xml:space="preserve">Nessa direção, estudo anterior, desenvolvido em mestrado profissional sobre indicadores de desempenho na Polícia Militar da Bahia, mostrou que os instrumentos de controle perdem eficácia quando atuam de forma isolada e desarticulada, e que faltam mecanismos de natureza preventiva e ética, e não apenas punitiva. Aquele trabalho, contudo, restringiu-se à análise bibliográfica e documental em escala estadual. Assim, ficou por investigar como esses controles funcionam no território e como são percebidos pela população policiada, lacuna que a presente tese pretende enfrentar.</w:t>
+        <w:t xml:space="preserve">Nessa direção, dissertação de mestrado profissional desenvolvida pelo proponente sobre indicadores de desempenho na Polícia Militar da Bahia (SOUSA, 2024) mostrou que nenhum dos instrumentos de controle analisados — corregedoria, Ministério Público, ouvidoria, conselhos comunitários e imprensa — atende plenamente às demandas da atividade policial, sobretudo quando atuam de forma isolada e desarticulada, e que faltam mecanismos de natureza preventiva e ética, e não apenas punitiva. Aquele trabalho, contudo, restringiu-se à análise bibliográfica e documental em escala estadual, sem ouvir os atores envolvidos. Assim, ficou por investigar como esses controles funcionam no território e como são percebidos pela população policiada, lacuna que a presente tese pretende enfrentar.</w:t>
       </w:r>
     </w:p>
     <w:p>
@@ -216,7 +216,7 @@
           <w:rFonts w:ascii="Times New Roman" w:hAnsi="Times New Roman" w:eastAsia="Times New Roman" w:cs="Times New Roman"/>
           <w:sz w:val="24"/>
         </w:rPr>
-        <w:t xml:space="preserve">Do ponto de vista científico, o estudo desloca o debate da eficácia gerencial — a polícia entrega resultados? — para o problema da legitimação do poder — a polícia é reconhecida como justa e passível de controle? Para tanto, articula a teoria da legitimidade procedimental à literatura brasileira sobre controle da atividade policial. Além disso, sua originalidade reside em tratar o controle como sistema, examinando em conjunto corregedoria, Ministério Público, ouvidoria, conselhos comunitários e imprensa, e em fazê-lo numa região interiorana, marcada pelo turismo e pela presença de povos indígenas, comunidades quilombolas e periferias urbanas, contexto pouco contemplado por uma produção concentrada nas capitais.</w:t>
+        <w:t xml:space="preserve">Do ponto de vista científico, o estudo desloca o debate da eficácia gerencial — a polícia entrega resultados? — para o problema da legitimação do poder — a polícia é reconhecida como justa e passível de controle? Para tanto, articula a teoria da legitimidade procedimental à literatura brasileira sobre controle da atividade policial. Além disso, sua originalidade reside em tratar o controle como sistema. A literatura brasileira tem examinado essas instâncias separadamente — as ouvidorias e corregedorias (LEMGRUBER; MUSUMECI; CANO, 2003), o Ministério Público (PEDROSA JÚNIOR; MONTEIRO; NASCIMENTO, 2023), os conselhos comunitários (BUENO; LIMA; TEIXEIRA, 2016) e o controle disciplinar interno (ARAÚJO; OLIVEIRA; SAMPAIO, 2025) —, ao passo que esta pesquisa as examina em conjunto. A proposta também se diferencia por fazê-lo numa região interiorana, marcada pelo turismo e pela presença de povos indígenas, comunidades quilombolas e periferias urbanas, contexto pouco contemplado por uma produção concentrada nas capitais.</w:t>
       </w:r>
     </w:p>
     <w:p>
@@ -432,7 +432,7 @@
           <w:rFonts w:ascii="Times New Roman" w:hAnsi="Times New Roman" w:eastAsia="Times New Roman" w:cs="Times New Roman"/>
           <w:sz w:val="24"/>
         </w:rPr>
-        <w:t xml:space="preserve">os controles existentes operam de maneira fragmentada e predominantemente reativa e punitiva, o que produz conformidade com metas, mas pouca legitimidade. Mecanismos articulados entre si e abertos à participação comunitária tenderiam a ampliar a confiança na polícia e a percepção de justiça procedimental.</w:t>
+        <w:t xml:space="preserve">em continuidade aos achados de Sousa (2024), os controles existentes operam de maneira fragmentada e predominantemente reativa e punitiva, o que produz conformidade com metas, mas pouca legitimidade. Mecanismos articulados entre si e abertos à participação comunitária tenderiam a ampliar a confiança na polícia e a percepção de justiça procedimental.</w:t>
       </w:r>
     </w:p>
     <w:bookmarkEnd w:id="21"/>
@@ -1023,7 +1023,7 @@
           <w:rFonts w:ascii="Times New Roman" w:hAnsi="Times New Roman" w:eastAsia="Times New Roman" w:cs="Times New Roman"/>
           <w:sz w:val="24"/>
         </w:rPr>
-        <w:t xml:space="preserve">O projeto será submetido ao Comitê de Ética em Pesquisa, nos termos das Resoluções CNS nº 466/2012 e nº 510/2016, assegurando-se o consentimento livre e esclarecido e o anonimato dos participantes. No caso de povos indígenas e comunidades tradicionais, haverá consulta prévia às lideranças e, quando exigido, apreciação pela Comissão Nacional de Ética em Pesquisa. Será igualmente solicitada a anuência institucional da Polícia Militar. O vínculo profissional do pesquisador com a instituição estudada será tratado com reflexividade, reconhecido tanto como limite potencial quanto como condição privilegiada de acesso ao campo.</w:t>
+        <w:t xml:space="preserve">O projeto será submetido ao Comitê de Ética em Pesquisa, nos termos das Resoluções CNS nº 466/2012 e nº 510/2016, assegurando-se o consentimento livre e esclarecido e o anonimato dos participantes. No caso de povos indígenas e comunidades tradicionais, haverá consulta prévia às lideranças e, quando exigido, apreciação pela Comissão Nacional de Ética em Pesquisa. Será igualmente solicitada a anuência institucional da Polícia Militar. O vínculo profissional do pesquisador com a instituição estudada será tratado com reflexividade, reconhecido tanto como limite potencial quanto como condição privilegiada de acesso ao campo. Para reduzir o risco de respostas condicionadas pela hierarquia, as entrevistas com policiais serão realizadas fora do ambiente de trabalho e sem relação de subordinação com o pesquisador. Reconhecem-se, ainda, duas limitações: o eventual indeferimento ou atraso de pedidos via Lei de Acesso à Informação, a ser contornado por recursos administrativos e pela triangulação com fontes públicas; e o alcance restrito dos achados, próprio do estudo de casos múltiplos, que não autoriza generalização estatística para o estado, mas permite generalização analítica a contextos interioranos semelhantes.</w:t>
       </w:r>
     </w:p>
     <w:bookmarkEnd w:id="23"/>
@@ -1920,6 +1920,35 @@
           <w:sz w:val="24"/>
         </w:rPr>
         <w:t xml:space="preserve">: questões e práticas através do mundo. São Paulo: Edusp, 2002.</w:t>
+      </w:r>
+    </w:p>
+    <w:p>
+      <w:pPr>
+        <w:pStyle w:val="BodyText"/>
+        <w:spacing w:line="240" w:lineRule="auto" w:before="0" w:after="240"/>
+        <w:jc w:val="left"/>
+      </w:pPr>
+      <w:r>
+        <w:rPr>
+          <w:rFonts w:ascii="Times New Roman" w:hAnsi="Times New Roman" w:eastAsia="Times New Roman" w:cs="Times New Roman"/>
+          <w:sz w:val="24"/>
+        </w:rPr>
+        <w:t xml:space="preserve">SOUSA, L. H. S. </w:t>
+      </w:r>
+      <w:r>
+        <w:rPr>
+          <w:b/>
+          <w:rFonts w:ascii="Times New Roman" w:hAnsi="Times New Roman" w:eastAsia="Times New Roman" w:cs="Times New Roman"/>
+          <w:sz w:val="24"/>
+        </w:rPr>
+        <w:t xml:space="preserve">Os indicadores de desempenho como mecanismo de controle na atividade de policiamento comunitário</w:t>
+      </w:r>
+      <w:r>
+        <w:rPr>
+          <w:rFonts w:ascii="Times New Roman" w:hAnsi="Times New Roman" w:eastAsia="Times New Roman" w:cs="Times New Roman"/>
+          <w:sz w:val="24"/>
+        </w:rPr>
+        <w:t xml:space="preserve">. 2024. Dissertação (Mestrado Profissional em Segurança Pública, Justiça e Cidadania) – Escola de Administração/Faculdade de Direito, Universidade Federal da Bahia, Salvador, 2024.</w:t>
       </w:r>
     </w:p>
     <w:p>

</xml_diff>

<commit_message>
Enxuga anteprojeto, formata tabelas e troca travessões por vírgulas
- Texto reduzido de 8 para 7 páginas
- Tabelas com cabeçalho cinza, bordas e linhas alternadas
- Apostos marcados por vírgulas em vez de travessões

Co-Authored-By: Claude Opus 5.5 <noreply@anthropic.com>
Claude-Session: https://claude.ai/code/session_01Qr8VTDqrsRmu6Ph9ZQrmh3
</commit_message>
<xml_diff>
--- a/entregas/anteprojeto.docx
+++ b/entregas/anteprojeto.docx
@@ -170,7 +170,7 @@
           <w:rFonts w:ascii="Times New Roman" w:hAnsi="Times New Roman" w:eastAsia="Times New Roman" w:cs="Times New Roman"/>
           <w:sz w:val="24"/>
         </w:rPr>
-        <w:t xml:space="preserve">Nessa direção, dissertação de mestrado profissional desenvolvida pelo proponente sobre indicadores de desempenho na Polícia Militar da Bahia (SOUSA, 2024) mostrou que nenhum dos instrumentos de controle analisados — corregedoria, Ministério Público, ouvidoria, conselhos comunitários e imprensa — atende plenamente às demandas da atividade policial, sobretudo quando atuam de forma isolada e desarticulada, e que faltam mecanismos de natureza preventiva e ética, e não apenas punitiva. Aquele trabalho, contudo, restringiu-se à análise bibliográfica e documental em escala estadual, sem ouvir os atores envolvidos. Assim, ficou por investigar como esses controles funcionam no território e como são percebidos pela população policiada, lacuna que a presente tese pretende enfrentar.</w:t>
+        <w:t xml:space="preserve">Nessa direção, dissertação de mestrado profissional desenvolvida pelo proponente sobre indicadores de desempenho na Polícia Militar da Bahia (SOUSA, 2024) mostrou que nenhum dos instrumentos de controle analisados, entre eles corregedoria, Ministério Público, ouvidoria, conselhos comunitários e imprensa, atende plenamente às demandas da atividade policial, sobretudo quando atuam de forma isolada e desarticulada, e que faltam mecanismos de natureza preventiva e ética, e não apenas punitiva. Aquele trabalho, contudo, restringiu-se à análise bibliográfica e documental em escala estadual, sem ouvir os atores envolvidos. Assim, ficou por investigar como esses controles funcionam no território e como são percebidos pela população policiada, lacuna que a presente tese pretende enfrentar.</w:t>
       </w:r>
     </w:p>
     <w:p>
@@ -216,7 +216,7 @@
           <w:rFonts w:ascii="Times New Roman" w:hAnsi="Times New Roman" w:eastAsia="Times New Roman" w:cs="Times New Roman"/>
           <w:sz w:val="24"/>
         </w:rPr>
-        <w:t xml:space="preserve">Do ponto de vista científico, o estudo desloca o debate da eficácia gerencial — a polícia entrega resultados? — para o problema da legitimação do poder — a polícia é reconhecida como justa e passível de controle? Para tanto, articula a teoria da legitimidade procedimental à literatura brasileira sobre controle da atividade policial. Além disso, sua originalidade reside em tratar o controle como sistema. A literatura brasileira tem examinado essas instâncias separadamente — as ouvidorias e corregedorias (LEMGRUBER; MUSUMECI; CANO, 2003), o Ministério Público (PEDROSA JÚNIOR; MONTEIRO; NASCIMENTO, 2023), os conselhos comunitários (BUENO; LIMA; TEIXEIRA, 2016) e o controle disciplinar interno (ARAÚJO; OLIVEIRA; SAMPAIO, 2025) —, ao passo que esta pesquisa as examina em conjunto. A proposta também se diferencia por fazê-lo numa região interiorana, marcada pelo turismo e pela presença de povos indígenas, comunidades quilombolas e periferias urbanas, contexto pouco contemplado por uma produção concentrada nas capitais.</w:t>
+        <w:t xml:space="preserve">Do ponto de vista científico, o estudo desloca o debate da eficácia gerencial, isto é, se a polícia entrega resultados, para o problema da legitimação do poder, isto é, se a polícia é reconhecida como justa e passível de controle. Para tanto, articula a teoria da legitimidade procedimental à literatura brasileira sobre controle da atividade policial. Além disso, sua originalidade reside em tratar o controle como sistema. A literatura brasileira tem examinado essas instâncias separadamente: as ouvidorias e corregedorias (LEMGRUBER; MUSUMECI; CANO, 2003), o Ministério Público (PEDROSA JÚNIOR; MONTEIRO; NASCIMENTO, 2023), os conselhos comunitários (BUENO; LIMA; TEIXEIRA, 2016) e o controle disciplinar interno (ARAÚJO; OLIVEIRA; SAMPAIO, 2025). Esta pesquisa, ao contrário, as examina em conjunto. A proposta também se diferencia por fazê-lo numa região interiorana, marcada pelo turismo e pela presença de povos indígenas, comunidades quilombolas e periferias urbanas, contexto pouco contemplado por uma produção concentrada nas capitais.</w:t>
       </w:r>
     </w:p>
     <w:p>
@@ -231,7 +231,7 @@
           <w:rFonts w:ascii="Times New Roman" w:hAnsi="Times New Roman" w:eastAsia="Times New Roman" w:cs="Times New Roman"/>
           <w:sz w:val="24"/>
         </w:rPr>
-        <w:t xml:space="preserve">Na dimensão social, a segurança pública constitui questão prioritária para a qualidade de vida no Sul da Bahia. Espera-se que a pesquisa ofereça subsídios para a construção de indicadores de qualidade e de confiança que complementem os de produtividade, bem como para o fortalecimento do controle social em âmbito local.</w:t>
+        <w:t xml:space="preserve">Na dimensão social, espera-se oferecer subsídios para indicadores de qualidade e de confiança que complementem os de produtividade e para o fortalecimento do controle social local.</w:t>
       </w:r>
     </w:p>
     <w:p>
@@ -246,7 +246,7 @@
           <w:rFonts w:ascii="Times New Roman" w:hAnsi="Times New Roman" w:eastAsia="Times New Roman" w:cs="Times New Roman"/>
           <w:sz w:val="24"/>
         </w:rPr>
-        <w:t xml:space="preserve">Por essas razões, a proposta insere-se na Linha 1 do PPGES porque toma o Estado como conjunto heterogêneo de instituições e se debruça sobre as dinâmicas do exercício do poder, os processos de legitimação, a relação entre Estado e sociedade civil e as instâncias de controle e fiscalização de programas de governo, eixos que compõem a própria descrição da linha.</w:t>
+        <w:t xml:space="preserve">Por essas razões, a proposta insere-se na Linha 1 do PPGES, ao tratar dos processos de legitimação, da relação entre Estado e sociedade civil e das instâncias de controle de programas de governo.</w:t>
       </w:r>
     </w:p>
     <w:bookmarkEnd w:id="20"/>
@@ -329,7 +329,7 @@
           <w:rFonts w:ascii="Times New Roman" w:hAnsi="Times New Roman" w:eastAsia="Times New Roman" w:cs="Times New Roman"/>
           <w:sz w:val="24"/>
         </w:rPr>
-        <w:t xml:space="preserve">mapear as instâncias de controle que incidem sobre o policiamento comunitário na região — Corregedoria da Polícia Militar, Ministério Público, Ouvidoria, conselhos comunitários de segurança e imprensa local —, identificando suas atribuições, fluxos e capacidades;</w:t>
+        <w:t xml:space="preserve">mapear as instâncias de controle que incidem sobre o policiamento comunitário na região, a saber, Corregedoria da Polícia Militar, Ministério Público, Ouvidoria, conselhos comunitários de segurança e imprensa local, identificando suas atribuições, fluxos e capacidades;</w:t>
       </w:r>
     </w:p>
     <w:p>
@@ -509,7 +509,7 @@
           <w:rFonts w:ascii="Times New Roman" w:hAnsi="Times New Roman" w:eastAsia="Times New Roman" w:cs="Times New Roman"/>
           <w:sz w:val="24"/>
         </w:rPr>
-        <w:t xml:space="preserve">No terceiro eixo, Sapori (2007) discute a adoção da gestão por resultados na segurança pública brasileira, e Santos e Gomes (2021), em revisão sistemática, mostram que não há metodologia única para avaliar o desempenho policial, devendo a mensuração corresponder aos objetivos de cada organização. Complementarmente, Lui e Sales (2024) mapeiam a agenda do policiamento baseado em evidências. Quanto ao policiamento comunitário, Muniz e Paes-Machado (2010) problematizam as experiências baianas, e Ferreira, Rossoni e Oliveira (2022) demonstram que esse modelo, incluindo as Bases Comunitárias da Bahia, é atravessado por quatro lógicas institucionais — militar, profissional, gerencial e comunitária —, cuja tensão ajuda a explicar por que as metas gerenciais frequentemente se sobrepõem à proximidade. A participação social, ademais, encontra limites na própria cultura policial: ao estudar os conselhos comunitários de segurança paulistas, Bueno, Lima e Teixeira (2016) mostram que o cidadão tende a ser tratado mais como demandante do que como sujeito da política.</w:t>
+        <w:t xml:space="preserve">No terceiro eixo, Sapori (2007) discute a adoção da gestão por resultados na segurança pública brasileira, e Santos e Gomes (2021), em revisão sistemática, mostram que não há metodologia única para avaliar o desempenho policial, devendo a mensuração corresponder aos objetivos de cada organização. Complementarmente, Lui e Sales (2024) mapeiam a agenda do policiamento baseado em evidências. Quanto ao policiamento comunitário, Muniz e Paes-Machado (2010) problematizam as experiências baianas, e Ferreira, Rossoni e Oliveira (2022) demonstram que esse modelo, incluindo as Bases Comunitárias da Bahia, é atravessado por quatro lógicas institucionais, a militar, a profissional, a gerencial e a comunitária, cuja tensão ajuda a explicar por que as metas gerenciais frequentemente se sobrepõem à proximidade. A participação social, ademais, encontra limites na própria cultura policial: ao estudar os conselhos comunitários de segurança paulistas, Bueno, Lima e Teixeira (2016) mostram que o cidadão tende a ser tratado mais como demandante do que como sujeito da política.</w:t>
       </w:r>
     </w:p>
     <w:p>
@@ -524,7 +524,7 @@
           <w:rFonts w:ascii="Times New Roman" w:hAnsi="Times New Roman" w:eastAsia="Times New Roman" w:cs="Times New Roman"/>
           <w:sz w:val="24"/>
         </w:rPr>
-        <w:t xml:space="preserve">Cabe destacar, ainda, que a confiança na polícia, variável central para esta pesquisa, mostra-se baixa no país, mas sensível ao contexto: Rolim e Hermann (2018) verificaram, em Porto Alegre, níveis de confiança inferiores aos observados em cidades menores. Tal achado justifica, por conseguinte, investigar um contexto interiorano como o do Extremo Sul baiano. Por fim, a noção de pluralismo jurídico, presente na descrição da Linha 1, oferece chave analítica para a relação entre a polícia e os povos indígenas e comunidades tradicionais da região.</w:t>
+        <w:t xml:space="preserve">A confiança na polícia, variável central desta pesquisa, é baixa no país, mas sensível ao contexto: Rolim e Hermann (2018) verificaram, em Porto Alegre, níveis inferiores aos de cidades menores, o que justifica investigar o interior. Por fim, a noção de pluralismo jurídico, presente na Linha 1, oferece chave analítica para a relação entre a polícia e os povos e comunidades tradicionais.</w:t>
       </w:r>
     </w:p>
     <w:bookmarkEnd w:id="22"/>
@@ -556,27 +556,46 @@
           <w:rFonts w:ascii="Times New Roman" w:hAnsi="Times New Roman" w:eastAsia="Times New Roman" w:cs="Times New Roman"/>
           <w:sz w:val="24"/>
         </w:rPr>
-        <w:t xml:space="preserve">Trata-se de pesquisa de abordagem qualitativa, com apoio quantitativo descritivo, delineada como estudo de casos múltiplos em dois ou três municípios do Extremo Sul da Bahia — a exemplo de Porto Seguro, Eunápolis e Teixeira de Freitas. A seleção definitiva considerará a existência de unidades de policiamento comunitário em funcionamento. O quadro a seguir relaciona cada objetivo específico às fontes, aos instrumentos e à forma de análise.</w:t>
+        <w:t xml:space="preserve">Trata-se de pesquisa de abordagem qualitativa, com apoio quantitativo descritivo, delineada como estudo de casos múltiplos em dois ou três municípios do Extremo Sul da Bahia, a exemplo de Porto Seguro, Eunápolis e Teixeira de Freitas. A seleção definitiva considerará a existência de unidades de policiamento comunitário em funcionamento. O quadro a seguir relaciona cada objetivo específico às fontes, aos instrumentos e à forma de análise.</w:t>
       </w:r>
     </w:p>
     <w:tbl>
       <w:tblPr>
-        <w:tblW w:type="pct" w:w="5000"/>
+        <w:tblW w:type="dxa" w:w="9070"/>
+        <w:tblBorders>
+          <w:top w:val="single" w:sz="4" w:space="0" w:color="808080"/>
+          <w:left w:val="single" w:sz="4" w:space="0" w:color="808080"/>
+          <w:bottom w:val="single" w:sz="4" w:space="0" w:color="808080"/>
+          <w:right w:val="single" w:sz="4" w:space="0" w:color="808080"/>
+          <w:insideH w:val="single" w:sz="4" w:space="0" w:color="808080"/>
+          <w:insideV w:val="single" w:sz="4" w:space="0" w:color="808080"/>
+        </w:tblBorders>
+        <w:tblLayout w:type="fixed"/>
+        <w:tblCellMar>
+          <w:top w:w="57" w:type="dxa"/>
+          <w:left w:w="85" w:type="dxa"/>
+          <w:bottom w:w="57" w:type="dxa"/>
+          <w:right w:w="85" w:type="dxa"/>
+        </w:tblCellMar>
         <w:tblLook w:firstRow="1" w:lastRow="0" w:firstColumn="0" w:lastColumn="0" w:noHBand="0" w:noVBand="0" w:val="0020"/>
         <w:jc w:val="start"/>
       </w:tblPr>
       <w:tblGrid>
-        <w:gridCol w:w="1980"/>
-        <w:gridCol w:w="1980"/>
-        <w:gridCol w:w="1980"/>
-        <w:gridCol w:w="1980"/>
+        <w:gridCol w:w="1900"/>
+        <w:gridCol w:w="2500"/>
+        <w:gridCol w:w="2100"/>
+        <w:gridCol w:w="2570"/>
       </w:tblGrid>
       <w:tr>
         <w:trPr>
           <w:tblHeader w:val="true"/>
         </w:trPr>
         <w:tc>
-          <w:tcPr/>
+          <w:tcPr>
+            <w:tcW w:w="1900" w:type="dxa"/>
+            <w:shd w:val="clear" w:color="auto" w:fill="D9D9D9"/>
+            <w:vAlign w:val="center"/>
+          </w:tcPr>
           <w:p>
             <w:pPr>
               <w:pStyle w:val="Compact"/>
@@ -586,6 +605,7 @@
             <w:r>
               <w:rPr>
                 <w:rFonts w:ascii="Times New Roman" w:hAnsi="Times New Roman" w:eastAsia="Times New Roman" w:cs="Times New Roman"/>
+                <w:b/>
                 <w:sz w:val="20"/>
               </w:rPr>
               <w:t xml:space="preserve">Objetivo</w:t>
@@ -593,7 +613,11 @@
           </w:p>
         </w:tc>
         <w:tc>
-          <w:tcPr/>
+          <w:tcPr>
+            <w:tcW w:w="2500" w:type="dxa"/>
+            <w:shd w:val="clear" w:color="auto" w:fill="D9D9D9"/>
+            <w:vAlign w:val="center"/>
+          </w:tcPr>
           <w:p>
             <w:pPr>
               <w:pStyle w:val="Compact"/>
@@ -603,6 +627,7 @@
             <w:r>
               <w:rPr>
                 <w:rFonts w:ascii="Times New Roman" w:hAnsi="Times New Roman" w:eastAsia="Times New Roman" w:cs="Times New Roman"/>
+                <w:b/>
                 <w:sz w:val="20"/>
               </w:rPr>
               <w:t xml:space="preserve">Participantes e fontes</w:t>
@@ -610,7 +635,11 @@
           </w:p>
         </w:tc>
         <w:tc>
-          <w:tcPr/>
+          <w:tcPr>
+            <w:tcW w:w="2100" w:type="dxa"/>
+            <w:shd w:val="clear" w:color="auto" w:fill="D9D9D9"/>
+            <w:vAlign w:val="center"/>
+          </w:tcPr>
           <w:p>
             <w:pPr>
               <w:pStyle w:val="Compact"/>
@@ -620,6 +649,7 @@
             <w:r>
               <w:rPr>
                 <w:rFonts w:ascii="Times New Roman" w:hAnsi="Times New Roman" w:eastAsia="Times New Roman" w:cs="Times New Roman"/>
+                <w:b/>
                 <w:sz w:val="20"/>
               </w:rPr>
               <w:t xml:space="preserve">Instrumento</w:t>
@@ -627,7 +657,11 @@
           </w:p>
         </w:tc>
         <w:tc>
-          <w:tcPr/>
+          <w:tcPr>
+            <w:tcW w:w="2570" w:type="dxa"/>
+            <w:shd w:val="clear" w:color="auto" w:fill="D9D9D9"/>
+            <w:vAlign w:val="center"/>
+          </w:tcPr>
           <w:p>
             <w:pPr>
               <w:pStyle w:val="Compact"/>
@@ -637,6 +671,7 @@
             <w:r>
               <w:rPr>
                 <w:rFonts w:ascii="Times New Roman" w:hAnsi="Times New Roman" w:eastAsia="Times New Roman" w:cs="Times New Roman"/>
+                <w:b/>
                 <w:sz w:val="20"/>
               </w:rPr>
               <w:t xml:space="preserve">Análise</w:t>
@@ -646,7 +681,10 @@
       </w:tr>
       <w:tr>
         <w:tc>
-          <w:tcPr/>
+          <w:tcPr>
+            <w:tcW w:w="1900" w:type="dxa"/>
+            <w:vAlign w:val="center"/>
+          </w:tcPr>
           <w:p>
             <w:pPr>
               <w:pStyle w:val="Compact"/>
@@ -656,6 +694,7 @@
             <w:r>
               <w:rPr>
                 <w:rFonts w:ascii="Times New Roman" w:hAnsi="Times New Roman" w:eastAsia="Times New Roman" w:cs="Times New Roman"/>
+                <w:b/>
                 <w:sz w:val="20"/>
               </w:rPr>
               <w:t xml:space="preserve">a) Mapear as instâncias de controle</w:t>
@@ -663,7 +702,10 @@
           </w:p>
         </w:tc>
         <w:tc>
-          <w:tcPr/>
+          <w:tcPr>
+            <w:tcW w:w="2500" w:type="dxa"/>
+            <w:vAlign w:val="center"/>
+          </w:tcPr>
           <w:p>
             <w:pPr>
               <w:pStyle w:val="Compact"/>
@@ -680,7 +722,10 @@
           </w:p>
         </w:tc>
         <w:tc>
-          <w:tcPr/>
+          <w:tcPr>
+            <w:tcW w:w="2100" w:type="dxa"/>
+            <w:vAlign w:val="center"/>
+          </w:tcPr>
           <w:p>
             <w:pPr>
               <w:pStyle w:val="Compact"/>
@@ -697,7 +742,10 @@
           </w:p>
         </w:tc>
         <w:tc>
-          <w:tcPr/>
+          <w:tcPr>
+            <w:tcW w:w="2570" w:type="dxa"/>
+            <w:vAlign w:val="center"/>
+          </w:tcPr>
           <w:p>
             <w:pPr>
               <w:pStyle w:val="Compact"/>
@@ -716,7 +764,11 @@
       </w:tr>
       <w:tr>
         <w:tc>
-          <w:tcPr/>
+          <w:tcPr>
+            <w:tcW w:w="1900" w:type="dxa"/>
+            <w:shd w:val="clear" w:color="auto" w:fill="F2F2F2"/>
+            <w:vAlign w:val="center"/>
+          </w:tcPr>
           <w:p>
             <w:pPr>
               <w:pStyle w:val="Compact"/>
@@ -726,6 +778,7 @@
             <w:r>
               <w:rPr>
                 <w:rFonts w:ascii="Times New Roman" w:hAnsi="Times New Roman" w:eastAsia="Times New Roman" w:cs="Times New Roman"/>
+                <w:b/>
                 <w:sz w:val="20"/>
               </w:rPr>
               <w:t xml:space="preserve">b) Examinar os indicadores do Pacto pela Vida</w:t>
@@ -733,7 +786,11 @@
           </w:p>
         </w:tc>
         <w:tc>
-          <w:tcPr/>
+          <w:tcPr>
+            <w:tcW w:w="2500" w:type="dxa"/>
+            <w:shd w:val="clear" w:color="auto" w:fill="F2F2F2"/>
+            <w:vAlign w:val="center"/>
+          </w:tcPr>
           <w:p>
             <w:pPr>
               <w:pStyle w:val="Compact"/>
@@ -750,7 +807,11 @@
           </w:p>
         </w:tc>
         <w:tc>
-          <w:tcPr/>
+          <w:tcPr>
+            <w:tcW w:w="2100" w:type="dxa"/>
+            <w:shd w:val="clear" w:color="auto" w:fill="F2F2F2"/>
+            <w:vAlign w:val="center"/>
+          </w:tcPr>
           <w:p>
             <w:pPr>
               <w:pStyle w:val="Compact"/>
@@ -767,7 +828,11 @@
           </w:p>
         </w:tc>
         <w:tc>
-          <w:tcPr/>
+          <w:tcPr>
+            <w:tcW w:w="2570" w:type="dxa"/>
+            <w:shd w:val="clear" w:color="auto" w:fill="F2F2F2"/>
+            <w:vAlign w:val="center"/>
+          </w:tcPr>
           <w:p>
             <w:pPr>
               <w:pStyle w:val="Compact"/>
@@ -786,7 +851,10 @@
       </w:tr>
       <w:tr>
         <w:tc>
-          <w:tcPr/>
+          <w:tcPr>
+            <w:tcW w:w="1900" w:type="dxa"/>
+            <w:vAlign w:val="center"/>
+          </w:tcPr>
           <w:p>
             <w:pPr>
               <w:pStyle w:val="Compact"/>
@@ -796,6 +864,7 @@
             <w:r>
               <w:rPr>
                 <w:rFonts w:ascii="Times New Roman" w:hAnsi="Times New Roman" w:eastAsia="Times New Roman" w:cs="Times New Roman"/>
+                <w:b/>
                 <w:sz w:val="20"/>
               </w:rPr>
               <w:t xml:space="preserve">c) Compreender as percepções dos atores</w:t>
@@ -803,7 +872,10 @@
           </w:p>
         </w:tc>
         <w:tc>
-          <w:tcPr/>
+          <w:tcPr>
+            <w:tcW w:w="2500" w:type="dxa"/>
+            <w:vAlign w:val="center"/>
+          </w:tcPr>
           <w:p>
             <w:pPr>
               <w:pStyle w:val="Compact"/>
@@ -820,7 +892,10 @@
           </w:p>
         </w:tc>
         <w:tc>
-          <w:tcPr/>
+          <w:tcPr>
+            <w:tcW w:w="2100" w:type="dxa"/>
+            <w:vAlign w:val="center"/>
+          </w:tcPr>
           <w:p>
             <w:pPr>
               <w:pStyle w:val="Compact"/>
@@ -837,7 +912,10 @@
           </w:p>
         </w:tc>
         <w:tc>
-          <w:tcPr/>
+          <w:tcPr>
+            <w:tcW w:w="2570" w:type="dxa"/>
+            <w:vAlign w:val="center"/>
+          </w:tcPr>
           <w:p>
             <w:pPr>
               <w:pStyle w:val="Compact"/>
@@ -856,7 +934,11 @@
       </w:tr>
       <w:tr>
         <w:tc>
-          <w:tcPr/>
+          <w:tcPr>
+            <w:tcW w:w="1900" w:type="dxa"/>
+            <w:shd w:val="clear" w:color="auto" w:fill="F2F2F2"/>
+            <w:vAlign w:val="center"/>
+          </w:tcPr>
           <w:p>
             <w:pPr>
               <w:pStyle w:val="Compact"/>
@@ -866,6 +948,7 @@
             <w:r>
               <w:rPr>
                 <w:rFonts w:ascii="Times New Roman" w:hAnsi="Times New Roman" w:eastAsia="Times New Roman" w:cs="Times New Roman"/>
+                <w:b/>
                 <w:sz w:val="20"/>
               </w:rPr>
               <w:t xml:space="preserve">d) Verificar variações por raça e território</w:t>
@@ -873,7 +956,11 @@
           </w:p>
         </w:tc>
         <w:tc>
-          <w:tcPr/>
+          <w:tcPr>
+            <w:tcW w:w="2500" w:type="dxa"/>
+            <w:shd w:val="clear" w:color="auto" w:fill="F2F2F2"/>
+            <w:vAlign w:val="center"/>
+          </w:tcPr>
           <w:p>
             <w:pPr>
               <w:pStyle w:val="Compact"/>
@@ -890,7 +977,11 @@
           </w:p>
         </w:tc>
         <w:tc>
-          <w:tcPr/>
+          <w:tcPr>
+            <w:tcW w:w="2100" w:type="dxa"/>
+            <w:shd w:val="clear" w:color="auto" w:fill="F2F2F2"/>
+            <w:vAlign w:val="center"/>
+          </w:tcPr>
           <w:p>
             <w:pPr>
               <w:pStyle w:val="Compact"/>
@@ -907,7 +998,11 @@
           </w:p>
         </w:tc>
         <w:tc>
-          <w:tcPr/>
+          <w:tcPr>
+            <w:tcW w:w="2570" w:type="dxa"/>
+            <w:shd w:val="clear" w:color="auto" w:fill="F2F2F2"/>
+            <w:vAlign w:val="center"/>
+          </w:tcPr>
           <w:p>
             <w:pPr>
               <w:pStyle w:val="Compact"/>
@@ -926,7 +1021,10 @@
       </w:tr>
       <w:tr>
         <w:tc>
-          <w:tcPr/>
+          <w:tcPr>
+            <w:tcW w:w="1900" w:type="dxa"/>
+            <w:vAlign w:val="center"/>
+          </w:tcPr>
           <w:p>
             <w:pPr>
               <w:pStyle w:val="Compact"/>
@@ -936,6 +1034,7 @@
             <w:r>
               <w:rPr>
                 <w:rFonts w:ascii="Times New Roman" w:hAnsi="Times New Roman" w:eastAsia="Times New Roman" w:cs="Times New Roman"/>
+                <w:b/>
                 <w:sz w:val="20"/>
               </w:rPr>
               <w:t xml:space="preserve">e) Propor a matriz de indicadores</w:t>
@@ -943,7 +1042,10 @@
           </w:p>
         </w:tc>
         <w:tc>
-          <w:tcPr/>
+          <w:tcPr>
+            <w:tcW w:w="2500" w:type="dxa"/>
+            <w:vAlign w:val="center"/>
+          </w:tcPr>
           <w:p>
             <w:pPr>
               <w:pStyle w:val="Compact"/>
@@ -960,7 +1062,10 @@
           </w:p>
         </w:tc>
         <w:tc>
-          <w:tcPr/>
+          <w:tcPr>
+            <w:tcW w:w="2100" w:type="dxa"/>
+            <w:vAlign w:val="center"/>
+          </w:tcPr>
           <w:p>
             <w:pPr>
               <w:pStyle w:val="Compact"/>
@@ -977,7 +1082,10 @@
           </w:p>
         </w:tc>
         <w:tc>
-          <w:tcPr/>
+          <w:tcPr>
+            <w:tcW w:w="2570" w:type="dxa"/>
+            <w:vAlign w:val="center"/>
+          </w:tcPr>
           <w:p>
             <w:pPr>
               <w:pStyle w:val="Compact"/>
@@ -998,7 +1106,7 @@
     <w:p>
       <w:pPr>
         <w:pStyle w:val="BodyText"/>
-        <w:spacing w:line="360" w:lineRule="auto" w:before="0" w:after="120"/>
+        <w:spacing w:line="360" w:lineRule="auto" w:before="240" w:after="120"/>
         <w:ind w:firstLine="709"/>
         <w:jc w:val="both"/>
       </w:pPr>
@@ -1055,7 +1163,7 @@
           <w:rFonts w:ascii="Times New Roman" w:hAnsi="Times New Roman" w:eastAsia="Times New Roman" w:cs="Times New Roman"/>
           <w:sz w:val="24"/>
         </w:rPr>
-        <w:t xml:space="preserve">No plano acadêmico, espera-se construir um modelo analítico que compreenda o controle policial como sistema articulado e o relacione à legitimidade, e não apenas à eficiência, contribuição inédita para o estudo do interior baiano. No âmbito da Linha 1, a tese deverá oferecer evidências sobre os processos de legitimação do Estado, a relação entre burocracia policial e sociedade civil e a fiscalização de programas de governo. Por fim, no plano social e profissional, pretende-se entregar à Secretaria da Segurança Pública, ao Ministério Público e aos conselhos comunitários uma matriz de indicadores de qualidade e confiança, além de divulgar os resultados em artigos científicos e em oficinas devolutivas nas comunidades participantes.</w:t>
+        <w:t xml:space="preserve">No plano acadêmico, espera-se construir um modelo analítico que compreenda o controle policial como sistema articulado e o relacione à legitimidade, e não apenas à eficiência, contribuição inédita para o estudo do interior baiano. Por fim, no plano social e profissional, pretende-se entregar à Secretaria da Segurança Pública, ao Ministério Público e aos conselhos comunitários uma matriz de indicadores de qualidade e confiança, além de divulgar os resultados em artigos científicos e em oficinas devolutivas nas comunidades participantes.</w:t>
       </w:r>
     </w:p>
     <w:bookmarkEnd w:id="24"/>
@@ -1077,20 +1185,39 @@
     </w:p>
     <w:tbl>
       <w:tblPr>
-        <w:tblW w:type="pct" w:w="5000"/>
+        <w:tblW w:type="dxa" w:w="9070"/>
+        <w:tblBorders>
+          <w:top w:val="single" w:sz="4" w:space="0" w:color="808080"/>
+          <w:left w:val="single" w:sz="4" w:space="0" w:color="808080"/>
+          <w:bottom w:val="single" w:sz="4" w:space="0" w:color="808080"/>
+          <w:right w:val="single" w:sz="4" w:space="0" w:color="808080"/>
+          <w:insideH w:val="single" w:sz="4" w:space="0" w:color="808080"/>
+          <w:insideV w:val="single" w:sz="4" w:space="0" w:color="808080"/>
+        </w:tblBorders>
+        <w:tblLayout w:type="fixed"/>
+        <w:tblCellMar>
+          <w:top w:w="57" w:type="dxa"/>
+          <w:left w:w="85" w:type="dxa"/>
+          <w:bottom w:w="57" w:type="dxa"/>
+          <w:right w:w="85" w:type="dxa"/>
+        </w:tblCellMar>
         <w:tblLook w:firstRow="1" w:lastRow="0" w:firstColumn="0" w:lastColumn="0" w:noHBand="0" w:noVBand="0" w:val="0020"/>
         <w:jc w:val="start"/>
       </w:tblPr>
       <w:tblGrid>
-        <w:gridCol w:w="3960"/>
-        <w:gridCol w:w="3960"/>
+        <w:gridCol w:w="1700"/>
+        <w:gridCol w:w="7370"/>
       </w:tblGrid>
       <w:tr>
         <w:trPr>
           <w:tblHeader w:val="true"/>
         </w:trPr>
         <w:tc>
-          <w:tcPr/>
+          <w:tcPr>
+            <w:tcW w:w="1700" w:type="dxa"/>
+            <w:shd w:val="clear" w:color="auto" w:fill="D9D9D9"/>
+            <w:vAlign w:val="center"/>
+          </w:tcPr>
           <w:p>
             <w:pPr>
               <w:pStyle w:val="Compact"/>
@@ -1100,6 +1227,7 @@
             <w:r>
               <w:rPr>
                 <w:rFonts w:ascii="Times New Roman" w:hAnsi="Times New Roman" w:eastAsia="Times New Roman" w:cs="Times New Roman"/>
+                <w:b/>
                 <w:sz w:val="20"/>
               </w:rPr>
               <w:t xml:space="preserve">Período</w:t>
@@ -1107,7 +1235,11 @@
           </w:p>
         </w:tc>
         <w:tc>
-          <w:tcPr/>
+          <w:tcPr>
+            <w:tcW w:w="7370" w:type="dxa"/>
+            <w:shd w:val="clear" w:color="auto" w:fill="D9D9D9"/>
+            <w:vAlign w:val="center"/>
+          </w:tcPr>
           <w:p>
             <w:pPr>
               <w:pStyle w:val="Compact"/>
@@ -1117,6 +1249,7 @@
             <w:r>
               <w:rPr>
                 <w:rFonts w:ascii="Times New Roman" w:hAnsi="Times New Roman" w:eastAsia="Times New Roman" w:cs="Times New Roman"/>
+                <w:b/>
                 <w:sz w:val="20"/>
               </w:rPr>
               <w:t xml:space="preserve">Atividades</w:t>
@@ -1126,7 +1259,10 @@
       </w:tr>
       <w:tr>
         <w:tc>
-          <w:tcPr/>
+          <w:tcPr>
+            <w:tcW w:w="1700" w:type="dxa"/>
+            <w:vAlign w:val="center"/>
+          </w:tcPr>
           <w:p>
             <w:pPr>
               <w:pStyle w:val="Compact"/>
@@ -1136,6 +1272,7 @@
             <w:r>
               <w:rPr>
                 <w:rFonts w:ascii="Times New Roman" w:hAnsi="Times New Roman" w:eastAsia="Times New Roman" w:cs="Times New Roman"/>
+                <w:b/>
                 <w:sz w:val="20"/>
               </w:rPr>
               <w:t xml:space="preserve">Ano 1 (2027)</w:t>
@@ -1143,7 +1280,10 @@
           </w:p>
         </w:tc>
         <w:tc>
-          <w:tcPr/>
+          <w:tcPr>
+            <w:tcW w:w="7370" w:type="dxa"/>
+            <w:vAlign w:val="center"/>
+          </w:tcPr>
           <w:p>
             <w:pPr>
               <w:pStyle w:val="Compact"/>
@@ -1162,7 +1302,11 @@
       </w:tr>
       <w:tr>
         <w:tc>
-          <w:tcPr/>
+          <w:tcPr>
+            <w:tcW w:w="1700" w:type="dxa"/>
+            <w:shd w:val="clear" w:color="auto" w:fill="F2F2F2"/>
+            <w:vAlign w:val="center"/>
+          </w:tcPr>
           <w:p>
             <w:pPr>
               <w:pStyle w:val="Compact"/>
@@ -1172,6 +1316,7 @@
             <w:r>
               <w:rPr>
                 <w:rFonts w:ascii="Times New Roman" w:hAnsi="Times New Roman" w:eastAsia="Times New Roman" w:cs="Times New Roman"/>
+                <w:b/>
                 <w:sz w:val="20"/>
               </w:rPr>
               <w:t xml:space="preserve">Ano 2 (2028)</w:t>
@@ -1179,7 +1324,11 @@
           </w:p>
         </w:tc>
         <w:tc>
-          <w:tcPr/>
+          <w:tcPr>
+            <w:tcW w:w="7370" w:type="dxa"/>
+            <w:shd w:val="clear" w:color="auto" w:fill="F2F2F2"/>
+            <w:vAlign w:val="center"/>
+          </w:tcPr>
           <w:p>
             <w:pPr>
               <w:pStyle w:val="Compact"/>
@@ -1198,7 +1347,10 @@
       </w:tr>
       <w:tr>
         <w:tc>
-          <w:tcPr/>
+          <w:tcPr>
+            <w:tcW w:w="1700" w:type="dxa"/>
+            <w:vAlign w:val="center"/>
+          </w:tcPr>
           <w:p>
             <w:pPr>
               <w:pStyle w:val="Compact"/>
@@ -1208,6 +1360,7 @@
             <w:r>
               <w:rPr>
                 <w:rFonts w:ascii="Times New Roman" w:hAnsi="Times New Roman" w:eastAsia="Times New Roman" w:cs="Times New Roman"/>
+                <w:b/>
                 <w:sz w:val="20"/>
               </w:rPr>
               <w:t xml:space="preserve">Ano 3 (2029)</w:t>
@@ -1215,7 +1368,10 @@
           </w:p>
         </w:tc>
         <w:tc>
-          <w:tcPr/>
+          <w:tcPr>
+            <w:tcW w:w="7370" w:type="dxa"/>
+            <w:vAlign w:val="center"/>
+          </w:tcPr>
           <w:p>
             <w:pPr>
               <w:pStyle w:val="Compact"/>
@@ -1234,7 +1390,11 @@
       </w:tr>
       <w:tr>
         <w:tc>
-          <w:tcPr/>
+          <w:tcPr>
+            <w:tcW w:w="1700" w:type="dxa"/>
+            <w:shd w:val="clear" w:color="auto" w:fill="F2F2F2"/>
+            <w:vAlign w:val="center"/>
+          </w:tcPr>
           <w:p>
             <w:pPr>
               <w:pStyle w:val="Compact"/>
@@ -1244,6 +1404,7 @@
             <w:r>
               <w:rPr>
                 <w:rFonts w:ascii="Times New Roman" w:hAnsi="Times New Roman" w:eastAsia="Times New Roman" w:cs="Times New Roman"/>
+                <w:b/>
                 <w:sz w:val="20"/>
               </w:rPr>
               <w:t xml:space="preserve">Ano 4 (2030)</w:t>
@@ -1251,7 +1412,11 @@
           </w:p>
         </w:tc>
         <w:tc>
-          <w:tcPr/>
+          <w:tcPr>
+            <w:tcW w:w="7370" w:type="dxa"/>
+            <w:shd w:val="clear" w:color="auto" w:fill="F2F2F2"/>
+            <w:vAlign w:val="center"/>
+          </w:tcPr>
           <w:p>
             <w:pPr>
               <w:pStyle w:val="Compact"/>

</xml_diff>

<commit_message>
Atualiza anteprojeto com recorte racial e dados do FBSP 2026
Co-Authored-By: Claude Opus 5.5 <noreply@anthropic.com>
Claude-Session: https://claude.ai/code/session_012kDm3eDcjoxunS5BBjgPmo
</commit_message>
<xml_diff>
--- a/entregas/anteprojeto.docx
+++ b/entregas/anteprojeto.docx
@@ -47,7 +47,7 @@
           <w:rFonts w:ascii="Times New Roman" w:hAnsi="Times New Roman" w:eastAsia="Times New Roman" w:cs="Times New Roman"/>
           <w:sz w:val="24"/>
         </w:rPr>
-        <w:t xml:space="preserve">Quem controla a polícia de proximidade? Controle democrático, accountability e legitimidade do policiamento comunitário no Extremo Sul da Bahia</w:t>
+        <w:t xml:space="preserve">Quem controla a polícia de proximidade? Controle democrático, accountability e legitimidade do policiamento comunitário em territórios negros e quilombolas do Extremo Sul da Bahia</w:t>
       </w:r>
     </w:p>
     <w:p>
@@ -140,7 +140,7 @@
           <w:rFonts w:ascii="Times New Roman" w:hAnsi="Times New Roman" w:eastAsia="Times New Roman" w:cs="Times New Roman"/>
           <w:sz w:val="24"/>
         </w:rPr>
-        <w:t xml:space="preserve">O policiamento comunitário chegou ao Brasil com uma promessa ambiciosa: aproximar a polícia da população e transformar a segurança pública numa tarefa compartilhada, voltada à prevenção e à redução do medo do crime. Na Bahia, essa promessa ganhou forma institucional nas Bases Comunitárias de Segurança, integradas ao Programa Pacto pela Vida. Passada mais de uma década de sua implantação, porém, permanece em aberto uma questão de fundo: quem controla essa polícia de proximidade, e com que efeitos sobre a sua legitimidade?</w:t>
+        <w:t xml:space="preserve">O policiamento comunitário chegou ao Brasil com uma promessa ambiciosa: aproximar a polícia da população e transformar a segurança pública numa tarefa compartilhada, voltada à prevenção e à redução do medo do crime. Na Bahia, essa promessa ganhou forma institucional nas Bases Comunitárias de Segurança, criadas no âmbito do Programa Pacto pela Vida, hoje reformulado como Bahia pela Paz. Em Porto Seguro, a Base Comunitária do Baianão/Frei Calixto foi implantada numa das áreas periféricas mais populosas do município. Passada mais de uma década, porém, permanece em aberto uma questão de fundo: quem controla essa polícia de proximidade, e com que efeitos sobre a sua legitimidade junto às populações negras que ela deveria proteger?</w:t>
       </w:r>
     </w:p>
     <w:p>
@@ -155,7 +155,7 @@
           <w:rFonts w:ascii="Times New Roman" w:hAnsi="Times New Roman" w:eastAsia="Times New Roman" w:cs="Times New Roman"/>
           <w:sz w:val="24"/>
         </w:rPr>
-        <w:t xml:space="preserve">Ocorre que, na prática, a gestão desses programas apoia-se sobretudo em metas quantitativas, como a redução dos Crimes Violentos Letais e Intencionais (CVLI) e dos Crimes Violentos contra o Patrimônio (CVP), em registros de produtividade e em premiações por desempenho. Em outras palavras, tais instrumentos dizem muito sobre o que a polícia faz, mas pouco sobre como ela trata as pessoas com quem interage. Esse descompasso torna-se ainda mais grave quando se observa que a Bahia figura, nos últimos anos, entre os estados com maior número de mortes decorrentes de intervenção policial (FÓRUM BRASILEIRO DE SEGURANÇA PÚBLICA, 2025). A distância entre a retórica comunitária e os mecanismos efetivos de controle é, portanto, o ponto de partida desta proposta.</w:t>
+        <w:t xml:space="preserve">Os dados mais recentes tornam essa pergunta urgente. Segundo o Anuário Brasileiro de Segurança Pública, Eunápolis e Porto Seguro figuram entre as quatro cidades mais violentas do país, com taxas de 85,1 e 71,2 mortes violentas intencionais por 100 mil habitantes, respectivamente, e lideram o país em mortes decorrentes de intervenção policial entre os municípios com mais de 100 mil habitantes, com 32,3 e 29,7 por 100 mil, respectivamente (FÓRUM BRASILEIRO DE SEGURANÇA PÚBLICA, 2026). Em Porto Seguro, a ação policial respondeu por 45% das 130 mortes violentas registradas em 2025. No plano estadual, a Bahia somou 1.570 mortes por intervenção policial no mesmo ano, o maior número absoluto do país. Esse padrão não é racialmente neutro: estudos sobre abordagem e letalidade policial demonstram que a pertinência racial opera como critério de suspeição e de uso da força, inclusive em Salvador (RAMOS; MUSUMECI, 2005; ANUNCIAÇÃO; TRAD; FERREIRA, 2020; SINHORETTO; BATITUCCI, 2023).</w:t>
       </w:r>
     </w:p>
     <w:p>
@@ -170,7 +170,7 @@
           <w:rFonts w:ascii="Times New Roman" w:hAnsi="Times New Roman" w:eastAsia="Times New Roman" w:cs="Times New Roman"/>
           <w:sz w:val="24"/>
         </w:rPr>
-        <w:t xml:space="preserve">Nessa direção, estudo anterior, desenvolvido em mestrado profissional sobre indicadores de desempenho na Polícia Militar da Bahia, mostrou que os instrumentos de controle perdem eficácia quando atuam de forma isolada e desarticulada, e que faltam mecanismos de natureza preventiva e ética, e não apenas punitiva. Aquele trabalho, contudo, restringiu-se à análise bibliográfica e documental em escala estadual. Assim, ficou por investigar como esses controles funcionam no território e como são percebidos pela população policiada, lacuna que a presente tese pretende enfrentar.</w:t>
+        <w:t xml:space="preserve">Ocorre que, na prática, a gestão desses programas apoia-se sobretudo em metas quantitativas, como a redução dos Crimes Violentos Letais e Intencionais (CVLI) e dos Crimes Violentos contra o Patrimônio (CVP), em registros de produtividade e em premiações por desempenho. Em outras palavras, tais instrumentos dizem muito sobre o que a polícia faz, mas pouco sobre como ela trata as pessoas com quem interage — e nada sobre quem, racialmente, suporta os custos dessa atuação. A aparência técnica e neutra desses controles pode, assim, encobrir a reprodução do racismo institucional, à semelhança do que Souza, Ferreira e Santos (2021) identificam no campo jurídico como dispositivo da branquitude.</w:t>
       </w:r>
     </w:p>
     <w:p>
@@ -185,23 +185,7 @@
           <w:rFonts w:ascii="Times New Roman" w:hAnsi="Times New Roman" w:eastAsia="Times New Roman" w:cs="Times New Roman"/>
           <w:sz w:val="24"/>
         </w:rPr>
-        <w:t xml:space="preserve">Diante disso, formula-se a seguinte questão de pesquisa:</w:t>
-      </w:r>
-      <w:r>
-        <w:rPr>
-          <w:rFonts w:ascii="Times New Roman" w:hAnsi="Times New Roman" w:eastAsia="Times New Roman" w:cs="Times New Roman"/>
-          <w:sz w:val="24"/>
-        </w:rPr>
-        <w:t xml:space="preserve"> </w:t>
-      </w:r>
-      <w:r>
-        <w:rPr>
-          <w:bCs/>
-          <w:rFonts w:ascii="Times New Roman" w:hAnsi="Times New Roman" w:eastAsia="Times New Roman" w:cs="Times New Roman"/>
-          <w:b/>
-          <w:sz w:val="24"/>
-        </w:rPr>
-        <w:t xml:space="preserve">como os mecanismos de controle interno, externo e social que incidem sobre o policiamento comunitário no Extremo Sul da Bahia se articulam, e em que medida contribuem para a legitimidade democrática da polícia perante as comunidades atendidas?</w:t>
+        <w:t xml:space="preserve">Nessa direção, estudo anterior, desenvolvido em mestrado profissional sobre indicadores de desempenho na Polícia Militar da Bahia, mostrou que os instrumentos de controle perdem eficácia quando atuam de forma isolada e desarticulada, e que faltam mecanismos de natureza preventiva e ética, e não apenas punitiva. Aquele trabalho, contudo, restringiu-se à análise bibliográfica e documental em escala estadual e não incorporou a dimensão racial. Assim, ficou por investigar como esses controles funcionam no território e como são percebidos pelas populações negras, quilombolas e indígenas policiadas, lacuna que a presente tese pretende enfrentar.</w:t>
       </w:r>
     </w:p>
     <w:p>
@@ -216,7 +200,23 @@
           <w:rFonts w:ascii="Times New Roman" w:hAnsi="Times New Roman" w:eastAsia="Times New Roman" w:cs="Times New Roman"/>
           <w:sz w:val="24"/>
         </w:rPr>
-        <w:t xml:space="preserve">Do ponto de vista científico, o estudo desloca o debate da eficácia gerencial — a polícia entrega resultados? — para o problema da legitimação do poder — a polícia é reconhecida como justa e passível de controle? Para tanto, articula a teoria da legitimidade procedimental à literatura brasileira sobre controle da atividade policial. Além disso, sua originalidade reside em tratar o controle como sistema, examinando em conjunto corregedoria, Ministério Público, ouvidoria, conselhos comunitários e imprensa, e em fazê-lo numa região interiorana, marcada pelo turismo e pela presença de povos indígenas, comunidades quilombolas e periferias urbanas, contexto pouco contemplado por uma produção concentrada nas capitais.</w:t>
+        <w:t xml:space="preserve">Diante disso, formula-se a seguinte questão de pesquisa:</w:t>
+      </w:r>
+      <w:r>
+        <w:rPr>
+          <w:rFonts w:ascii="Times New Roman" w:hAnsi="Times New Roman" w:eastAsia="Times New Roman" w:cs="Times New Roman"/>
+          <w:sz w:val="24"/>
+        </w:rPr>
+        <w:t xml:space="preserve"> </w:t>
+      </w:r>
+      <w:r>
+        <w:rPr>
+          <w:bCs/>
+          <w:rFonts w:ascii="Times New Roman" w:hAnsi="Times New Roman" w:eastAsia="Times New Roman" w:cs="Times New Roman"/>
+          <w:b/>
+          <w:sz w:val="24"/>
+        </w:rPr>
+        <w:t xml:space="preserve">de que maneira os mecanismos de controle democrático e de accountability que incidem sobre o policiamento comunitário no Extremo Sul da Bahia podem qualificar as relações da polícia com as populações negras e quilombolas e conferir maior legitimidade a esse modelo, sobretudo quando consideradas as especificidades culturais das comunidades atendidas?</w:t>
       </w:r>
     </w:p>
     <w:p>
@@ -231,7 +231,7 @@
           <w:rFonts w:ascii="Times New Roman" w:hAnsi="Times New Roman" w:eastAsia="Times New Roman" w:cs="Times New Roman"/>
           <w:sz w:val="24"/>
         </w:rPr>
-        <w:t xml:space="preserve">Na dimensão social, a segurança pública constitui questão prioritária para a qualidade de vida no Sul da Bahia. Espera-se que a pesquisa ofereça subsídios para a construção de indicadores de qualidade e de confiança que complementem os de produtividade, bem como para o fortalecimento do controle social em âmbito local.</w:t>
+        <w:t xml:space="preserve">Do ponto de vista científico, o estudo desloca o debate da eficácia gerencial — a polícia entrega resultados? — para o problema da legitimação do poder — a polícia é reconhecida como justa e passível de controle pelos grupos que mais sofrem sua ação? Para tanto, articula a teoria da legitimidade procedimental, a literatura brasileira sobre controle da atividade policial e os estudos críticos sobre raça e Estado. Além disso, sua originalidade reside em tratar o controle como sistema, examinando em conjunto corregedoria, Ministério Público, ouvidoria, conselhos comunitários e imprensa, e em fazê-lo numa região interiorana marcada pelo turismo, por periferias urbanas negras e pela presença de povos indígenas e comunidades quilombolas, contexto pouco contemplado por uma produção concentrada nas capitais.</w:t>
       </w:r>
     </w:p>
     <w:p>
@@ -246,7 +246,22 @@
           <w:rFonts w:ascii="Times New Roman" w:hAnsi="Times New Roman" w:eastAsia="Times New Roman" w:cs="Times New Roman"/>
           <w:sz w:val="24"/>
         </w:rPr>
-        <w:t xml:space="preserve">Por essas razões, a proposta insere-se na Linha 1 do PPGES porque toma o Estado como conjunto heterogêneo de instituições e se debruça sobre as dinâmicas do exercício do poder, os processos de legitimação, a relação entre Estado e sociedade civil e as instâncias de controle e fiscalização de programas de governo, eixos que compõem a própria descrição da linha.</w:t>
+        <w:t xml:space="preserve">Na dimensão social, a segurança pública constitui questão prioritária para a qualidade de vida no Sul da Bahia. Espera-se que a pesquisa ofereça subsídios para a construção de indicadores de legitimidade com recorte étnico-racial, em diálogo com a agenda do Objetivo de Desenvolvimento Sustentável 18 (Igualdade Étnico-Racial), bem como para o fortalecimento do controle social em âmbito local.</w:t>
+      </w:r>
+    </w:p>
+    <w:p>
+      <w:pPr>
+        <w:pStyle w:val="BodyText"/>
+        <w:spacing w:line="360" w:lineRule="auto" w:before="0" w:after="120"/>
+        <w:ind w:firstLine="709"/>
+        <w:jc w:val="both"/>
+      </w:pPr>
+      <w:r>
+        <w:rPr>
+          <w:rFonts w:ascii="Times New Roman" w:hAnsi="Times New Roman" w:eastAsia="Times New Roman" w:cs="Times New Roman"/>
+          <w:sz w:val="24"/>
+        </w:rPr>
+        <w:t xml:space="preserve">Por essas razões, a proposta insere-se na Linha 1 do PPGES, ao tomar o Estado como conjunto heterogêneo de instituições e debruçar-se sobre as dinâmicas do exercício do poder, os processos de legitimação, a relação entre Estado e sociedade civil, o pluralismo jurídico e as instâncias de controle de programas de governo. Dialoga, ainda, com a produção das orientadoras indicadas sobre racismo, sistema de justiça e segurança pública (SANTOS, 2025) e sobre a letalidade e o encarceramento da juventude negra (OLIVEIRA; TORRES; TORRES, 2018).</w:t>
       </w:r>
     </w:p>
     <w:bookmarkEnd w:id="20"/>
@@ -294,7 +309,7 @@
           <w:rFonts w:ascii="Times New Roman" w:hAnsi="Times New Roman" w:eastAsia="Times New Roman" w:cs="Times New Roman"/>
           <w:sz w:val="24"/>
         </w:rPr>
-        <w:t xml:space="preserve">analisar como os mecanismos de controle interno, externo e social do policiamento comunitário no Extremo Sul da Bahia se articulam e em que medida contribuem para a legitimidade democrática da polícia perante as comunidades atendidas.</w:t>
+        <w:t xml:space="preserve">analisar como os mecanismos de controle interno, externo e social do policiamento comunitário no Extremo Sul da Bahia se articulam e em que medida contribuem para a legitimidade democrática da polícia perante as populações negras e quilombolas dos territórios atendidos.</w:t>
       </w:r>
     </w:p>
     <w:p>
@@ -347,7 +362,7 @@
           <w:rFonts w:ascii="Times New Roman" w:hAnsi="Times New Roman" w:eastAsia="Times New Roman" w:cs="Times New Roman"/>
           <w:sz w:val="24"/>
         </w:rPr>
-        <w:t xml:space="preserve">examinar de que modo os indicadores e as metas do Pacto pela Vida orientam a atuação das unidades comunitárias e quais dimensões da atividade policial deixam de ser mensuradas;</w:t>
+        <w:t xml:space="preserve">examinar de que modo os indicadores e as metas do programa Bahia pela Paz orientam a atuação das unidades comunitárias e se incorporam, ou silenciam, a dimensão racial da ação policial;</w:t>
       </w:r>
     </w:p>
     <w:p>
@@ -383,7 +398,7 @@
           <w:rFonts w:ascii="Times New Roman" w:hAnsi="Times New Roman" w:eastAsia="Times New Roman" w:cs="Times New Roman"/>
           <w:sz w:val="24"/>
         </w:rPr>
-        <w:t xml:space="preserve">verificar se essas percepções variam conforme raça, território e pertencimento a povos e comunidades tradicionais;</w:t>
+        <w:t xml:space="preserve">verificar se essas percepções variam conforme raça, gênero, território e pertencimento a povos e comunidades tradicionais;</w:t>
       </w:r>
     </w:p>
     <w:p>
@@ -401,7 +416,7 @@
           <w:rFonts w:ascii="Times New Roman" w:hAnsi="Times New Roman" w:eastAsia="Times New Roman" w:cs="Times New Roman"/>
           <w:sz w:val="24"/>
         </w:rPr>
-        <w:t xml:space="preserve">propor, em diálogo com os atores locais, uma matriz de indicadores de qualidade e de legitimidade complementar aos indicadores de produtividade.</w:t>
+        <w:t xml:space="preserve">propor, em diálogo com os atores locais, uma matriz de indicadores de legitimidade com recorte étnico-racial, complementar aos indicadores de produtividade e alinhada à agenda do ODS 18.</w:t>
       </w:r>
     </w:p>
     <w:p>
@@ -432,7 +447,7 @@
           <w:rFonts w:ascii="Times New Roman" w:hAnsi="Times New Roman" w:eastAsia="Times New Roman" w:cs="Times New Roman"/>
           <w:sz w:val="24"/>
         </w:rPr>
-        <w:t xml:space="preserve">os controles existentes operam de maneira fragmentada e predominantemente reativa e punitiva, o que produz conformidade com metas, mas pouca legitimidade. Mecanismos articulados entre si e abertos à participação comunitária tenderiam a ampliar a confiança na polícia e a percepção de justiça procedimental.</w:t>
+        <w:t xml:space="preserve">os controles existentes operam de maneira fragmentada, predominantemente reativa e racialmente neutra apenas na aparência, o que produz conformidade com metas, mas pouca legitimidade junto às populações negras e quilombolas. Mecanismos articulados, abertos à participação comunitária e sensíveis às especificidades culturais dos territórios tenderiam a ampliar a confiança na polícia e a percepção de justiça procedimental.</w:t>
       </w:r>
     </w:p>
     <w:bookmarkEnd w:id="21"/>
@@ -464,7 +479,7 @@
           <w:rFonts w:ascii="Times New Roman" w:hAnsi="Times New Roman" w:eastAsia="Times New Roman" w:cs="Times New Roman"/>
           <w:sz w:val="24"/>
         </w:rPr>
-        <w:t xml:space="preserve">O referencial organiza-se em três eixos complementares: o Estado e a legitimação do poder; o controle democrático da polícia; e o policiamento comunitário diante da gestão por resultados.</w:t>
+        <w:t xml:space="preserve">O referencial organiza-se em quatro eixos complementares: o Estado e a legitimação do poder; o controle democrático da polícia; o policiamento comunitário diante da gestão por resultados; e as relações entre raça, território e ação policial, que atravessa os demais.</w:t>
       </w:r>
     </w:p>
     <w:p>
@@ -524,7 +539,22 @@
           <w:rFonts w:ascii="Times New Roman" w:hAnsi="Times New Roman" w:eastAsia="Times New Roman" w:cs="Times New Roman"/>
           <w:sz w:val="24"/>
         </w:rPr>
-        <w:t xml:space="preserve">Cabe destacar, ainda, que a confiança na polícia, variável central para esta pesquisa, mostra-se baixa no país, mas sensível ao contexto: Rolim e Hermann (2018) verificaram, em Porto Alegre, níveis de confiança inferiores aos observados em cidades menores. Tal achado justifica, por conseguinte, investigar um contexto interiorano como o do Extremo Sul baiano. Por fim, a noção de pluralismo jurídico, presente na descrição da Linha 1, oferece chave analítica para a relação entre a polícia e os povos indígenas e comunidades tradicionais da região.</w:t>
+        <w:t xml:space="preserve">O quarto eixo confere ao projeto sua lente analítica. Almeida (2019) demonstra que o racismo é estrutural e se reproduz nas instituições mesmo sem intenção explícita, e Bento (2022) descreve o pacto narcísico da branquitude que sustenta essa reprodução nas organizações. No campo penal, Flauzina (2006) interpreta a seletividade do sistema como parte de um projeto genocida dirigido à população negra, leitura que encontra respaldo empírico nos dados sobre homicídio e encarceramento da juventude negra (OLIVEIRA; TORRES; TORRES, 2018) e na análise interseccional do encarceramento feminino negro (OLIVEIRA; SANTOS; ROCHA, 2021; AKOTIRENE, 2019). Especificamente quanto à Polícia Militar da Bahia, Silva (2021) evidenciou as ausências da discussão étnico-racial no currículo de formação policial, enquanto Santos (2025) examinou o impacto da Convenção Interamericana contra o Racismo sobre o sistema de justiça e segurança pública brasileiros, abrindo caminho para pensar o controle da polícia também como obrigação antirracista do Estado. Por fim, as categorias de amefricanidade (GONZALEZ, 1988) e de quilombismo (NASCIMENTO, 1980) permitem compreender periferias negras e comunidades quilombolas não como alvos do policiamento, mas como sujeitos políticos e portadores de formas próprias de organização e de juridicidade, o que dialoga com o pluralismo jurídico e a interculturalidade. É nessa chave que se indaga se o controle democrático e a accountability podem converter o policiamento comunitário em relação efetivamente legítima com esses territórios.</w:t>
+      </w:r>
+    </w:p>
+    <w:p>
+      <w:pPr>
+        <w:pStyle w:val="BodyText"/>
+        <w:spacing w:line="360" w:lineRule="auto" w:before="0" w:after="120"/>
+        <w:ind w:firstLine="709"/>
+        <w:jc w:val="both"/>
+      </w:pPr>
+      <w:r>
+        <w:rPr>
+          <w:rFonts w:ascii="Times New Roman" w:hAnsi="Times New Roman" w:eastAsia="Times New Roman" w:cs="Times New Roman"/>
+          <w:sz w:val="24"/>
+        </w:rPr>
+        <w:t xml:space="preserve">Cabe destacar, ainda, que a confiança na polícia, variável central para esta pesquisa, mostra-se baixa no país, mas sensível ao contexto: Rolim e Hermann (2018) verificaram, em Porto Alegre, níveis de confiança inferiores aos observados em cidades menores. Tal achado justifica, por conseguinte, investigar um contexto interiorano como o do Extremo Sul baiano. Nesse quadro, a noção de pluralismo jurídico, presente na descrição da Linha 1, oferece chave analítica para a relação entre a polícia e os povos indígenas e comunidades tradicionais da região.</w:t>
       </w:r>
     </w:p>
     <w:bookmarkEnd w:id="22"/>
@@ -556,7 +586,7 @@
           <w:rFonts w:ascii="Times New Roman" w:hAnsi="Times New Roman" w:eastAsia="Times New Roman" w:cs="Times New Roman"/>
           <w:sz w:val="24"/>
         </w:rPr>
-        <w:t xml:space="preserve">Trata-se de pesquisa de abordagem qualitativa, com apoio quantitativo descritivo, delineada como estudo de casos múltiplos em dois ou três municípios do Extremo Sul da Bahia — a exemplo de Porto Seguro, Eunápolis e Teixeira de Freitas. A seleção definitiva considerará a existência de unidades de policiamento comunitário em funcionamento. O quadro a seguir relaciona cada objetivo específico às fontes, aos instrumentos e à forma de análise.</w:t>
+        <w:t xml:space="preserve">Trata-se de pesquisa de abordagem qualitativa, com apoio quantitativo descritivo, delineada como estudo de casos múltiplos em três recortes territoriais do Extremo Sul da Bahia. O caso principal é Porto Seguro, onde funciona a Base Comunitária de Segurança do Baianão/Frei Calixto e que registra a maior taxa de mortes por intervenção policial do país entre os de mais de 100 mil habitantes. Eunápolis, segunda colocada nesse indicador e sem base comunitária identificada, funcionará como caso de contraste. O terceiro recorte abrange comunidades quilombolas certificadas pela Fundação Cultural Palmares nos municípios de Caravelas e Nova Viçosa, como Volta Miúda e Helvécia, permitindo examinar a relação entre polícia e comunidades tradicionais. O quadro a seguir relaciona cada objetivo específico às fontes, aos instrumentos e à forma de análise.</w:t>
       </w:r>
     </w:p>
     <w:tbl>
@@ -728,7 +758,7 @@
                 <w:rFonts w:ascii="Times New Roman" w:hAnsi="Times New Roman" w:eastAsia="Times New Roman" w:cs="Times New Roman"/>
                 <w:sz w:val="20"/>
               </w:rPr>
-              <w:t xml:space="preserve">b) Examinar os indicadores do Pacto pela Vida</w:t>
+              <w:t xml:space="preserve">b) Examinar os indicadores do Bahia pela Paz</w:t>
             </w:r>
           </w:p>
         </w:tc>
@@ -745,7 +775,7 @@
                 <w:rFonts w:ascii="Times New Roman" w:hAnsi="Times New Roman" w:eastAsia="Times New Roman" w:cs="Times New Roman"/>
                 <w:sz w:val="20"/>
               </w:rPr>
-              <w:t xml:space="preserve">Bases de dados da SSP-BA e planos de metas</w:t>
+              <w:t xml:space="preserve">Bases de dados da SSP-BA, planos de metas e registros de mortes por intervenção policial desagregados por raça/cor</w:t>
             </w:r>
           </w:p>
         </w:tc>
@@ -815,7 +845,7 @@
                 <w:rFonts w:ascii="Times New Roman" w:hAnsi="Times New Roman" w:eastAsia="Times New Roman" w:cs="Times New Roman"/>
                 <w:sz w:val="20"/>
               </w:rPr>
-              <w:t xml:space="preserve">Cerca de 30 participantes: policiais, gestores, promotores de justiça, conselheiros e lideranças comunitárias</w:t>
+              <w:t xml:space="preserve">Cerca de 30 participantes: policiais, gestores, promotores de justiça, conselheiros e lideranças comunitárias e quilombolas</w:t>
             </w:r>
           </w:p>
         </w:tc>
@@ -868,7 +898,7 @@
                 <w:rFonts w:ascii="Times New Roman" w:hAnsi="Times New Roman" w:eastAsia="Times New Roman" w:cs="Times New Roman"/>
                 <w:sz w:val="20"/>
               </w:rPr>
-              <w:t xml:space="preserve">d) Verificar variações por raça e território</w:t>
+              <w:t xml:space="preserve">d) Verificar variações por raça, gênero e território</w:t>
             </w:r>
           </w:p>
         </w:tc>
@@ -885,7 +915,7 @@
                 <w:rFonts w:ascii="Times New Roman" w:hAnsi="Times New Roman" w:eastAsia="Times New Roman" w:cs="Times New Roman"/>
                 <w:sz w:val="20"/>
               </w:rPr>
-              <w:t xml:space="preserve">Moradores de bairros periféricos, aldeias indígenas e comunidades quilombolas</w:t>
+              <w:t xml:space="preserve">Moradores do Baianão e de Eunápolis e membros das comunidades quilombolas</w:t>
             </w:r>
           </w:p>
         </w:tc>
@@ -919,7 +949,7 @@
                 <w:rFonts w:ascii="Times New Roman" w:hAnsi="Times New Roman" w:eastAsia="Times New Roman" w:cs="Times New Roman"/>
                 <w:sz w:val="20"/>
               </w:rPr>
-              <w:t xml:space="preserve">Análise comparativa entre grupos</w:t>
+              <w:t xml:space="preserve">Análise comparativa e interseccional</w:t>
             </w:r>
           </w:p>
         </w:tc>
@@ -1055,7 +1085,7 @@
           <w:rFonts w:ascii="Times New Roman" w:hAnsi="Times New Roman" w:eastAsia="Times New Roman" w:cs="Times New Roman"/>
           <w:sz w:val="24"/>
         </w:rPr>
-        <w:t xml:space="preserve">No plano acadêmico, espera-se construir um modelo analítico que compreenda o controle policial como sistema articulado e o relacione à legitimidade, e não apenas à eficiência, contribuição inédita para o estudo do interior baiano. No âmbito da Linha 1, a tese deverá oferecer evidências sobre os processos de legitimação do Estado, a relação entre burocracia policial e sociedade civil e a fiscalização de programas de governo. Por fim, no plano social e profissional, pretende-se entregar à Secretaria da Segurança Pública, ao Ministério Público e aos conselhos comunitários uma matriz de indicadores de qualidade e confiança, além de divulgar os resultados em artigos científicos e em oficinas devolutivas nas comunidades participantes.</w:t>
+        <w:t xml:space="preserve">No plano acadêmico, espera-se construir um modelo analítico que compreenda o controle policial como sistema articulado e o relacione à legitimidade, e não apenas à eficiência, incorporando a dimensão racial ao debate sobre accountability policial, contribuição inédita para o estudo do interior baiano. No âmbito da Linha 1, a tese deverá oferecer evidências sobre os processos de legitimação do Estado, a relação entre burocracia policial e sociedade civil e a fiscalização de programas de governo. Por fim, no plano social e profissional, pretende-se entregar à Secretaria da Segurança Pública, ao Ministério Público e aos conselhos comunitários uma matriz de indicadores de legitimidade com recorte étnico-racial, além de divulgar os resultados em artigos científicos e em oficinas devolutivas nas comunidades participantes.</w:t>
       </w:r>
     </w:p>
     <w:bookmarkEnd w:id="24"/>
@@ -1297,30 +1327,30 @@
           <w:rFonts w:ascii="Times New Roman" w:hAnsi="Times New Roman" w:eastAsia="Times New Roman" w:cs="Times New Roman"/>
           <w:sz w:val="24"/>
         </w:rPr>
-        <w:t xml:space="preserve">ARAÚJO, E. M.; OLIVEIRA, R. R. S.; SAMPAIO, A. A. S. Qualidade metodológica das pesquisas documentais sobre controle disciplinar interno da Polícia Militar: revisão sistemática da literatura.</w:t>
-      </w:r>
-      <w:r>
-        <w:rPr>
-          <w:rFonts w:ascii="Times New Roman" w:hAnsi="Times New Roman" w:eastAsia="Times New Roman" w:cs="Times New Roman"/>
-          <w:sz w:val="24"/>
-        </w:rPr>
-        <w:t xml:space="preserve"> </w:t>
-      </w:r>
-      <w:r>
-        <w:rPr>
-          <w:bCs/>
-          <w:rFonts w:ascii="Times New Roman" w:hAnsi="Times New Roman" w:eastAsia="Times New Roman" w:cs="Times New Roman"/>
-          <w:b/>
-          <w:sz w:val="24"/>
-        </w:rPr>
-        <w:t xml:space="preserve">Revista Brasileira de Segurança Pública</w:t>
-      </w:r>
-      <w:r>
-        <w:rPr>
-          <w:rFonts w:ascii="Times New Roman" w:hAnsi="Times New Roman" w:eastAsia="Times New Roman" w:cs="Times New Roman"/>
-          <w:sz w:val="24"/>
-        </w:rPr>
-        <w:t xml:space="preserve">, São Paulo, v. 19, n. 1, p. 342-357, fev./mar. 2025.</w:t>
+        <w:t xml:space="preserve">AKOTIRENE, C.</w:t>
+      </w:r>
+      <w:r>
+        <w:rPr>
+          <w:rFonts w:ascii="Times New Roman" w:hAnsi="Times New Roman" w:eastAsia="Times New Roman" w:cs="Times New Roman"/>
+          <w:sz w:val="24"/>
+        </w:rPr>
+        <w:t xml:space="preserve"> </w:t>
+      </w:r>
+      <w:r>
+        <w:rPr>
+          <w:bCs/>
+          <w:rFonts w:ascii="Times New Roman" w:hAnsi="Times New Roman" w:eastAsia="Times New Roman" w:cs="Times New Roman"/>
+          <w:b/>
+          <w:sz w:val="24"/>
+        </w:rPr>
+        <w:t xml:space="preserve">Interseccionalidade</w:t>
+      </w:r>
+      <w:r>
+        <w:rPr>
+          <w:rFonts w:ascii="Times New Roman" w:hAnsi="Times New Roman" w:eastAsia="Times New Roman" w:cs="Times New Roman"/>
+          <w:sz w:val="24"/>
+        </w:rPr>
+        <w:t xml:space="preserve">. São Paulo: Pólen, 2019.</w:t>
       </w:r>
     </w:p>
     <w:p>
@@ -1334,30 +1364,30 @@
           <w:rFonts w:ascii="Times New Roman" w:hAnsi="Times New Roman" w:eastAsia="Times New Roman" w:cs="Times New Roman"/>
           <w:sz w:val="24"/>
         </w:rPr>
-        <w:t xml:space="preserve">BARDIN, L.</w:t>
-      </w:r>
-      <w:r>
-        <w:rPr>
-          <w:rFonts w:ascii="Times New Roman" w:hAnsi="Times New Roman" w:eastAsia="Times New Roman" w:cs="Times New Roman"/>
-          <w:sz w:val="24"/>
-        </w:rPr>
-        <w:t xml:space="preserve"> </w:t>
-      </w:r>
-      <w:r>
-        <w:rPr>
-          <w:bCs/>
-          <w:rFonts w:ascii="Times New Roman" w:hAnsi="Times New Roman" w:eastAsia="Times New Roman" w:cs="Times New Roman"/>
-          <w:b/>
-          <w:sz w:val="24"/>
-        </w:rPr>
-        <w:t xml:space="preserve">Análise de conteúdo</w:t>
-      </w:r>
-      <w:r>
-        <w:rPr>
-          <w:rFonts w:ascii="Times New Roman" w:hAnsi="Times New Roman" w:eastAsia="Times New Roman" w:cs="Times New Roman"/>
-          <w:sz w:val="24"/>
-        </w:rPr>
-        <w:t xml:space="preserve">. São Paulo: Edições 70, 2016.</w:t>
+        <w:t xml:space="preserve">ALMEIDA, S. L.</w:t>
+      </w:r>
+      <w:r>
+        <w:rPr>
+          <w:rFonts w:ascii="Times New Roman" w:hAnsi="Times New Roman" w:eastAsia="Times New Roman" w:cs="Times New Roman"/>
+          <w:sz w:val="24"/>
+        </w:rPr>
+        <w:t xml:space="preserve"> </w:t>
+      </w:r>
+      <w:r>
+        <w:rPr>
+          <w:bCs/>
+          <w:rFonts w:ascii="Times New Roman" w:hAnsi="Times New Roman" w:eastAsia="Times New Roman" w:cs="Times New Roman"/>
+          <w:b/>
+          <w:sz w:val="24"/>
+        </w:rPr>
+        <w:t xml:space="preserve">Racismo estrutural</w:t>
+      </w:r>
+      <w:r>
+        <w:rPr>
+          <w:rFonts w:ascii="Times New Roman" w:hAnsi="Times New Roman" w:eastAsia="Times New Roman" w:cs="Times New Roman"/>
+          <w:sz w:val="24"/>
+        </w:rPr>
+        <w:t xml:space="preserve">. São Paulo: Pólen, 2019.</w:t>
       </w:r>
     </w:p>
     <w:p>
@@ -1371,30 +1401,65 @@
           <w:rFonts w:ascii="Times New Roman" w:hAnsi="Times New Roman" w:eastAsia="Times New Roman" w:cs="Times New Roman"/>
           <w:sz w:val="24"/>
         </w:rPr>
-        <w:t xml:space="preserve">BAYLEY, D. H.</w:t>
-      </w:r>
-      <w:r>
-        <w:rPr>
-          <w:rFonts w:ascii="Times New Roman" w:hAnsi="Times New Roman" w:eastAsia="Times New Roman" w:cs="Times New Roman"/>
-          <w:sz w:val="24"/>
-        </w:rPr>
-        <w:t xml:space="preserve"> </w:t>
-      </w:r>
-      <w:r>
-        <w:rPr>
-          <w:bCs/>
-          <w:rFonts w:ascii="Times New Roman" w:hAnsi="Times New Roman" w:eastAsia="Times New Roman" w:cs="Times New Roman"/>
-          <w:b/>
-          <w:sz w:val="24"/>
-        </w:rPr>
-        <w:t xml:space="preserve">Padrões de policiamento</w:t>
-      </w:r>
-      <w:r>
-        <w:rPr>
-          <w:rFonts w:ascii="Times New Roman" w:hAnsi="Times New Roman" w:eastAsia="Times New Roman" w:cs="Times New Roman"/>
-          <w:sz w:val="24"/>
-        </w:rPr>
-        <w:t xml:space="preserve">: uma análise internacional comparativa. São Paulo: Edusp, 2001.</w:t>
+        <w:t xml:space="preserve">ANUNCIAÇÃO, D.; TRAD, L. A. B.; FERREIRA, T.</w:t>
+      </w:r>
+      <w:r>
+        <w:rPr>
+          <w:rFonts w:ascii="Times New Roman" w:hAnsi="Times New Roman" w:eastAsia="Times New Roman" w:cs="Times New Roman"/>
+          <w:sz w:val="24"/>
+        </w:rPr>
+        <w:t xml:space="preserve"> </w:t>
+      </w:r>
+      <w:r>
+        <w:rPr>
+          <w:rFonts w:ascii="Times New Roman" w:hAnsi="Times New Roman" w:eastAsia="Times New Roman" w:cs="Times New Roman"/>
+          <w:sz w:val="24"/>
+        </w:rPr>
+        <w:t xml:space="preserve">“</w:t>
+      </w:r>
+      <w:r>
+        <w:rPr>
+          <w:rFonts w:ascii="Times New Roman" w:hAnsi="Times New Roman" w:eastAsia="Times New Roman" w:cs="Times New Roman"/>
+          <w:sz w:val="24"/>
+        </w:rPr>
+        <w:t xml:space="preserve">Mão na cabeça!</w:t>
+      </w:r>
+      <w:r>
+        <w:rPr>
+          <w:rFonts w:ascii="Times New Roman" w:hAnsi="Times New Roman" w:eastAsia="Times New Roman" w:cs="Times New Roman"/>
+          <w:sz w:val="24"/>
+        </w:rPr>
+        <w:t xml:space="preserve">”</w:t>
+      </w:r>
+      <w:r>
+        <w:rPr>
+          <w:rFonts w:ascii="Times New Roman" w:hAnsi="Times New Roman" w:eastAsia="Times New Roman" w:cs="Times New Roman"/>
+          <w:sz w:val="24"/>
+        </w:rPr>
+        <w:t xml:space="preserve">: abordagem policial, racismo e violência estrutural entre jovens negros de três capitais do Nordeste.</w:t>
+      </w:r>
+      <w:r>
+        <w:rPr>
+          <w:rFonts w:ascii="Times New Roman" w:hAnsi="Times New Roman" w:eastAsia="Times New Roman" w:cs="Times New Roman"/>
+          <w:sz w:val="24"/>
+        </w:rPr>
+        <w:t xml:space="preserve"> </w:t>
+      </w:r>
+      <w:r>
+        <w:rPr>
+          <w:bCs/>
+          <w:rFonts w:ascii="Times New Roman" w:hAnsi="Times New Roman" w:eastAsia="Times New Roman" w:cs="Times New Roman"/>
+          <w:b/>
+          <w:sz w:val="24"/>
+        </w:rPr>
+        <w:t xml:space="preserve">Saúde e Sociedade</w:t>
+      </w:r>
+      <w:r>
+        <w:rPr>
+          <w:rFonts w:ascii="Times New Roman" w:hAnsi="Times New Roman" w:eastAsia="Times New Roman" w:cs="Times New Roman"/>
+          <w:sz w:val="24"/>
+        </w:rPr>
+        <w:t xml:space="preserve">, São Paulo, v. 29, n. 1, e190271, 2020. DOI: 10.1590/S0104-12902020190271.</w:t>
       </w:r>
     </w:p>
     <w:p>
@@ -1408,30 +1473,30 @@
           <w:rFonts w:ascii="Times New Roman" w:hAnsi="Times New Roman" w:eastAsia="Times New Roman" w:cs="Times New Roman"/>
           <w:sz w:val="24"/>
         </w:rPr>
-        <w:t xml:space="preserve">BEETHAM, D.</w:t>
-      </w:r>
-      <w:r>
-        <w:rPr>
-          <w:rFonts w:ascii="Times New Roman" w:hAnsi="Times New Roman" w:eastAsia="Times New Roman" w:cs="Times New Roman"/>
-          <w:sz w:val="24"/>
-        </w:rPr>
-        <w:t xml:space="preserve"> </w:t>
-      </w:r>
-      <w:r>
-        <w:rPr>
-          <w:bCs/>
-          <w:rFonts w:ascii="Times New Roman" w:hAnsi="Times New Roman" w:eastAsia="Times New Roman" w:cs="Times New Roman"/>
-          <w:b/>
-          <w:sz w:val="24"/>
-        </w:rPr>
-        <w:t xml:space="preserve">The legitimation of power</w:t>
-      </w:r>
-      <w:r>
-        <w:rPr>
-          <w:rFonts w:ascii="Times New Roman" w:hAnsi="Times New Roman" w:eastAsia="Times New Roman" w:cs="Times New Roman"/>
-          <w:sz w:val="24"/>
-        </w:rPr>
-        <w:t xml:space="preserve">. London: Macmillan, 1991.</w:t>
+        <w:t xml:space="preserve">ARAÚJO, E. M.; OLIVEIRA, R. R. S.; SAMPAIO, A. A. S. Qualidade metodológica das pesquisas documentais sobre controle disciplinar interno da Polícia Militar: revisão sistemática da literatura.</w:t>
+      </w:r>
+      <w:r>
+        <w:rPr>
+          <w:rFonts w:ascii="Times New Roman" w:hAnsi="Times New Roman" w:eastAsia="Times New Roman" w:cs="Times New Roman"/>
+          <w:sz w:val="24"/>
+        </w:rPr>
+        <w:t xml:space="preserve"> </w:t>
+      </w:r>
+      <w:r>
+        <w:rPr>
+          <w:bCs/>
+          <w:rFonts w:ascii="Times New Roman" w:hAnsi="Times New Roman" w:eastAsia="Times New Roman" w:cs="Times New Roman"/>
+          <w:b/>
+          <w:sz w:val="24"/>
+        </w:rPr>
+        <w:t xml:space="preserve">Revista Brasileira de Segurança Pública</w:t>
+      </w:r>
+      <w:r>
+        <w:rPr>
+          <w:rFonts w:ascii="Times New Roman" w:hAnsi="Times New Roman" w:eastAsia="Times New Roman" w:cs="Times New Roman"/>
+          <w:sz w:val="24"/>
+        </w:rPr>
+        <w:t xml:space="preserve">, São Paulo, v. 19, n. 1, p. 342-357, fev./mar. 2025.</w:t>
       </w:r>
     </w:p>
     <w:p>
@@ -1445,30 +1510,30 @@
           <w:rFonts w:ascii="Times New Roman" w:hAnsi="Times New Roman" w:eastAsia="Times New Roman" w:cs="Times New Roman"/>
           <w:sz w:val="24"/>
         </w:rPr>
-        <w:t xml:space="preserve">BUENO, S.; LIMA, R. S.; TEIXEIRA, M. A. C. Sujeito ou demandante? Reflexões sobre o caráter da participação nos conselhos comunitários de segurança de São Paulo.</w:t>
-      </w:r>
-      <w:r>
-        <w:rPr>
-          <w:rFonts w:ascii="Times New Roman" w:hAnsi="Times New Roman" w:eastAsia="Times New Roman" w:cs="Times New Roman"/>
-          <w:sz w:val="24"/>
-        </w:rPr>
-        <w:t xml:space="preserve"> </w:t>
-      </w:r>
-      <w:r>
-        <w:rPr>
-          <w:bCs/>
-          <w:rFonts w:ascii="Times New Roman" w:hAnsi="Times New Roman" w:eastAsia="Times New Roman" w:cs="Times New Roman"/>
-          <w:b/>
-          <w:sz w:val="24"/>
-        </w:rPr>
-        <w:t xml:space="preserve">Sociologias</w:t>
-      </w:r>
-      <w:r>
-        <w:rPr>
-          <w:rFonts w:ascii="Times New Roman" w:hAnsi="Times New Roman" w:eastAsia="Times New Roman" w:cs="Times New Roman"/>
-          <w:sz w:val="24"/>
-        </w:rPr>
-        <w:t xml:space="preserve">, Porto Alegre, v. 18, n. 42, p. 328-355, 2016. DOI: 10.1590/15174522-018004214.</w:t>
+        <w:t xml:space="preserve">BARDIN, L.</w:t>
+      </w:r>
+      <w:r>
+        <w:rPr>
+          <w:rFonts w:ascii="Times New Roman" w:hAnsi="Times New Roman" w:eastAsia="Times New Roman" w:cs="Times New Roman"/>
+          <w:sz w:val="24"/>
+        </w:rPr>
+        <w:t xml:space="preserve"> </w:t>
+      </w:r>
+      <w:r>
+        <w:rPr>
+          <w:bCs/>
+          <w:rFonts w:ascii="Times New Roman" w:hAnsi="Times New Roman" w:eastAsia="Times New Roman" w:cs="Times New Roman"/>
+          <w:b/>
+          <w:sz w:val="24"/>
+        </w:rPr>
+        <w:t xml:space="preserve">Análise de conteúdo</w:t>
+      </w:r>
+      <w:r>
+        <w:rPr>
+          <w:rFonts w:ascii="Times New Roman" w:hAnsi="Times New Roman" w:eastAsia="Times New Roman" w:cs="Times New Roman"/>
+          <w:sz w:val="24"/>
+        </w:rPr>
+        <w:t xml:space="preserve">. São Paulo: Edições 70, 2016.</w:t>
       </w:r>
     </w:p>
     <w:p>
@@ -1482,30 +1547,30 @@
           <w:rFonts w:ascii="Times New Roman" w:hAnsi="Times New Roman" w:eastAsia="Times New Roman" w:cs="Times New Roman"/>
           <w:sz w:val="24"/>
         </w:rPr>
-        <w:t xml:space="preserve">COSTA, A. T. M.</w:t>
-      </w:r>
-      <w:r>
-        <w:rPr>
-          <w:rFonts w:ascii="Times New Roman" w:hAnsi="Times New Roman" w:eastAsia="Times New Roman" w:cs="Times New Roman"/>
-          <w:sz w:val="24"/>
-        </w:rPr>
-        <w:t xml:space="preserve"> </w:t>
-      </w:r>
-      <w:r>
-        <w:rPr>
-          <w:bCs/>
-          <w:rFonts w:ascii="Times New Roman" w:hAnsi="Times New Roman" w:eastAsia="Times New Roman" w:cs="Times New Roman"/>
-          <w:b/>
-          <w:sz w:val="24"/>
-        </w:rPr>
-        <w:t xml:space="preserve">Entre a lei e a ordem</w:t>
-      </w:r>
-      <w:r>
-        <w:rPr>
-          <w:rFonts w:ascii="Times New Roman" w:hAnsi="Times New Roman" w:eastAsia="Times New Roman" w:cs="Times New Roman"/>
-          <w:sz w:val="24"/>
-        </w:rPr>
-        <w:t xml:space="preserve">: violência e reforma nas polícias do Rio de Janeiro e Nova York. Rio de Janeiro: Editora FGV, 2004.</w:t>
+        <w:t xml:space="preserve">BAYLEY, D. H.</w:t>
+      </w:r>
+      <w:r>
+        <w:rPr>
+          <w:rFonts w:ascii="Times New Roman" w:hAnsi="Times New Roman" w:eastAsia="Times New Roman" w:cs="Times New Roman"/>
+          <w:sz w:val="24"/>
+        </w:rPr>
+        <w:t xml:space="preserve"> </w:t>
+      </w:r>
+      <w:r>
+        <w:rPr>
+          <w:bCs/>
+          <w:rFonts w:ascii="Times New Roman" w:hAnsi="Times New Roman" w:eastAsia="Times New Roman" w:cs="Times New Roman"/>
+          <w:b/>
+          <w:sz w:val="24"/>
+        </w:rPr>
+        <w:t xml:space="preserve">Padrões de policiamento</w:t>
+      </w:r>
+      <w:r>
+        <w:rPr>
+          <w:rFonts w:ascii="Times New Roman" w:hAnsi="Times New Roman" w:eastAsia="Times New Roman" w:cs="Times New Roman"/>
+          <w:sz w:val="24"/>
+        </w:rPr>
+        <w:t xml:space="preserve">: uma análise internacional comparativa. São Paulo: Edusp, 2001.</w:t>
       </w:r>
     </w:p>
     <w:p>
@@ -1519,30 +1584,30 @@
           <w:rFonts w:ascii="Times New Roman" w:hAnsi="Times New Roman" w:eastAsia="Times New Roman" w:cs="Times New Roman"/>
           <w:sz w:val="24"/>
         </w:rPr>
-        <w:t xml:space="preserve">FERREIRA, D. V. S.; ROSSONI, L.; OLIVEIRA, C. R. Lógicas institucionais do policiamento comunitário: esquema analítico e agenda de pesquisa para o contexto brasileiro.</w:t>
-      </w:r>
-      <w:r>
-        <w:rPr>
-          <w:rFonts w:ascii="Times New Roman" w:hAnsi="Times New Roman" w:eastAsia="Times New Roman" w:cs="Times New Roman"/>
-          <w:sz w:val="24"/>
-        </w:rPr>
-        <w:t xml:space="preserve"> </w:t>
-      </w:r>
-      <w:r>
-        <w:rPr>
-          <w:bCs/>
-          <w:rFonts w:ascii="Times New Roman" w:hAnsi="Times New Roman" w:eastAsia="Times New Roman" w:cs="Times New Roman"/>
-          <w:b/>
-          <w:sz w:val="24"/>
-        </w:rPr>
-        <w:t xml:space="preserve">Revista de Administração Pública</w:t>
-      </w:r>
-      <w:r>
-        <w:rPr>
-          <w:rFonts w:ascii="Times New Roman" w:hAnsi="Times New Roman" w:eastAsia="Times New Roman" w:cs="Times New Roman"/>
-          <w:sz w:val="24"/>
-        </w:rPr>
-        <w:t xml:space="preserve">, Rio de Janeiro, v. 56, n. 1, p. 134-162, jan./fev. 2022. DOI: 10.1590/0034-761220210122.</w:t>
+        <w:t xml:space="preserve">BEETHAM, D.</w:t>
+      </w:r>
+      <w:r>
+        <w:rPr>
+          <w:rFonts w:ascii="Times New Roman" w:hAnsi="Times New Roman" w:eastAsia="Times New Roman" w:cs="Times New Roman"/>
+          <w:sz w:val="24"/>
+        </w:rPr>
+        <w:t xml:space="preserve"> </w:t>
+      </w:r>
+      <w:r>
+        <w:rPr>
+          <w:bCs/>
+          <w:rFonts w:ascii="Times New Roman" w:hAnsi="Times New Roman" w:eastAsia="Times New Roman" w:cs="Times New Roman"/>
+          <w:b/>
+          <w:sz w:val="24"/>
+        </w:rPr>
+        <w:t xml:space="preserve">The legitimation of power</w:t>
+      </w:r>
+      <w:r>
+        <w:rPr>
+          <w:rFonts w:ascii="Times New Roman" w:hAnsi="Times New Roman" w:eastAsia="Times New Roman" w:cs="Times New Roman"/>
+          <w:sz w:val="24"/>
+        </w:rPr>
+        <w:t xml:space="preserve">. London: Macmillan, 1991.</w:t>
       </w:r>
     </w:p>
     <w:p>
@@ -1556,30 +1621,30 @@
           <w:rFonts w:ascii="Times New Roman" w:hAnsi="Times New Roman" w:eastAsia="Times New Roman" w:cs="Times New Roman"/>
           <w:sz w:val="24"/>
         </w:rPr>
-        <w:t xml:space="preserve">FÓRUM BRASILEIRO DE SEGURANÇA PÚBLICA.</w:t>
-      </w:r>
-      <w:r>
-        <w:rPr>
-          <w:rFonts w:ascii="Times New Roman" w:hAnsi="Times New Roman" w:eastAsia="Times New Roman" w:cs="Times New Roman"/>
-          <w:sz w:val="24"/>
-        </w:rPr>
-        <w:t xml:space="preserve"> </w:t>
-      </w:r>
-      <w:r>
-        <w:rPr>
-          <w:bCs/>
-          <w:rFonts w:ascii="Times New Roman" w:hAnsi="Times New Roman" w:eastAsia="Times New Roman" w:cs="Times New Roman"/>
-          <w:b/>
-          <w:sz w:val="24"/>
-        </w:rPr>
-        <w:t xml:space="preserve">Anuário Brasileiro de Segurança Pública 2025</w:t>
-      </w:r>
-      <w:r>
-        <w:rPr>
-          <w:rFonts w:ascii="Times New Roman" w:hAnsi="Times New Roman" w:eastAsia="Times New Roman" w:cs="Times New Roman"/>
-          <w:sz w:val="24"/>
-        </w:rPr>
-        <w:t xml:space="preserve">. São Paulo: FBSP, 2025.</w:t>
+        <w:t xml:space="preserve">BENTO, C.</w:t>
+      </w:r>
+      <w:r>
+        <w:rPr>
+          <w:rFonts w:ascii="Times New Roman" w:hAnsi="Times New Roman" w:eastAsia="Times New Roman" w:cs="Times New Roman"/>
+          <w:sz w:val="24"/>
+        </w:rPr>
+        <w:t xml:space="preserve"> </w:t>
+      </w:r>
+      <w:r>
+        <w:rPr>
+          <w:bCs/>
+          <w:rFonts w:ascii="Times New Roman" w:hAnsi="Times New Roman" w:eastAsia="Times New Roman" w:cs="Times New Roman"/>
+          <w:b/>
+          <w:sz w:val="24"/>
+        </w:rPr>
+        <w:t xml:space="preserve">O pacto da branquitude</w:t>
+      </w:r>
+      <w:r>
+        <w:rPr>
+          <w:rFonts w:ascii="Times New Roman" w:hAnsi="Times New Roman" w:eastAsia="Times New Roman" w:cs="Times New Roman"/>
+          <w:sz w:val="24"/>
+        </w:rPr>
+        <w:t xml:space="preserve">. São Paulo: Companhia das Letras, 2022.</w:t>
       </w:r>
     </w:p>
     <w:p>
@@ -1593,37 +1658,30 @@
           <w:rFonts w:ascii="Times New Roman" w:hAnsi="Times New Roman" w:eastAsia="Times New Roman" w:cs="Times New Roman"/>
           <w:sz w:val="24"/>
         </w:rPr>
-        <w:t xml:space="preserve">LEMGRUBER, J.; MUSUMECI, L.; CANO, I.</w:t>
-      </w:r>
-      <w:r>
-        <w:rPr>
-          <w:rFonts w:ascii="Times New Roman" w:hAnsi="Times New Roman" w:eastAsia="Times New Roman" w:cs="Times New Roman"/>
-          <w:sz w:val="24"/>
-        </w:rPr>
-        <w:t xml:space="preserve"> </w:t>
-      </w:r>
-      <w:r>
-        <w:rPr>
-          <w:bCs/>
-          <w:rFonts w:ascii="Times New Roman" w:hAnsi="Times New Roman" w:eastAsia="Times New Roman" w:cs="Times New Roman"/>
-          <w:b/>
-          <w:sz w:val="24"/>
-        </w:rPr>
-        <w:t xml:space="preserve">Quem vigia os vigias?</w:t>
-      </w:r>
-      <w:r>
-        <w:rPr>
-          <w:rFonts w:ascii="Times New Roman" w:hAnsi="Times New Roman" w:eastAsia="Times New Roman" w:cs="Times New Roman"/>
-          <w:sz w:val="24"/>
-        </w:rPr>
-        <w:t xml:space="preserve"> </w:t>
-      </w:r>
-      <w:r>
-        <w:rPr>
-          <w:rFonts w:ascii="Times New Roman" w:hAnsi="Times New Roman" w:eastAsia="Times New Roman" w:cs="Times New Roman"/>
-          <w:sz w:val="24"/>
-        </w:rPr>
-        <w:t xml:space="preserve">Um estudo sobre controle externo da polícia no Brasil. Rio de Janeiro: Record, 2003.</w:t>
+        <w:t xml:space="preserve">BUENO, S.; LIMA, R. S.; TEIXEIRA, M. A. C. Sujeito ou demandante? Reflexões sobre o caráter da participação nos conselhos comunitários de segurança de São Paulo.</w:t>
+      </w:r>
+      <w:r>
+        <w:rPr>
+          <w:rFonts w:ascii="Times New Roman" w:hAnsi="Times New Roman" w:eastAsia="Times New Roman" w:cs="Times New Roman"/>
+          <w:sz w:val="24"/>
+        </w:rPr>
+        <w:t xml:space="preserve"> </w:t>
+      </w:r>
+      <w:r>
+        <w:rPr>
+          <w:bCs/>
+          <w:rFonts w:ascii="Times New Roman" w:hAnsi="Times New Roman" w:eastAsia="Times New Roman" w:cs="Times New Roman"/>
+          <w:b/>
+          <w:sz w:val="24"/>
+        </w:rPr>
+        <w:t xml:space="preserve">Sociologias</w:t>
+      </w:r>
+      <w:r>
+        <w:rPr>
+          <w:rFonts w:ascii="Times New Roman" w:hAnsi="Times New Roman" w:eastAsia="Times New Roman" w:cs="Times New Roman"/>
+          <w:sz w:val="24"/>
+        </w:rPr>
+        <w:t xml:space="preserve">, Porto Alegre, v. 18, n. 42, p. 328-355, 2016. DOI: 10.1590/15174522-018004214.</w:t>
       </w:r>
     </w:p>
     <w:p>
@@ -1637,30 +1695,30 @@
           <w:rFonts w:ascii="Times New Roman" w:hAnsi="Times New Roman" w:eastAsia="Times New Roman" w:cs="Times New Roman"/>
           <w:sz w:val="24"/>
         </w:rPr>
-        <w:t xml:space="preserve">LUI, L.; SALES, E. R. Policiamento baseado em evidências: uma revisão bibliométrica.</w:t>
-      </w:r>
-      <w:r>
-        <w:rPr>
-          <w:rFonts w:ascii="Times New Roman" w:hAnsi="Times New Roman" w:eastAsia="Times New Roman" w:cs="Times New Roman"/>
-          <w:sz w:val="24"/>
-        </w:rPr>
-        <w:t xml:space="preserve"> </w:t>
-      </w:r>
-      <w:r>
-        <w:rPr>
-          <w:bCs/>
-          <w:rFonts w:ascii="Times New Roman" w:hAnsi="Times New Roman" w:eastAsia="Times New Roman" w:cs="Times New Roman"/>
-          <w:b/>
-          <w:sz w:val="24"/>
-        </w:rPr>
-        <w:t xml:space="preserve">Revista Brasileira de Segurança Pública</w:t>
-      </w:r>
-      <w:r>
-        <w:rPr>
-          <w:rFonts w:ascii="Times New Roman" w:hAnsi="Times New Roman" w:eastAsia="Times New Roman" w:cs="Times New Roman"/>
-          <w:sz w:val="24"/>
-        </w:rPr>
-        <w:t xml:space="preserve">, São Paulo, v. 18, n. 1, p. 344-359, fev./mar. 2024.</w:t>
+        <w:t xml:space="preserve">COSTA, A. T. M.</w:t>
+      </w:r>
+      <w:r>
+        <w:rPr>
+          <w:rFonts w:ascii="Times New Roman" w:hAnsi="Times New Roman" w:eastAsia="Times New Roman" w:cs="Times New Roman"/>
+          <w:sz w:val="24"/>
+        </w:rPr>
+        <w:t xml:space="preserve"> </w:t>
+      </w:r>
+      <w:r>
+        <w:rPr>
+          <w:bCs/>
+          <w:rFonts w:ascii="Times New Roman" w:hAnsi="Times New Roman" w:eastAsia="Times New Roman" w:cs="Times New Roman"/>
+          <w:b/>
+          <w:sz w:val="24"/>
+        </w:rPr>
+        <w:t xml:space="preserve">Entre a lei e a ordem</w:t>
+      </w:r>
+      <w:r>
+        <w:rPr>
+          <w:rFonts w:ascii="Times New Roman" w:hAnsi="Times New Roman" w:eastAsia="Times New Roman" w:cs="Times New Roman"/>
+          <w:sz w:val="24"/>
+        </w:rPr>
+        <w:t xml:space="preserve">: violência e reforma nas polícias do Rio de Janeiro e Nova York. Rio de Janeiro: Editora FGV, 2004.</w:t>
       </w:r>
     </w:p>
     <w:p>
@@ -1674,30 +1732,30 @@
           <w:rFonts w:ascii="Times New Roman" w:hAnsi="Times New Roman" w:eastAsia="Times New Roman" w:cs="Times New Roman"/>
           <w:sz w:val="24"/>
         </w:rPr>
-        <w:t xml:space="preserve">MUNIZ, J.; PAES-MACHADO, E. Polícia para quem precisa de polícia: contribuições aos estudos sobre policiamento.</w:t>
-      </w:r>
-      <w:r>
-        <w:rPr>
-          <w:rFonts w:ascii="Times New Roman" w:hAnsi="Times New Roman" w:eastAsia="Times New Roman" w:cs="Times New Roman"/>
-          <w:sz w:val="24"/>
-        </w:rPr>
-        <w:t xml:space="preserve"> </w:t>
-      </w:r>
-      <w:r>
-        <w:rPr>
-          <w:bCs/>
-          <w:rFonts w:ascii="Times New Roman" w:hAnsi="Times New Roman" w:eastAsia="Times New Roman" w:cs="Times New Roman"/>
-          <w:b/>
-          <w:sz w:val="24"/>
-        </w:rPr>
-        <w:t xml:space="preserve">Caderno CRH</w:t>
-      </w:r>
-      <w:r>
-        <w:rPr>
-          <w:rFonts w:ascii="Times New Roman" w:hAnsi="Times New Roman" w:eastAsia="Times New Roman" w:cs="Times New Roman"/>
-          <w:sz w:val="24"/>
-        </w:rPr>
-        <w:t xml:space="preserve">, Salvador, v. 23, n. 60, 2010.</w:t>
+        <w:t xml:space="preserve">FERREIRA, D. V. S.; ROSSONI, L.; OLIVEIRA, C. R. Lógicas institucionais do policiamento comunitário: esquema analítico e agenda de pesquisa para o contexto brasileiro.</w:t>
+      </w:r>
+      <w:r>
+        <w:rPr>
+          <w:rFonts w:ascii="Times New Roman" w:hAnsi="Times New Roman" w:eastAsia="Times New Roman" w:cs="Times New Roman"/>
+          <w:sz w:val="24"/>
+        </w:rPr>
+        <w:t xml:space="preserve"> </w:t>
+      </w:r>
+      <w:r>
+        <w:rPr>
+          <w:bCs/>
+          <w:rFonts w:ascii="Times New Roman" w:hAnsi="Times New Roman" w:eastAsia="Times New Roman" w:cs="Times New Roman"/>
+          <w:b/>
+          <w:sz w:val="24"/>
+        </w:rPr>
+        <w:t xml:space="preserve">Revista de Administração Pública</w:t>
+      </w:r>
+      <w:r>
+        <w:rPr>
+          <w:rFonts w:ascii="Times New Roman" w:hAnsi="Times New Roman" w:eastAsia="Times New Roman" w:cs="Times New Roman"/>
+          <w:sz w:val="24"/>
+        </w:rPr>
+        <w:t xml:space="preserve">, Rio de Janeiro, v. 56, n. 1, p. 134-162, jan./fev. 2022. DOI: 10.1590/0034-761220210122.</w:t>
       </w:r>
     </w:p>
     <w:p>
@@ -1711,30 +1769,30 @@
           <w:rFonts w:ascii="Times New Roman" w:hAnsi="Times New Roman" w:eastAsia="Times New Roman" w:cs="Times New Roman"/>
           <w:sz w:val="24"/>
         </w:rPr>
-        <w:t xml:space="preserve">OLIVEIRA, T. R.; OLIVEIRA, A. R.; ADORNO, S. Legitimidade policial: um modelo de mensuração.</w:t>
-      </w:r>
-      <w:r>
-        <w:rPr>
-          <w:rFonts w:ascii="Times New Roman" w:hAnsi="Times New Roman" w:eastAsia="Times New Roman" w:cs="Times New Roman"/>
-          <w:sz w:val="24"/>
-        </w:rPr>
-        <w:t xml:space="preserve"> </w:t>
-      </w:r>
-      <w:r>
-        <w:rPr>
-          <w:bCs/>
-          <w:rFonts w:ascii="Times New Roman" w:hAnsi="Times New Roman" w:eastAsia="Times New Roman" w:cs="Times New Roman"/>
-          <w:b/>
-          <w:sz w:val="24"/>
-        </w:rPr>
-        <w:t xml:space="preserve">Revista Brasileira de Ciências Sociais</w:t>
-      </w:r>
-      <w:r>
-        <w:rPr>
-          <w:rFonts w:ascii="Times New Roman" w:hAnsi="Times New Roman" w:eastAsia="Times New Roman" w:cs="Times New Roman"/>
-          <w:sz w:val="24"/>
-        </w:rPr>
-        <w:t xml:space="preserve">, São Paulo, v. 34, n. 100, e3410007, 2019. DOI: 10.1590/3410007/2019.</w:t>
+        <w:t xml:space="preserve">FLAUZINA, A. L. P.</w:t>
+      </w:r>
+      <w:r>
+        <w:rPr>
+          <w:rFonts w:ascii="Times New Roman" w:hAnsi="Times New Roman" w:eastAsia="Times New Roman" w:cs="Times New Roman"/>
+          <w:sz w:val="24"/>
+        </w:rPr>
+        <w:t xml:space="preserve"> </w:t>
+      </w:r>
+      <w:r>
+        <w:rPr>
+          <w:bCs/>
+          <w:rFonts w:ascii="Times New Roman" w:hAnsi="Times New Roman" w:eastAsia="Times New Roman" w:cs="Times New Roman"/>
+          <w:b/>
+          <w:sz w:val="24"/>
+        </w:rPr>
+        <w:t xml:space="preserve">Corpo negro caído no chão</w:t>
+      </w:r>
+      <w:r>
+        <w:rPr>
+          <w:rFonts w:ascii="Times New Roman" w:hAnsi="Times New Roman" w:eastAsia="Times New Roman" w:cs="Times New Roman"/>
+          <w:sz w:val="24"/>
+        </w:rPr>
+        <w:t xml:space="preserve">: o sistema penal e o projeto genocida do Estado brasileiro. 2006. Dissertação (Mestrado em Direito) – Universidade de Brasília, Brasília, 2006.</w:t>
       </w:r>
     </w:p>
     <w:p>
@@ -1748,30 +1806,30 @@
           <w:rFonts w:ascii="Times New Roman" w:hAnsi="Times New Roman" w:eastAsia="Times New Roman" w:cs="Times New Roman"/>
           <w:sz w:val="24"/>
         </w:rPr>
-        <w:t xml:space="preserve">PEDROSA JÚNIOR, J. L. C.; MONTEIRO, L. M.; NASCIMENTO, E. O. Accountability e controle externo da atividade policial: uma análise das diretrizes do CNMP no enfrentamento à letalidade policial.</w:t>
-      </w:r>
-      <w:r>
-        <w:rPr>
-          <w:rFonts w:ascii="Times New Roman" w:hAnsi="Times New Roman" w:eastAsia="Times New Roman" w:cs="Times New Roman"/>
-          <w:sz w:val="24"/>
-        </w:rPr>
-        <w:t xml:space="preserve"> </w:t>
-      </w:r>
-      <w:r>
-        <w:rPr>
-          <w:bCs/>
-          <w:rFonts w:ascii="Times New Roman" w:hAnsi="Times New Roman" w:eastAsia="Times New Roman" w:cs="Times New Roman"/>
-          <w:b/>
-          <w:sz w:val="24"/>
-        </w:rPr>
-        <w:t xml:space="preserve">REDES: Revista Eletrônica Direito e Sociedade</w:t>
-      </w:r>
-      <w:r>
-        <w:rPr>
-          <w:rFonts w:ascii="Times New Roman" w:hAnsi="Times New Roman" w:eastAsia="Times New Roman" w:cs="Times New Roman"/>
-          <w:sz w:val="24"/>
-        </w:rPr>
-        <w:t xml:space="preserve">, Canoas, v. 11, n. 2, 2023. DOI: 10.18316/REDES.v11i2.9556.</w:t>
+        <w:t xml:space="preserve">FÓRUM BRASILEIRO DE SEGURANÇA PÚBLICA.</w:t>
+      </w:r>
+      <w:r>
+        <w:rPr>
+          <w:rFonts w:ascii="Times New Roman" w:hAnsi="Times New Roman" w:eastAsia="Times New Roman" w:cs="Times New Roman"/>
+          <w:sz w:val="24"/>
+        </w:rPr>
+        <w:t xml:space="preserve"> </w:t>
+      </w:r>
+      <w:r>
+        <w:rPr>
+          <w:bCs/>
+          <w:rFonts w:ascii="Times New Roman" w:hAnsi="Times New Roman" w:eastAsia="Times New Roman" w:cs="Times New Roman"/>
+          <w:b/>
+          <w:sz w:val="24"/>
+        </w:rPr>
+        <w:t xml:space="preserve">Anuário Brasileiro de Segurança Pública 2026</w:t>
+      </w:r>
+      <w:r>
+        <w:rPr>
+          <w:rFonts w:ascii="Times New Roman" w:hAnsi="Times New Roman" w:eastAsia="Times New Roman" w:cs="Times New Roman"/>
+          <w:sz w:val="24"/>
+        </w:rPr>
+        <w:t xml:space="preserve">. São Paulo: FBSP, 2026.</w:t>
       </w:r>
     </w:p>
     <w:p>
@@ -1785,30 +1843,30 @@
           <w:rFonts w:ascii="Times New Roman" w:hAnsi="Times New Roman" w:eastAsia="Times New Roman" w:cs="Times New Roman"/>
           <w:sz w:val="24"/>
         </w:rPr>
-        <w:t xml:space="preserve">ROLIM, M. F.; HERMANN, D. Confiança nas polícias: percepção dos residentes e desafios para a gestão.</w:t>
-      </w:r>
-      <w:r>
-        <w:rPr>
-          <w:rFonts w:ascii="Times New Roman" w:hAnsi="Times New Roman" w:eastAsia="Times New Roman" w:cs="Times New Roman"/>
-          <w:sz w:val="24"/>
-        </w:rPr>
-        <w:t xml:space="preserve"> </w:t>
-      </w:r>
-      <w:r>
-        <w:rPr>
-          <w:bCs/>
-          <w:rFonts w:ascii="Times New Roman" w:hAnsi="Times New Roman" w:eastAsia="Times New Roman" w:cs="Times New Roman"/>
-          <w:b/>
-          <w:sz w:val="24"/>
-        </w:rPr>
-        <w:t xml:space="preserve">Sociologias</w:t>
-      </w:r>
-      <w:r>
-        <w:rPr>
-          <w:rFonts w:ascii="Times New Roman" w:hAnsi="Times New Roman" w:eastAsia="Times New Roman" w:cs="Times New Roman"/>
-          <w:sz w:val="24"/>
-        </w:rPr>
-        <w:t xml:space="preserve">, Porto Alegre, v. 20, n. 48, p. 188-211, maio/ago. 2018. DOI: 10.1590/15174522-020004812.</w:t>
+        <w:t xml:space="preserve">GONZALEZ, L. A categoria político-cultural de amefricanidade.</w:t>
+      </w:r>
+      <w:r>
+        <w:rPr>
+          <w:rFonts w:ascii="Times New Roman" w:hAnsi="Times New Roman" w:eastAsia="Times New Roman" w:cs="Times New Roman"/>
+          <w:sz w:val="24"/>
+        </w:rPr>
+        <w:t xml:space="preserve"> </w:t>
+      </w:r>
+      <w:r>
+        <w:rPr>
+          <w:bCs/>
+          <w:rFonts w:ascii="Times New Roman" w:hAnsi="Times New Roman" w:eastAsia="Times New Roman" w:cs="Times New Roman"/>
+          <w:b/>
+          <w:sz w:val="24"/>
+        </w:rPr>
+        <w:t xml:space="preserve">Tempo Brasileiro</w:t>
+      </w:r>
+      <w:r>
+        <w:rPr>
+          <w:rFonts w:ascii="Times New Roman" w:hAnsi="Times New Roman" w:eastAsia="Times New Roman" w:cs="Times New Roman"/>
+          <w:sz w:val="24"/>
+        </w:rPr>
+        <w:t xml:space="preserve">, Rio de Janeiro, n. 92/93, p. 69-82, jan./jun. 1988.</w:t>
       </w:r>
     </w:p>
     <w:p>
@@ -1822,30 +1880,37 @@
           <w:rFonts w:ascii="Times New Roman" w:hAnsi="Times New Roman" w:eastAsia="Times New Roman" w:cs="Times New Roman"/>
           <w:sz w:val="24"/>
         </w:rPr>
-        <w:t xml:space="preserve">SANTOS, A. P.; GOMES, A. O. Desempenho de organizações policiais: revisão sistemática da literatura.</w:t>
-      </w:r>
-      <w:r>
-        <w:rPr>
-          <w:rFonts w:ascii="Times New Roman" w:hAnsi="Times New Roman" w:eastAsia="Times New Roman" w:cs="Times New Roman"/>
-          <w:sz w:val="24"/>
-        </w:rPr>
-        <w:t xml:space="preserve"> </w:t>
-      </w:r>
-      <w:r>
-        <w:rPr>
-          <w:bCs/>
-          <w:rFonts w:ascii="Times New Roman" w:hAnsi="Times New Roman" w:eastAsia="Times New Roman" w:cs="Times New Roman"/>
-          <w:b/>
-          <w:sz w:val="24"/>
-        </w:rPr>
-        <w:t xml:space="preserve">Revista do Serviço Público</w:t>
-      </w:r>
-      <w:r>
-        <w:rPr>
-          <w:rFonts w:ascii="Times New Roman" w:hAnsi="Times New Roman" w:eastAsia="Times New Roman" w:cs="Times New Roman"/>
-          <w:sz w:val="24"/>
-        </w:rPr>
-        <w:t xml:space="preserve">, Brasília, v. 72, n. 1, p. 262-291, jan./mar. 2021. DOI: 10.21874/rsp.v72i01.4881.</w:t>
+        <w:t xml:space="preserve">LEMGRUBER, J.; MUSUMECI, L.; CANO, I.</w:t>
+      </w:r>
+      <w:r>
+        <w:rPr>
+          <w:rFonts w:ascii="Times New Roman" w:hAnsi="Times New Roman" w:eastAsia="Times New Roman" w:cs="Times New Roman"/>
+          <w:sz w:val="24"/>
+        </w:rPr>
+        <w:t xml:space="preserve"> </w:t>
+      </w:r>
+      <w:r>
+        <w:rPr>
+          <w:bCs/>
+          <w:rFonts w:ascii="Times New Roman" w:hAnsi="Times New Roman" w:eastAsia="Times New Roman" w:cs="Times New Roman"/>
+          <w:b/>
+          <w:sz w:val="24"/>
+        </w:rPr>
+        <w:t xml:space="preserve">Quem vigia os vigias?</w:t>
+      </w:r>
+      <w:r>
+        <w:rPr>
+          <w:rFonts w:ascii="Times New Roman" w:hAnsi="Times New Roman" w:eastAsia="Times New Roman" w:cs="Times New Roman"/>
+          <w:sz w:val="24"/>
+        </w:rPr>
+        <w:t xml:space="preserve"> </w:t>
+      </w:r>
+      <w:r>
+        <w:rPr>
+          <w:rFonts w:ascii="Times New Roman" w:hAnsi="Times New Roman" w:eastAsia="Times New Roman" w:cs="Times New Roman"/>
+          <w:sz w:val="24"/>
+        </w:rPr>
+        <w:t xml:space="preserve">Um estudo sobre controle externo da polícia no Brasil. Rio de Janeiro: Record, 2003.</w:t>
       </w:r>
     </w:p>
     <w:p>
@@ -1859,30 +1924,30 @@
           <w:rFonts w:ascii="Times New Roman" w:hAnsi="Times New Roman" w:eastAsia="Times New Roman" w:cs="Times New Roman"/>
           <w:sz w:val="24"/>
         </w:rPr>
-        <w:t xml:space="preserve">SAPORI, L. F.</w:t>
-      </w:r>
-      <w:r>
-        <w:rPr>
-          <w:rFonts w:ascii="Times New Roman" w:hAnsi="Times New Roman" w:eastAsia="Times New Roman" w:cs="Times New Roman"/>
-          <w:sz w:val="24"/>
-        </w:rPr>
-        <w:t xml:space="preserve"> </w:t>
-      </w:r>
-      <w:r>
-        <w:rPr>
-          <w:bCs/>
-          <w:rFonts w:ascii="Times New Roman" w:hAnsi="Times New Roman" w:eastAsia="Times New Roman" w:cs="Times New Roman"/>
-          <w:b/>
-          <w:sz w:val="24"/>
-        </w:rPr>
-        <w:t xml:space="preserve">Segurança pública no Brasil</w:t>
-      </w:r>
-      <w:r>
-        <w:rPr>
-          <w:rFonts w:ascii="Times New Roman" w:hAnsi="Times New Roman" w:eastAsia="Times New Roman" w:cs="Times New Roman"/>
-          <w:sz w:val="24"/>
-        </w:rPr>
-        <w:t xml:space="preserve">: desafios e perspectivas. Rio de Janeiro: Editora FGV, 2007.</w:t>
+        <w:t xml:space="preserve">LUI, L.; SALES, E. R. Policiamento baseado em evidências: uma revisão bibliométrica.</w:t>
+      </w:r>
+      <w:r>
+        <w:rPr>
+          <w:rFonts w:ascii="Times New Roman" w:hAnsi="Times New Roman" w:eastAsia="Times New Roman" w:cs="Times New Roman"/>
+          <w:sz w:val="24"/>
+        </w:rPr>
+        <w:t xml:space="preserve"> </w:t>
+      </w:r>
+      <w:r>
+        <w:rPr>
+          <w:bCs/>
+          <w:rFonts w:ascii="Times New Roman" w:hAnsi="Times New Roman" w:eastAsia="Times New Roman" w:cs="Times New Roman"/>
+          <w:b/>
+          <w:sz w:val="24"/>
+        </w:rPr>
+        <w:t xml:space="preserve">Revista Brasileira de Segurança Pública</w:t>
+      </w:r>
+      <w:r>
+        <w:rPr>
+          <w:rFonts w:ascii="Times New Roman" w:hAnsi="Times New Roman" w:eastAsia="Times New Roman" w:cs="Times New Roman"/>
+          <w:sz w:val="24"/>
+        </w:rPr>
+        <w:t xml:space="preserve">, São Paulo, v. 18, n. 1, p. 344-359, fev./mar. 2024.</w:t>
       </w:r>
     </w:p>
     <w:p>
@@ -1896,6 +1961,487 @@
           <w:rFonts w:ascii="Times New Roman" w:hAnsi="Times New Roman" w:eastAsia="Times New Roman" w:cs="Times New Roman"/>
           <w:sz w:val="24"/>
         </w:rPr>
+        <w:t xml:space="preserve">MUNIZ, J.; PAES-MACHADO, E. Polícia para quem precisa de polícia: contribuições aos estudos sobre policiamento.</w:t>
+      </w:r>
+      <w:r>
+        <w:rPr>
+          <w:rFonts w:ascii="Times New Roman" w:hAnsi="Times New Roman" w:eastAsia="Times New Roman" w:cs="Times New Roman"/>
+          <w:sz w:val="24"/>
+        </w:rPr>
+        <w:t xml:space="preserve"> </w:t>
+      </w:r>
+      <w:r>
+        <w:rPr>
+          <w:bCs/>
+          <w:rFonts w:ascii="Times New Roman" w:hAnsi="Times New Roman" w:eastAsia="Times New Roman" w:cs="Times New Roman"/>
+          <w:b/>
+          <w:sz w:val="24"/>
+        </w:rPr>
+        <w:t xml:space="preserve">Caderno CRH</w:t>
+      </w:r>
+      <w:r>
+        <w:rPr>
+          <w:rFonts w:ascii="Times New Roman" w:hAnsi="Times New Roman" w:eastAsia="Times New Roman" w:cs="Times New Roman"/>
+          <w:sz w:val="24"/>
+        </w:rPr>
+        <w:t xml:space="preserve">, Salvador, v. 23, n. 60, 2010.</w:t>
+      </w:r>
+    </w:p>
+    <w:p>
+      <w:pPr>
+        <w:pStyle w:val="BodyText"/>
+        <w:spacing w:line="240" w:lineRule="auto" w:before="0" w:after="240"/>
+        <w:jc w:val="left"/>
+      </w:pPr>
+      <w:r>
+        <w:rPr>
+          <w:rFonts w:ascii="Times New Roman" w:hAnsi="Times New Roman" w:eastAsia="Times New Roman" w:cs="Times New Roman"/>
+          <w:sz w:val="24"/>
+        </w:rPr>
+        <w:t xml:space="preserve">NASCIMENTO, A.</w:t>
+      </w:r>
+      <w:r>
+        <w:rPr>
+          <w:rFonts w:ascii="Times New Roman" w:hAnsi="Times New Roman" w:eastAsia="Times New Roman" w:cs="Times New Roman"/>
+          <w:sz w:val="24"/>
+        </w:rPr>
+        <w:t xml:space="preserve"> </w:t>
+      </w:r>
+      <w:r>
+        <w:rPr>
+          <w:bCs/>
+          <w:rFonts w:ascii="Times New Roman" w:hAnsi="Times New Roman" w:eastAsia="Times New Roman" w:cs="Times New Roman"/>
+          <w:b/>
+          <w:sz w:val="24"/>
+        </w:rPr>
+        <w:t xml:space="preserve">O quilombismo</w:t>
+      </w:r>
+      <w:r>
+        <w:rPr>
+          <w:rFonts w:ascii="Times New Roman" w:hAnsi="Times New Roman" w:eastAsia="Times New Roman" w:cs="Times New Roman"/>
+          <w:sz w:val="24"/>
+        </w:rPr>
+        <w:t xml:space="preserve">: documentos de uma militância pan-africanista. Petrópolis: Vozes, 1980.</w:t>
+      </w:r>
+    </w:p>
+    <w:p>
+      <w:pPr>
+        <w:pStyle w:val="BodyText"/>
+        <w:spacing w:line="240" w:lineRule="auto" w:before="0" w:after="240"/>
+        <w:jc w:val="left"/>
+      </w:pPr>
+      <w:r>
+        <w:rPr>
+          <w:rFonts w:ascii="Times New Roman" w:hAnsi="Times New Roman" w:eastAsia="Times New Roman" w:cs="Times New Roman"/>
+          <w:sz w:val="24"/>
+        </w:rPr>
+        <w:t xml:space="preserve">OLIVEIRA, C. B. F.; SANTOS, M. P.; ROCHA, J. C. S. Lei de drogas e encarceramento feminino negro: uma revisão de literatura sob ótica interseccional.</w:t>
+      </w:r>
+      <w:r>
+        <w:rPr>
+          <w:rFonts w:ascii="Times New Roman" w:hAnsi="Times New Roman" w:eastAsia="Times New Roman" w:cs="Times New Roman"/>
+          <w:sz w:val="24"/>
+        </w:rPr>
+        <w:t xml:space="preserve"> </w:t>
+      </w:r>
+      <w:r>
+        <w:rPr>
+          <w:bCs/>
+          <w:rFonts w:ascii="Times New Roman" w:hAnsi="Times New Roman" w:eastAsia="Times New Roman" w:cs="Times New Roman"/>
+          <w:b/>
+          <w:sz w:val="24"/>
+        </w:rPr>
+        <w:t xml:space="preserve">Opará: Etnicidades, Movimentos Sociais e Educação</w:t>
+      </w:r>
+      <w:r>
+        <w:rPr>
+          <w:rFonts w:ascii="Times New Roman" w:hAnsi="Times New Roman" w:eastAsia="Times New Roman" w:cs="Times New Roman"/>
+          <w:sz w:val="24"/>
+        </w:rPr>
+        <w:t xml:space="preserve">, v. 8, p. 2-15, 2021.</w:t>
+      </w:r>
+    </w:p>
+    <w:p>
+      <w:pPr>
+        <w:pStyle w:val="BodyText"/>
+        <w:spacing w:line="240" w:lineRule="auto" w:before="0" w:after="240"/>
+        <w:jc w:val="left"/>
+      </w:pPr>
+      <w:r>
+        <w:rPr>
+          <w:rFonts w:ascii="Times New Roman" w:hAnsi="Times New Roman" w:eastAsia="Times New Roman" w:cs="Times New Roman"/>
+          <w:sz w:val="24"/>
+        </w:rPr>
+        <w:t xml:space="preserve">OLIVEIRA, C. B. F.; TORRES, E.; TORRES, O. Vidas negras: um panorama sobre os dados de encarceramento e homicídios de jovens negros no Brasil.</w:t>
+      </w:r>
+      <w:r>
+        <w:rPr>
+          <w:rFonts w:ascii="Times New Roman" w:hAnsi="Times New Roman" w:eastAsia="Times New Roman" w:cs="Times New Roman"/>
+          <w:sz w:val="24"/>
+        </w:rPr>
+        <w:t xml:space="preserve"> </w:t>
+      </w:r>
+      <w:r>
+        <w:rPr>
+          <w:bCs/>
+          <w:rFonts w:ascii="Times New Roman" w:hAnsi="Times New Roman" w:eastAsia="Times New Roman" w:cs="Times New Roman"/>
+          <w:b/>
+          <w:sz w:val="24"/>
+        </w:rPr>
+        <w:t xml:space="preserve">Revista Trama Interdisciplinar</w:t>
+      </w:r>
+      <w:r>
+        <w:rPr>
+          <w:rFonts w:ascii="Times New Roman" w:hAnsi="Times New Roman" w:eastAsia="Times New Roman" w:cs="Times New Roman"/>
+          <w:sz w:val="24"/>
+        </w:rPr>
+        <w:t xml:space="preserve">, São Paulo, v. 9, n. 1, p. 86-106, 2018.</w:t>
+      </w:r>
+    </w:p>
+    <w:p>
+      <w:pPr>
+        <w:pStyle w:val="BodyText"/>
+        <w:spacing w:line="240" w:lineRule="auto" w:before="0" w:after="240"/>
+        <w:jc w:val="left"/>
+      </w:pPr>
+      <w:r>
+        <w:rPr>
+          <w:rFonts w:ascii="Times New Roman" w:hAnsi="Times New Roman" w:eastAsia="Times New Roman" w:cs="Times New Roman"/>
+          <w:sz w:val="24"/>
+        </w:rPr>
+        <w:t xml:space="preserve">OLIVEIRA, T. R.; OLIVEIRA, A. R.; ADORNO, S. Legitimidade policial: um modelo de mensuração.</w:t>
+      </w:r>
+      <w:r>
+        <w:rPr>
+          <w:rFonts w:ascii="Times New Roman" w:hAnsi="Times New Roman" w:eastAsia="Times New Roman" w:cs="Times New Roman"/>
+          <w:sz w:val="24"/>
+        </w:rPr>
+        <w:t xml:space="preserve"> </w:t>
+      </w:r>
+      <w:r>
+        <w:rPr>
+          <w:bCs/>
+          <w:rFonts w:ascii="Times New Roman" w:hAnsi="Times New Roman" w:eastAsia="Times New Roman" w:cs="Times New Roman"/>
+          <w:b/>
+          <w:sz w:val="24"/>
+        </w:rPr>
+        <w:t xml:space="preserve">Revista Brasileira de Ciências Sociais</w:t>
+      </w:r>
+      <w:r>
+        <w:rPr>
+          <w:rFonts w:ascii="Times New Roman" w:hAnsi="Times New Roman" w:eastAsia="Times New Roman" w:cs="Times New Roman"/>
+          <w:sz w:val="24"/>
+        </w:rPr>
+        <w:t xml:space="preserve">, São Paulo, v. 34, n. 100, e3410007, 2019. DOI: 10.1590/3410007/2019.</w:t>
+      </w:r>
+    </w:p>
+    <w:p>
+      <w:pPr>
+        <w:pStyle w:val="BodyText"/>
+        <w:spacing w:line="240" w:lineRule="auto" w:before="0" w:after="240"/>
+        <w:jc w:val="left"/>
+      </w:pPr>
+      <w:r>
+        <w:rPr>
+          <w:rFonts w:ascii="Times New Roman" w:hAnsi="Times New Roman" w:eastAsia="Times New Roman" w:cs="Times New Roman"/>
+          <w:sz w:val="24"/>
+        </w:rPr>
+        <w:t xml:space="preserve">PEDROSA JÚNIOR, J. L. C.; MONTEIRO, L. M.; NASCIMENTO, E. O. Accountability e controle externo da atividade policial: uma análise das diretrizes do CNMP no enfrentamento à letalidade policial.</w:t>
+      </w:r>
+      <w:r>
+        <w:rPr>
+          <w:rFonts w:ascii="Times New Roman" w:hAnsi="Times New Roman" w:eastAsia="Times New Roman" w:cs="Times New Roman"/>
+          <w:sz w:val="24"/>
+        </w:rPr>
+        <w:t xml:space="preserve"> </w:t>
+      </w:r>
+      <w:r>
+        <w:rPr>
+          <w:bCs/>
+          <w:rFonts w:ascii="Times New Roman" w:hAnsi="Times New Roman" w:eastAsia="Times New Roman" w:cs="Times New Roman"/>
+          <w:b/>
+          <w:sz w:val="24"/>
+        </w:rPr>
+        <w:t xml:space="preserve">REDES: Revista Eletrônica Direito e Sociedade</w:t>
+      </w:r>
+      <w:r>
+        <w:rPr>
+          <w:rFonts w:ascii="Times New Roman" w:hAnsi="Times New Roman" w:eastAsia="Times New Roman" w:cs="Times New Roman"/>
+          <w:sz w:val="24"/>
+        </w:rPr>
+        <w:t xml:space="preserve">, Canoas, v. 11, n. 2, 2023. DOI: 10.18316/REDES.v11i2.9556.</w:t>
+      </w:r>
+    </w:p>
+    <w:p>
+      <w:pPr>
+        <w:pStyle w:val="BodyText"/>
+        <w:spacing w:line="240" w:lineRule="auto" w:before="0" w:after="240"/>
+        <w:jc w:val="left"/>
+      </w:pPr>
+      <w:r>
+        <w:rPr>
+          <w:rFonts w:ascii="Times New Roman" w:hAnsi="Times New Roman" w:eastAsia="Times New Roman" w:cs="Times New Roman"/>
+          <w:sz w:val="24"/>
+        </w:rPr>
+        <w:t xml:space="preserve">RAMOS, S.; MUSUMECI, L.</w:t>
+      </w:r>
+      <w:r>
+        <w:rPr>
+          <w:rFonts w:ascii="Times New Roman" w:hAnsi="Times New Roman" w:eastAsia="Times New Roman" w:cs="Times New Roman"/>
+          <w:sz w:val="24"/>
+        </w:rPr>
+        <w:t xml:space="preserve"> </w:t>
+      </w:r>
+      <w:r>
+        <w:rPr>
+          <w:bCs/>
+          <w:rFonts w:ascii="Times New Roman" w:hAnsi="Times New Roman" w:eastAsia="Times New Roman" w:cs="Times New Roman"/>
+          <w:b/>
+          <w:sz w:val="24"/>
+        </w:rPr>
+        <w:t xml:space="preserve">Elemento suspeito</w:t>
+      </w:r>
+      <w:r>
+        <w:rPr>
+          <w:rFonts w:ascii="Times New Roman" w:hAnsi="Times New Roman" w:eastAsia="Times New Roman" w:cs="Times New Roman"/>
+          <w:sz w:val="24"/>
+        </w:rPr>
+        <w:t xml:space="preserve">: abordagem policial e discriminação na cidade do Rio de Janeiro. Rio de Janeiro: Civilização Brasileira, 2005.</w:t>
+      </w:r>
+    </w:p>
+    <w:p>
+      <w:pPr>
+        <w:pStyle w:val="BodyText"/>
+        <w:spacing w:line="240" w:lineRule="auto" w:before="0" w:after="240"/>
+        <w:jc w:val="left"/>
+      </w:pPr>
+      <w:r>
+        <w:rPr>
+          <w:rFonts w:ascii="Times New Roman" w:hAnsi="Times New Roman" w:eastAsia="Times New Roman" w:cs="Times New Roman"/>
+          <w:sz w:val="24"/>
+        </w:rPr>
+        <w:t xml:space="preserve">ROLIM, M. F.; HERMANN, D. Confiança nas polícias: percepção dos residentes e desafios para a gestão.</w:t>
+      </w:r>
+      <w:r>
+        <w:rPr>
+          <w:rFonts w:ascii="Times New Roman" w:hAnsi="Times New Roman" w:eastAsia="Times New Roman" w:cs="Times New Roman"/>
+          <w:sz w:val="24"/>
+        </w:rPr>
+        <w:t xml:space="preserve"> </w:t>
+      </w:r>
+      <w:r>
+        <w:rPr>
+          <w:bCs/>
+          <w:rFonts w:ascii="Times New Roman" w:hAnsi="Times New Roman" w:eastAsia="Times New Roman" w:cs="Times New Roman"/>
+          <w:b/>
+          <w:sz w:val="24"/>
+        </w:rPr>
+        <w:t xml:space="preserve">Sociologias</w:t>
+      </w:r>
+      <w:r>
+        <w:rPr>
+          <w:rFonts w:ascii="Times New Roman" w:hAnsi="Times New Roman" w:eastAsia="Times New Roman" w:cs="Times New Roman"/>
+          <w:sz w:val="24"/>
+        </w:rPr>
+        <w:t xml:space="preserve">, Porto Alegre, v. 20, n. 48, p. 188-211, maio/ago. 2018. DOI: 10.1590/15174522-020004812.</w:t>
+      </w:r>
+    </w:p>
+    <w:p>
+      <w:pPr>
+        <w:pStyle w:val="BodyText"/>
+        <w:spacing w:line="240" w:lineRule="auto" w:before="0" w:after="240"/>
+        <w:jc w:val="left"/>
+      </w:pPr>
+      <w:r>
+        <w:rPr>
+          <w:rFonts w:ascii="Times New Roman" w:hAnsi="Times New Roman" w:eastAsia="Times New Roman" w:cs="Times New Roman"/>
+          <w:sz w:val="24"/>
+        </w:rPr>
+        <w:t xml:space="preserve">SANTOS, A. P.; GOMES, A. O. Desempenho de organizações policiais: revisão sistemática da literatura.</w:t>
+      </w:r>
+      <w:r>
+        <w:rPr>
+          <w:rFonts w:ascii="Times New Roman" w:hAnsi="Times New Roman" w:eastAsia="Times New Roman" w:cs="Times New Roman"/>
+          <w:sz w:val="24"/>
+        </w:rPr>
+        <w:t xml:space="preserve"> </w:t>
+      </w:r>
+      <w:r>
+        <w:rPr>
+          <w:bCs/>
+          <w:rFonts w:ascii="Times New Roman" w:hAnsi="Times New Roman" w:eastAsia="Times New Roman" w:cs="Times New Roman"/>
+          <w:b/>
+          <w:sz w:val="24"/>
+        </w:rPr>
+        <w:t xml:space="preserve">Revista do Serviço Público</w:t>
+      </w:r>
+      <w:r>
+        <w:rPr>
+          <w:rFonts w:ascii="Times New Roman" w:hAnsi="Times New Roman" w:eastAsia="Times New Roman" w:cs="Times New Roman"/>
+          <w:sz w:val="24"/>
+        </w:rPr>
+        <w:t xml:space="preserve">, Brasília, v. 72, n. 1, p. 262-291, jan./mar. 2021. DOI: 10.21874/rsp.v72i01.4881.</w:t>
+      </w:r>
+    </w:p>
+    <w:p>
+      <w:pPr>
+        <w:pStyle w:val="BodyText"/>
+        <w:spacing w:line="240" w:lineRule="auto" w:before="0" w:after="240"/>
+        <w:jc w:val="left"/>
+      </w:pPr>
+      <w:r>
+        <w:rPr>
+          <w:rFonts w:ascii="Times New Roman" w:hAnsi="Times New Roman" w:eastAsia="Times New Roman" w:cs="Times New Roman"/>
+          <w:sz w:val="24"/>
+        </w:rPr>
+        <w:t xml:space="preserve">SANTOS, M. C. R. C. F. Convenção Interamericana contra o Racismo: uma análise sobre seu impacto na ordem constitucional e no sistema de justiça e segurança pública brasileiros.</w:t>
+      </w:r>
+      <w:r>
+        <w:rPr>
+          <w:rFonts w:ascii="Times New Roman" w:hAnsi="Times New Roman" w:eastAsia="Times New Roman" w:cs="Times New Roman"/>
+          <w:sz w:val="24"/>
+        </w:rPr>
+        <w:t xml:space="preserve"> </w:t>
+      </w:r>
+      <w:r>
+        <w:rPr>
+          <w:bCs/>
+          <w:rFonts w:ascii="Times New Roman" w:hAnsi="Times New Roman" w:eastAsia="Times New Roman" w:cs="Times New Roman"/>
+          <w:b/>
+          <w:sz w:val="24"/>
+        </w:rPr>
+        <w:t xml:space="preserve">Revista Jurídica Diké</w:t>
+      </w:r>
+      <w:r>
+        <w:rPr>
+          <w:rFonts w:ascii="Times New Roman" w:hAnsi="Times New Roman" w:eastAsia="Times New Roman" w:cs="Times New Roman"/>
+          <w:sz w:val="24"/>
+        </w:rPr>
+        <w:t xml:space="preserve">, Ilhéus, v. 24, p. 2-22, 2025.</w:t>
+      </w:r>
+    </w:p>
+    <w:p>
+      <w:pPr>
+        <w:pStyle w:val="BodyText"/>
+        <w:spacing w:line="240" w:lineRule="auto" w:before="0" w:after="240"/>
+        <w:jc w:val="left"/>
+      </w:pPr>
+      <w:r>
+        <w:rPr>
+          <w:rFonts w:ascii="Times New Roman" w:hAnsi="Times New Roman" w:eastAsia="Times New Roman" w:cs="Times New Roman"/>
+          <w:sz w:val="24"/>
+        </w:rPr>
+        <w:t xml:space="preserve">SAPORI, L. F.</w:t>
+      </w:r>
+      <w:r>
+        <w:rPr>
+          <w:rFonts w:ascii="Times New Roman" w:hAnsi="Times New Roman" w:eastAsia="Times New Roman" w:cs="Times New Roman"/>
+          <w:sz w:val="24"/>
+        </w:rPr>
+        <w:t xml:space="preserve"> </w:t>
+      </w:r>
+      <w:r>
+        <w:rPr>
+          <w:bCs/>
+          <w:rFonts w:ascii="Times New Roman" w:hAnsi="Times New Roman" w:eastAsia="Times New Roman" w:cs="Times New Roman"/>
+          <w:b/>
+          <w:sz w:val="24"/>
+        </w:rPr>
+        <w:t xml:space="preserve">Segurança pública no Brasil</w:t>
+      </w:r>
+      <w:r>
+        <w:rPr>
+          <w:rFonts w:ascii="Times New Roman" w:hAnsi="Times New Roman" w:eastAsia="Times New Roman" w:cs="Times New Roman"/>
+          <w:sz w:val="24"/>
+        </w:rPr>
+        <w:t xml:space="preserve">: desafios e perspectivas. Rio de Janeiro: Editora FGV, 2007.</w:t>
+      </w:r>
+    </w:p>
+    <w:p>
+      <w:pPr>
+        <w:pStyle w:val="BodyText"/>
+        <w:spacing w:line="240" w:lineRule="auto" w:before="0" w:after="240"/>
+        <w:jc w:val="left"/>
+      </w:pPr>
+      <w:r>
+        <w:rPr>
+          <w:rFonts w:ascii="Times New Roman" w:hAnsi="Times New Roman" w:eastAsia="Times New Roman" w:cs="Times New Roman"/>
+          <w:sz w:val="24"/>
+        </w:rPr>
+        <w:t xml:space="preserve">SILVA, R. G.</w:t>
+      </w:r>
+      <w:r>
+        <w:rPr>
+          <w:rFonts w:ascii="Times New Roman" w:hAnsi="Times New Roman" w:eastAsia="Times New Roman" w:cs="Times New Roman"/>
+          <w:sz w:val="24"/>
+        </w:rPr>
+        <w:t xml:space="preserve"> </w:t>
+      </w:r>
+      <w:r>
+        <w:rPr>
+          <w:bCs/>
+          <w:rFonts w:ascii="Times New Roman" w:hAnsi="Times New Roman" w:eastAsia="Times New Roman" w:cs="Times New Roman"/>
+          <w:b/>
+          <w:sz w:val="24"/>
+        </w:rPr>
+        <w:t xml:space="preserve">Currículo de formação da Polícia Militar da Bahia e racismo institucional</w:t>
+      </w:r>
+      <w:r>
+        <w:rPr>
+          <w:rFonts w:ascii="Times New Roman" w:hAnsi="Times New Roman" w:eastAsia="Times New Roman" w:cs="Times New Roman"/>
+          <w:sz w:val="24"/>
+        </w:rPr>
+        <w:t xml:space="preserve">: um estudo sobre as presenças e ausências da discussão étnico-racial. 2021. Dissertação (Mestrado em Ensino e Relações Étnico-Raciais) – Universidade Federal do Sul da Bahia, Porto Seguro, 2021.</w:t>
+      </w:r>
+    </w:p>
+    <w:p>
+      <w:pPr>
+        <w:pStyle w:val="BodyText"/>
+        <w:spacing w:line="240" w:lineRule="auto" w:before="0" w:after="240"/>
+        <w:jc w:val="left"/>
+      </w:pPr>
+      <w:r>
+        <w:rPr>
+          <w:rFonts w:ascii="Times New Roman" w:hAnsi="Times New Roman" w:eastAsia="Times New Roman" w:cs="Times New Roman"/>
+          <w:sz w:val="24"/>
+        </w:rPr>
+        <w:t xml:space="preserve">SINHORETTO, J.; BATITUCCI, E. Policiamento ostensivo e desigualdades em São Paulo e Minas Gerais.</w:t>
+      </w:r>
+      <w:r>
+        <w:rPr>
+          <w:rFonts w:ascii="Times New Roman" w:hAnsi="Times New Roman" w:eastAsia="Times New Roman" w:cs="Times New Roman"/>
+          <w:sz w:val="24"/>
+        </w:rPr>
+        <w:t xml:space="preserve"> </w:t>
+      </w:r>
+      <w:r>
+        <w:rPr>
+          <w:bCs/>
+          <w:rFonts w:ascii="Times New Roman" w:hAnsi="Times New Roman" w:eastAsia="Times New Roman" w:cs="Times New Roman"/>
+          <w:b/>
+          <w:sz w:val="24"/>
+        </w:rPr>
+        <w:t xml:space="preserve">Caderno CRH</w:t>
+      </w:r>
+      <w:r>
+        <w:rPr>
+          <w:rFonts w:ascii="Times New Roman" w:hAnsi="Times New Roman" w:eastAsia="Times New Roman" w:cs="Times New Roman"/>
+          <w:sz w:val="24"/>
+        </w:rPr>
+        <w:t xml:space="preserve">, Salvador, v. 36, p. 1-16, 2023. DOI: 10.9771/ccrh.v36i0.42433.</w:t>
+      </w:r>
+    </w:p>
+    <w:p>
+      <w:pPr>
+        <w:pStyle w:val="BodyText"/>
+        <w:spacing w:line="240" w:lineRule="auto" w:before="0" w:after="240"/>
+        <w:jc w:val="left"/>
+      </w:pPr>
+      <w:r>
+        <w:rPr>
+          <w:rFonts w:ascii="Times New Roman" w:hAnsi="Times New Roman" w:eastAsia="Times New Roman" w:cs="Times New Roman"/>
+          <w:sz w:val="24"/>
+        </w:rPr>
         <w:t xml:space="preserve">SKOLNICK, J. H.; BAYLEY, D. H.</w:t>
       </w:r>
       <w:r>
@@ -1920,6 +2466,43 @@
           <w:sz w:val="24"/>
         </w:rPr>
         <w:t xml:space="preserve">: questões e práticas através do mundo. São Paulo: Edusp, 2002.</w:t>
+      </w:r>
+    </w:p>
+    <w:p>
+      <w:pPr>
+        <w:pStyle w:val="BodyText"/>
+        <w:spacing w:line="240" w:lineRule="auto" w:before="0" w:after="240"/>
+        <w:jc w:val="left"/>
+      </w:pPr>
+      <w:r>
+        <w:rPr>
+          <w:rFonts w:ascii="Times New Roman" w:hAnsi="Times New Roman" w:eastAsia="Times New Roman" w:cs="Times New Roman"/>
+          <w:sz w:val="24"/>
+        </w:rPr>
+        <w:t xml:space="preserve">SOUZA, L. M. F.; FERREIRA, G. L.; SANTOS, M. C. R. C. F. Direito e meritocracia contra as cotas raciais: reajustes do dispositivo da branquitude.</w:t>
+      </w:r>
+      <w:r>
+        <w:rPr>
+          <w:rFonts w:ascii="Times New Roman" w:hAnsi="Times New Roman" w:eastAsia="Times New Roman" w:cs="Times New Roman"/>
+          <w:sz w:val="24"/>
+        </w:rPr>
+        <w:t xml:space="preserve"> </w:t>
+      </w:r>
+      <w:r>
+        <w:rPr>
+          <w:bCs/>
+          <w:rFonts w:ascii="Times New Roman" w:hAnsi="Times New Roman" w:eastAsia="Times New Roman" w:cs="Times New Roman"/>
+          <w:b/>
+          <w:sz w:val="24"/>
+        </w:rPr>
+        <w:t xml:space="preserve">Revista Eletrônica Espaço Acadêmico</w:t>
+      </w:r>
+      <w:r>
+        <w:rPr>
+          <w:rFonts w:ascii="Times New Roman" w:hAnsi="Times New Roman" w:eastAsia="Times New Roman" w:cs="Times New Roman"/>
+          <w:sz w:val="24"/>
+        </w:rPr>
+        <w:t xml:space="preserve">, v. 1, p. 35-45, 2021.</w:t>
       </w:r>
     </w:p>
     <w:p>
@@ -2099,7 +2682,7 @@
           <w:rFonts w:ascii="Times New Roman" w:hAnsi="Times New Roman" w:eastAsia="Times New Roman" w:cs="Times New Roman"/>
           <w:sz w:val="24"/>
         </w:rPr>
-        <w:t xml:space="preserve">Declara-se que, na elaboração deste anteprojeto, foi utilizada ferramenta de inteligência artificial generativa (Claude, Anthropic) como apoio à organização da estrutura, à busca bibliográfica e à revisão textual. Todo o conteúdo foi revisado, validado e reescrito pelo candidato, que assume integralmente a autoria e a responsabilidade pelo texto, conforme o item 5.2.3 do edital.</w:t>
+        <w:t xml:space="preserve">Declara-se que, na elaboração deste anteprojeto, foi utilizada ferramenta de inteligência artificial generativa (Claude, Anthropic) como apoio à organização da estrutura, ao levantamento bibliográfico e de dados secundários e à revisão textual. Todo o conteúdo foi revisado, validado e reescrito pelo candidato, que assume integralmente a autoria e a responsabilidade pelo texto, conforme o item 5.2.3 do edital.</w:t>
       </w:r>
     </w:p>
     <w:bookmarkEnd w:id="27"/>

</xml_diff>

<commit_message>
Formata quadros com sombreamento e substitui travessões nos apostos
Co-Authored-By: Claude Opus 5.5 <noreply@anthropic.com>
Claude-Session: https://claude.ai/code/session_012kDm3eDcjoxunS5BBjgPmo
</commit_message>
<xml_diff>
--- a/entregas/anteprojeto.docx
+++ b/entregas/anteprojeto.docx
@@ -170,7 +170,7 @@
           <w:rFonts w:ascii="Times New Roman" w:hAnsi="Times New Roman" w:eastAsia="Times New Roman" w:cs="Times New Roman"/>
           <w:sz w:val="24"/>
         </w:rPr>
-        <w:t xml:space="preserve">Ocorre que, na prática, a gestão desses programas apoia-se sobretudo em metas quantitativas, como a redução dos Crimes Violentos Letais e Intencionais (CVLI) e dos Crimes Violentos contra o Patrimônio (CVP), em registros de produtividade e em premiações por desempenho. Em outras palavras, tais instrumentos dizem muito sobre o que a polícia faz, mas pouco sobre como ela trata as pessoas com quem interage — e nada sobre quem, racialmente, suporta os custos dessa atuação. A aparência técnica e neutra desses controles pode, assim, encobrir a reprodução do racismo institucional, à semelhança do que Souza, Ferreira e Santos (2021) identificam no campo jurídico como dispositivo da branquitude.</w:t>
+        <w:t xml:space="preserve">Ocorre que, na prática, a gestão desses programas apoia-se sobretudo em metas quantitativas, como a redução dos Crimes Violentos Letais e Intencionais (CVLI) e dos Crimes Violentos contra o Patrimônio (CVP), em registros de produtividade e em premiações por desempenho. Em outras palavras, tais instrumentos dizem muito sobre o que a polícia faz, mas pouco sobre como ela trata as pessoas com quem interage, e nada sobre quem, racialmente, suporta os custos dessa atuação. A aparência técnica e neutra desses controles pode, assim, encobrir a reprodução do racismo institucional, à semelhança do que Souza, Ferreira e Santos (2021) identificam no campo jurídico como dispositivo da branquitude.</w:t>
       </w:r>
     </w:p>
     <w:p>
@@ -231,7 +231,7 @@
           <w:rFonts w:ascii="Times New Roman" w:hAnsi="Times New Roman" w:eastAsia="Times New Roman" w:cs="Times New Roman"/>
           <w:sz w:val="24"/>
         </w:rPr>
-        <w:t xml:space="preserve">Do ponto de vista científico, o estudo desloca o debate da eficácia gerencial — a polícia entrega resultados? — para o problema da legitimação do poder — a polícia é reconhecida como justa e passível de controle pelos grupos que mais sofrem sua ação? Para tanto, articula a teoria da legitimidade procedimental, a literatura brasileira sobre controle da atividade policial e os estudos críticos sobre raça e Estado. Além disso, sua originalidade reside em tratar o controle como sistema, examinando em conjunto corregedoria, Ministério Público, ouvidoria, conselhos comunitários e imprensa, e em fazê-lo numa região interiorana marcada pelo turismo, por periferias urbanas negras e pela presença de povos indígenas e comunidades quilombolas, contexto pouco contemplado por uma produção concentrada nas capitais.</w:t>
+        <w:t xml:space="preserve">Do ponto de vista científico, o estudo desloca o debate da eficácia gerencial, isto é, se a polícia entrega resultados, para o problema da legitimação do poder, ou seja, se a polícia é reconhecida como justa e passível de controle pelos grupos que mais sofrem sua ação. Para tanto, articula a teoria da legitimidade procedimental, a literatura brasileira sobre controle da atividade policial e os estudos críticos sobre raça e Estado. Além disso, sua originalidade reside em tratar o controle como sistema, examinando em conjunto corregedoria, Ministério Público, ouvidoria, conselhos comunitários e imprensa, e em fazê-lo numa região interiorana marcada pelo turismo, por periferias urbanas negras e pela presença de povos indígenas e comunidades quilombolas, contexto pouco contemplado por uma produção concentrada nas capitais.</w:t>
       </w:r>
     </w:p>
     <w:p>
@@ -344,7 +344,7 @@
           <w:rFonts w:ascii="Times New Roman" w:hAnsi="Times New Roman" w:eastAsia="Times New Roman" w:cs="Times New Roman"/>
           <w:sz w:val="24"/>
         </w:rPr>
-        <w:t xml:space="preserve">mapear as instâncias de controle que incidem sobre o policiamento comunitário na região — Corregedoria da Polícia Militar, Ministério Público, Ouvidoria, conselhos comunitários de segurança e imprensa local —, identificando suas atribuições, fluxos e capacidades;</w:t>
+        <w:t xml:space="preserve">mapear as instâncias de controle que incidem sobre o policiamento comunitário na região, como a Corregedoria da Polícia Militar, o Ministério Público, a Ouvidoria, os conselhos comunitários de segurança e a imprensa local, identificando suas atribuições, fluxos e capacidades;</w:t>
       </w:r>
     </w:p>
     <w:p>
@@ -524,7 +524,7 @@
           <w:rFonts w:ascii="Times New Roman" w:hAnsi="Times New Roman" w:eastAsia="Times New Roman" w:cs="Times New Roman"/>
           <w:sz w:val="24"/>
         </w:rPr>
-        <w:t xml:space="preserve">No terceiro eixo, Sapori (2007) discute a adoção da gestão por resultados na segurança pública brasileira, e Santos e Gomes (2021), em revisão sistemática, mostram que não há metodologia única para avaliar o desempenho policial, devendo a mensuração corresponder aos objetivos de cada organização. Complementarmente, Lui e Sales (2024) mapeiam a agenda do policiamento baseado em evidências. Quanto ao policiamento comunitário, Muniz e Paes-Machado (2010) problematizam as experiências baianas, e Ferreira, Rossoni e Oliveira (2022) demonstram que esse modelo, incluindo as Bases Comunitárias da Bahia, é atravessado por quatro lógicas institucionais — militar, profissional, gerencial e comunitária —, cuja tensão ajuda a explicar por que as metas gerenciais frequentemente se sobrepõem à proximidade. A participação social, ademais, encontra limites na própria cultura policial: ao estudar os conselhos comunitários de segurança paulistas, Bueno, Lima e Teixeira (2016) mostram que o cidadão tende a ser tratado mais como demandante do que como sujeito da política.</w:t>
+        <w:t xml:space="preserve">No terceiro eixo, Sapori (2007) discute a adoção da gestão por resultados na segurança pública brasileira, e Santos e Gomes (2021), em revisão sistemática, mostram que não há metodologia única para avaliar o desempenho policial, devendo a mensuração corresponder aos objetivos de cada organização. Complementarmente, Lui e Sales (2024) mapeiam a agenda do policiamento baseado em evidências. Quanto ao policiamento comunitário, Muniz e Paes-Machado (2010) problematizam as experiências baianas, e Ferreira, Rossoni e Oliveira (2022) demonstram que esse modelo, incluindo as Bases Comunitárias da Bahia, é atravessado por quatro lógicas institucionais, a militar, a profissional, a gerencial e a comunitária, cuja tensão ajuda a explicar por que as metas gerenciais frequentemente se sobrepõem à proximidade. A participação social, ademais, encontra limites na própria cultura policial: ao estudar os conselhos comunitários de segurança paulistas, Bueno, Lima e Teixeira (2016) mostram que o cidadão tende a ser tratado mais como demandante do que como sujeito da política.</w:t>
       </w:r>
     </w:p>
     <w:p>
@@ -589,33 +589,72 @@
         <w:t xml:space="preserve">Trata-se de pesquisa de abordagem qualitativa, com apoio quantitativo descritivo, delineada como estudo de casos múltiplos em três recortes territoriais do Extremo Sul da Bahia. O caso principal é Porto Seguro, onde funciona a Base Comunitária de Segurança do Baianão/Frei Calixto e que registra a maior taxa de mortes por intervenção policial do país entre os de mais de 100 mil habitantes. Eunápolis, segunda colocada nesse indicador e sem base comunitária identificada, funcionará como caso de contraste. O terceiro recorte abrange comunidades quilombolas certificadas pela Fundação Cultural Palmares nos municípios de Caravelas e Nova Viçosa, como Volta Miúda e Helvécia, permitindo examinar a relação entre polícia e comunidades tradicionais. O quadro a seguir relaciona cada objetivo específico às fontes, aos instrumentos e à forma de análise.</w:t>
       </w:r>
     </w:p>
+    <w:p>
+      <w:pPr>
+        <w:pStyle w:val="Legenda"/>
+        <w:spacing w:line="240" w:lineRule="auto" w:before="120" w:after="80"/>
+        <w:ind/>
+        <w:jc w:val="center"/>
+      </w:pPr>
+      <w:r>
+        <w:rPr>
+          <w:rFonts w:ascii="Times New Roman" w:hAnsi="Times New Roman" w:eastAsia="Times New Roman" w:cs="Times New Roman"/>
+          <w:b/>
+          <w:sz w:val="20"/>
+        </w:rPr>
+        <w:t xml:space="preserve">Quadro 1 – Relação entre objetivos, fontes, instrumentos e análise</w:t>
+      </w:r>
+    </w:p>
     <w:tbl>
       <w:tblPr>
-        <w:tblW w:type="pct" w:w="5000"/>
+        <w:tblLayout w:type="fixed"/>
         <w:tblLook w:firstRow="1" w:lastRow="0" w:firstColumn="0" w:lastColumn="0" w:noHBand="0" w:noVBand="0" w:val="0020"/>
-        <w:jc w:val="start"/>
+        <w:jc w:val="center"/>
+        <w:tblBorders>
+          <w:top w:val="single" w:sz="4" w:color="808080"/>
+          <w:left w:val="single" w:sz="4" w:color="808080"/>
+          <w:bottom w:val="single" w:sz="4" w:color="808080"/>
+          <w:right w:val="single" w:sz="4" w:color="808080"/>
+          <w:insideH w:val="single" w:sz="4" w:color="808080"/>
+          <w:insideV w:val="single" w:sz="4" w:color="808080"/>
+        </w:tblBorders>
+        <w:tblW w:w="9639" w:type="dxa"/>
+        <w:tblLayout w:type="fixed"/>
       </w:tblPr>
       <w:tblGrid>
-        <w:gridCol w:w="1980"/>
-        <w:gridCol w:w="1980"/>
-        <w:gridCol w:w="1980"/>
-        <w:gridCol w:w="1980"/>
+        <w:gridCol w:w="2041"/>
+        <w:gridCol w:w="3175"/>
+        <w:gridCol w:w="2268"/>
+        <w:gridCol w:w="2154"/>
       </w:tblGrid>
       <w:tr>
         <w:trPr>
           <w:tblHeader w:val="true"/>
+          <w:cantSplit/>
+          <w:tblHeader/>
         </w:trPr>
         <w:tc>
-          <w:tcPr/>
+          <w:tcPr>
+            <w:tcW w:type="dxa" w:w="2041"/>
+            <w:tcMar>
+              <w:top w:w="70" w:type="dxa"/>
+              <w:bottom w:w="70" w:type="dxa"/>
+              <w:left w:w="100" w:type="dxa"/>
+              <w:right w:w="100" w:type="dxa"/>
+            </w:tcMar>
+            <w:vAlign w:val="center"/>
+            <w:shd w:val="clear" w:color="auto" w:fill="BFBFBF"/>
+          </w:tcPr>
           <w:p>
             <w:pPr>
               <w:pStyle w:val="Compact"/>
-              <w:spacing w:line="240" w:lineRule="auto"/>
-              <w:jc w:val="left"/>
+              <w:spacing w:line="240" w:lineRule="auto" w:after="0"/>
+              <w:jc w:val="center"/>
             </w:pPr>
             <w:r>
               <w:rPr>
                 <w:rFonts w:ascii="Times New Roman" w:hAnsi="Times New Roman" w:eastAsia="Times New Roman" w:cs="Times New Roman"/>
+                <w:b/>
                 <w:sz w:val="20"/>
               </w:rPr>
               <w:t xml:space="preserve">Objetivo</w:t>
@@ -623,16 +662,27 @@
           </w:p>
         </w:tc>
         <w:tc>
-          <w:tcPr/>
+          <w:tcPr>
+            <w:tcW w:type="dxa" w:w="3175"/>
+            <w:tcMar>
+              <w:top w:w="70" w:type="dxa"/>
+              <w:bottom w:w="70" w:type="dxa"/>
+              <w:left w:w="100" w:type="dxa"/>
+              <w:right w:w="100" w:type="dxa"/>
+            </w:tcMar>
+            <w:vAlign w:val="center"/>
+            <w:shd w:val="clear" w:color="auto" w:fill="BFBFBF"/>
+          </w:tcPr>
           <w:p>
             <w:pPr>
               <w:pStyle w:val="Compact"/>
-              <w:spacing w:line="240" w:lineRule="auto"/>
-              <w:jc w:val="left"/>
+              <w:spacing w:line="240" w:lineRule="auto" w:after="0"/>
+              <w:jc w:val="center"/>
             </w:pPr>
             <w:r>
               <w:rPr>
                 <w:rFonts w:ascii="Times New Roman" w:hAnsi="Times New Roman" w:eastAsia="Times New Roman" w:cs="Times New Roman"/>
+                <w:b/>
                 <w:sz w:val="20"/>
               </w:rPr>
               <w:t xml:space="preserve">Participantes e fontes</w:t>
@@ -640,16 +690,27 @@
           </w:p>
         </w:tc>
         <w:tc>
-          <w:tcPr/>
+          <w:tcPr>
+            <w:tcW w:type="dxa" w:w="2268"/>
+            <w:tcMar>
+              <w:top w:w="70" w:type="dxa"/>
+              <w:bottom w:w="70" w:type="dxa"/>
+              <w:left w:w="100" w:type="dxa"/>
+              <w:right w:w="100" w:type="dxa"/>
+            </w:tcMar>
+            <w:vAlign w:val="center"/>
+            <w:shd w:val="clear" w:color="auto" w:fill="BFBFBF"/>
+          </w:tcPr>
           <w:p>
             <w:pPr>
               <w:pStyle w:val="Compact"/>
-              <w:spacing w:line="240" w:lineRule="auto"/>
-              <w:jc w:val="left"/>
+              <w:spacing w:line="240" w:lineRule="auto" w:after="0"/>
+              <w:jc w:val="center"/>
             </w:pPr>
             <w:r>
               <w:rPr>
                 <w:rFonts w:ascii="Times New Roman" w:hAnsi="Times New Roman" w:eastAsia="Times New Roman" w:cs="Times New Roman"/>
+                <w:b/>
                 <w:sz w:val="20"/>
               </w:rPr>
               <w:t xml:space="preserve">Instrumento</w:t>
@@ -657,16 +718,27 @@
           </w:p>
         </w:tc>
         <w:tc>
-          <w:tcPr/>
+          <w:tcPr>
+            <w:tcW w:type="dxa" w:w="2154"/>
+            <w:tcMar>
+              <w:top w:w="70" w:type="dxa"/>
+              <w:bottom w:w="70" w:type="dxa"/>
+              <w:left w:w="100" w:type="dxa"/>
+              <w:right w:w="100" w:type="dxa"/>
+            </w:tcMar>
+            <w:vAlign w:val="center"/>
+            <w:shd w:val="clear" w:color="auto" w:fill="BFBFBF"/>
+          </w:tcPr>
           <w:p>
             <w:pPr>
               <w:pStyle w:val="Compact"/>
-              <w:spacing w:line="240" w:lineRule="auto"/>
-              <w:jc w:val="left"/>
+              <w:spacing w:line="240" w:lineRule="auto" w:after="0"/>
+              <w:jc w:val="center"/>
             </w:pPr>
             <w:r>
               <w:rPr>
                 <w:rFonts w:ascii="Times New Roman" w:hAnsi="Times New Roman" w:eastAsia="Times New Roman" w:cs="Times New Roman"/>
+                <w:b/>
                 <w:sz w:val="20"/>
               </w:rPr>
               <w:t xml:space="preserve">Análise</w:t>
@@ -675,17 +747,31 @@
         </w:tc>
       </w:tr>
       <w:tr>
+        <w:trPr>
+          <w:cantSplit/>
+        </w:trPr>
         <w:tc>
-          <w:tcPr/>
+          <w:tcPr>
+            <w:tcW w:type="dxa" w:w="2041"/>
+            <w:tcMar>
+              <w:top w:w="70" w:type="dxa"/>
+              <w:bottom w:w="70" w:type="dxa"/>
+              <w:left w:w="100" w:type="dxa"/>
+              <w:right w:w="100" w:type="dxa"/>
+            </w:tcMar>
+            <w:vAlign w:val="center"/>
+            <w:shd w:val="clear" w:color="auto" w:fill="FFFFFF"/>
+          </w:tcPr>
           <w:p>
             <w:pPr>
               <w:pStyle w:val="Compact"/>
-              <w:spacing w:line="240" w:lineRule="auto"/>
+              <w:spacing w:line="240" w:lineRule="auto" w:after="0"/>
               <w:jc w:val="left"/>
             </w:pPr>
             <w:r>
               <w:rPr>
                 <w:rFonts w:ascii="Times New Roman" w:hAnsi="Times New Roman" w:eastAsia="Times New Roman" w:cs="Times New Roman"/>
+                <w:b/>
                 <w:sz w:val="20"/>
               </w:rPr>
               <w:t xml:space="preserve">a) Mapear as instâncias de controle</w:t>
@@ -693,11 +779,21 @@
           </w:p>
         </w:tc>
         <w:tc>
-          <w:tcPr/>
+          <w:tcPr>
+            <w:tcW w:type="dxa" w:w="3175"/>
+            <w:tcMar>
+              <w:top w:w="70" w:type="dxa"/>
+              <w:bottom w:w="70" w:type="dxa"/>
+              <w:left w:w="100" w:type="dxa"/>
+              <w:right w:w="100" w:type="dxa"/>
+            </w:tcMar>
+            <w:vAlign w:val="center"/>
+            <w:shd w:val="clear" w:color="auto" w:fill="FFFFFF"/>
+          </w:tcPr>
           <w:p>
             <w:pPr>
               <w:pStyle w:val="Compact"/>
-              <w:spacing w:line="240" w:lineRule="auto"/>
+              <w:spacing w:line="240" w:lineRule="auto" w:after="0"/>
               <w:jc w:val="left"/>
             </w:pPr>
             <w:r>
@@ -710,11 +806,21 @@
           </w:p>
         </w:tc>
         <w:tc>
-          <w:tcPr/>
+          <w:tcPr>
+            <w:tcW w:type="dxa" w:w="2268"/>
+            <w:tcMar>
+              <w:top w:w="70" w:type="dxa"/>
+              <w:bottom w:w="70" w:type="dxa"/>
+              <w:left w:w="100" w:type="dxa"/>
+              <w:right w:w="100" w:type="dxa"/>
+            </w:tcMar>
+            <w:vAlign w:val="center"/>
+            <w:shd w:val="clear" w:color="auto" w:fill="FFFFFF"/>
+          </w:tcPr>
           <w:p>
             <w:pPr>
               <w:pStyle w:val="Compact"/>
-              <w:spacing w:line="240" w:lineRule="auto"/>
+              <w:spacing w:line="240" w:lineRule="auto" w:after="0"/>
               <w:jc w:val="left"/>
             </w:pPr>
             <w:r>
@@ -727,11 +833,21 @@
           </w:p>
         </w:tc>
         <w:tc>
-          <w:tcPr/>
+          <w:tcPr>
+            <w:tcW w:type="dxa" w:w="2154"/>
+            <w:tcMar>
+              <w:top w:w="70" w:type="dxa"/>
+              <w:bottom w:w="70" w:type="dxa"/>
+              <w:left w:w="100" w:type="dxa"/>
+              <w:right w:w="100" w:type="dxa"/>
+            </w:tcMar>
+            <w:vAlign w:val="center"/>
+            <w:shd w:val="clear" w:color="auto" w:fill="FFFFFF"/>
+          </w:tcPr>
           <w:p>
             <w:pPr>
               <w:pStyle w:val="Compact"/>
-              <w:spacing w:line="240" w:lineRule="auto"/>
+              <w:spacing w:line="240" w:lineRule="auto" w:after="0"/>
               <w:jc w:val="left"/>
             </w:pPr>
             <w:r>
@@ -745,17 +861,31 @@
         </w:tc>
       </w:tr>
       <w:tr>
+        <w:trPr>
+          <w:cantSplit/>
+        </w:trPr>
         <w:tc>
-          <w:tcPr/>
+          <w:tcPr>
+            <w:tcW w:type="dxa" w:w="2041"/>
+            <w:tcMar>
+              <w:top w:w="70" w:type="dxa"/>
+              <w:bottom w:w="70" w:type="dxa"/>
+              <w:left w:w="100" w:type="dxa"/>
+              <w:right w:w="100" w:type="dxa"/>
+            </w:tcMar>
+            <w:vAlign w:val="center"/>
+            <w:shd w:val="clear" w:color="auto" w:fill="EDEDED"/>
+          </w:tcPr>
           <w:p>
             <w:pPr>
               <w:pStyle w:val="Compact"/>
-              <w:spacing w:line="240" w:lineRule="auto"/>
+              <w:spacing w:line="240" w:lineRule="auto" w:after="0"/>
               <w:jc w:val="left"/>
             </w:pPr>
             <w:r>
               <w:rPr>
                 <w:rFonts w:ascii="Times New Roman" w:hAnsi="Times New Roman" w:eastAsia="Times New Roman" w:cs="Times New Roman"/>
+                <w:b/>
                 <w:sz w:val="20"/>
               </w:rPr>
               <w:t xml:space="preserve">b) Examinar os indicadores do Bahia pela Paz</w:t>
@@ -763,11 +893,21 @@
           </w:p>
         </w:tc>
         <w:tc>
-          <w:tcPr/>
+          <w:tcPr>
+            <w:tcW w:type="dxa" w:w="3175"/>
+            <w:tcMar>
+              <w:top w:w="70" w:type="dxa"/>
+              <w:bottom w:w="70" w:type="dxa"/>
+              <w:left w:w="100" w:type="dxa"/>
+              <w:right w:w="100" w:type="dxa"/>
+            </w:tcMar>
+            <w:vAlign w:val="center"/>
+            <w:shd w:val="clear" w:color="auto" w:fill="EDEDED"/>
+          </w:tcPr>
           <w:p>
             <w:pPr>
               <w:pStyle w:val="Compact"/>
-              <w:spacing w:line="240" w:lineRule="auto"/>
+              <w:spacing w:line="240" w:lineRule="auto" w:after="0"/>
               <w:jc w:val="left"/>
             </w:pPr>
             <w:r>
@@ -780,11 +920,21 @@
           </w:p>
         </w:tc>
         <w:tc>
-          <w:tcPr/>
+          <w:tcPr>
+            <w:tcW w:type="dxa" w:w="2268"/>
+            <w:tcMar>
+              <w:top w:w="70" w:type="dxa"/>
+              <w:bottom w:w="70" w:type="dxa"/>
+              <w:left w:w="100" w:type="dxa"/>
+              <w:right w:w="100" w:type="dxa"/>
+            </w:tcMar>
+            <w:vAlign w:val="center"/>
+            <w:shd w:val="clear" w:color="auto" w:fill="EDEDED"/>
+          </w:tcPr>
           <w:p>
             <w:pPr>
               <w:pStyle w:val="Compact"/>
-              <w:spacing w:line="240" w:lineRule="auto"/>
+              <w:spacing w:line="240" w:lineRule="auto" w:after="0"/>
               <w:jc w:val="left"/>
             </w:pPr>
             <w:r>
@@ -797,11 +947,21 @@
           </w:p>
         </w:tc>
         <w:tc>
-          <w:tcPr/>
+          <w:tcPr>
+            <w:tcW w:type="dxa" w:w="2154"/>
+            <w:tcMar>
+              <w:top w:w="70" w:type="dxa"/>
+              <w:bottom w:w="70" w:type="dxa"/>
+              <w:left w:w="100" w:type="dxa"/>
+              <w:right w:w="100" w:type="dxa"/>
+            </w:tcMar>
+            <w:vAlign w:val="center"/>
+            <w:shd w:val="clear" w:color="auto" w:fill="EDEDED"/>
+          </w:tcPr>
           <w:p>
             <w:pPr>
               <w:pStyle w:val="Compact"/>
-              <w:spacing w:line="240" w:lineRule="auto"/>
+              <w:spacing w:line="240" w:lineRule="auto" w:after="0"/>
               <w:jc w:val="left"/>
             </w:pPr>
             <w:r>
@@ -815,17 +975,31 @@
         </w:tc>
       </w:tr>
       <w:tr>
+        <w:trPr>
+          <w:cantSplit/>
+        </w:trPr>
         <w:tc>
-          <w:tcPr/>
+          <w:tcPr>
+            <w:tcW w:type="dxa" w:w="2041"/>
+            <w:tcMar>
+              <w:top w:w="70" w:type="dxa"/>
+              <w:bottom w:w="70" w:type="dxa"/>
+              <w:left w:w="100" w:type="dxa"/>
+              <w:right w:w="100" w:type="dxa"/>
+            </w:tcMar>
+            <w:vAlign w:val="center"/>
+            <w:shd w:val="clear" w:color="auto" w:fill="FFFFFF"/>
+          </w:tcPr>
           <w:p>
             <w:pPr>
               <w:pStyle w:val="Compact"/>
-              <w:spacing w:line="240" w:lineRule="auto"/>
+              <w:spacing w:line="240" w:lineRule="auto" w:after="0"/>
               <w:jc w:val="left"/>
             </w:pPr>
             <w:r>
               <w:rPr>
                 <w:rFonts w:ascii="Times New Roman" w:hAnsi="Times New Roman" w:eastAsia="Times New Roman" w:cs="Times New Roman"/>
+                <w:b/>
                 <w:sz w:val="20"/>
               </w:rPr>
               <w:t xml:space="preserve">c) Compreender as percepções dos atores</w:t>
@@ -833,11 +1007,21 @@
           </w:p>
         </w:tc>
         <w:tc>
-          <w:tcPr/>
+          <w:tcPr>
+            <w:tcW w:type="dxa" w:w="3175"/>
+            <w:tcMar>
+              <w:top w:w="70" w:type="dxa"/>
+              <w:bottom w:w="70" w:type="dxa"/>
+              <w:left w:w="100" w:type="dxa"/>
+              <w:right w:w="100" w:type="dxa"/>
+            </w:tcMar>
+            <w:vAlign w:val="center"/>
+            <w:shd w:val="clear" w:color="auto" w:fill="FFFFFF"/>
+          </w:tcPr>
           <w:p>
             <w:pPr>
               <w:pStyle w:val="Compact"/>
-              <w:spacing w:line="240" w:lineRule="auto"/>
+              <w:spacing w:line="240" w:lineRule="auto" w:after="0"/>
               <w:jc w:val="left"/>
             </w:pPr>
             <w:r>
@@ -850,11 +1034,21 @@
           </w:p>
         </w:tc>
         <w:tc>
-          <w:tcPr/>
+          <w:tcPr>
+            <w:tcW w:type="dxa" w:w="2268"/>
+            <w:tcMar>
+              <w:top w:w="70" w:type="dxa"/>
+              <w:bottom w:w="70" w:type="dxa"/>
+              <w:left w:w="100" w:type="dxa"/>
+              <w:right w:w="100" w:type="dxa"/>
+            </w:tcMar>
+            <w:vAlign w:val="center"/>
+            <w:shd w:val="clear" w:color="auto" w:fill="FFFFFF"/>
+          </w:tcPr>
           <w:p>
             <w:pPr>
               <w:pStyle w:val="Compact"/>
-              <w:spacing w:line="240" w:lineRule="auto"/>
+              <w:spacing w:line="240" w:lineRule="auto" w:after="0"/>
               <w:jc w:val="left"/>
             </w:pPr>
             <w:r>
@@ -867,11 +1061,21 @@
           </w:p>
         </w:tc>
         <w:tc>
-          <w:tcPr/>
+          <w:tcPr>
+            <w:tcW w:type="dxa" w:w="2154"/>
+            <w:tcMar>
+              <w:top w:w="70" w:type="dxa"/>
+              <w:bottom w:w="70" w:type="dxa"/>
+              <w:left w:w="100" w:type="dxa"/>
+              <w:right w:w="100" w:type="dxa"/>
+            </w:tcMar>
+            <w:vAlign w:val="center"/>
+            <w:shd w:val="clear" w:color="auto" w:fill="FFFFFF"/>
+          </w:tcPr>
           <w:p>
             <w:pPr>
               <w:pStyle w:val="Compact"/>
-              <w:spacing w:line="240" w:lineRule="auto"/>
+              <w:spacing w:line="240" w:lineRule="auto" w:after="0"/>
               <w:jc w:val="left"/>
             </w:pPr>
             <w:r>
@@ -885,17 +1089,31 @@
         </w:tc>
       </w:tr>
       <w:tr>
+        <w:trPr>
+          <w:cantSplit/>
+        </w:trPr>
         <w:tc>
-          <w:tcPr/>
+          <w:tcPr>
+            <w:tcW w:type="dxa" w:w="2041"/>
+            <w:tcMar>
+              <w:top w:w="70" w:type="dxa"/>
+              <w:bottom w:w="70" w:type="dxa"/>
+              <w:left w:w="100" w:type="dxa"/>
+              <w:right w:w="100" w:type="dxa"/>
+            </w:tcMar>
+            <w:vAlign w:val="center"/>
+            <w:shd w:val="clear" w:color="auto" w:fill="EDEDED"/>
+          </w:tcPr>
           <w:p>
             <w:pPr>
               <w:pStyle w:val="Compact"/>
-              <w:spacing w:line="240" w:lineRule="auto"/>
+              <w:spacing w:line="240" w:lineRule="auto" w:after="0"/>
               <w:jc w:val="left"/>
             </w:pPr>
             <w:r>
               <w:rPr>
                 <w:rFonts w:ascii="Times New Roman" w:hAnsi="Times New Roman" w:eastAsia="Times New Roman" w:cs="Times New Roman"/>
+                <w:b/>
                 <w:sz w:val="20"/>
               </w:rPr>
               <w:t xml:space="preserve">d) Verificar variações por raça, gênero e território</w:t>
@@ -903,11 +1121,21 @@
           </w:p>
         </w:tc>
         <w:tc>
-          <w:tcPr/>
+          <w:tcPr>
+            <w:tcW w:type="dxa" w:w="3175"/>
+            <w:tcMar>
+              <w:top w:w="70" w:type="dxa"/>
+              <w:bottom w:w="70" w:type="dxa"/>
+              <w:left w:w="100" w:type="dxa"/>
+              <w:right w:w="100" w:type="dxa"/>
+            </w:tcMar>
+            <w:vAlign w:val="center"/>
+            <w:shd w:val="clear" w:color="auto" w:fill="EDEDED"/>
+          </w:tcPr>
           <w:p>
             <w:pPr>
               <w:pStyle w:val="Compact"/>
-              <w:spacing w:line="240" w:lineRule="auto"/>
+              <w:spacing w:line="240" w:lineRule="auto" w:after="0"/>
               <w:jc w:val="left"/>
             </w:pPr>
             <w:r>
@@ -920,11 +1148,21 @@
           </w:p>
         </w:tc>
         <w:tc>
-          <w:tcPr/>
+          <w:tcPr>
+            <w:tcW w:type="dxa" w:w="2268"/>
+            <w:tcMar>
+              <w:top w:w="70" w:type="dxa"/>
+              <w:bottom w:w="70" w:type="dxa"/>
+              <w:left w:w="100" w:type="dxa"/>
+              <w:right w:w="100" w:type="dxa"/>
+            </w:tcMar>
+            <w:vAlign w:val="center"/>
+            <w:shd w:val="clear" w:color="auto" w:fill="EDEDED"/>
+          </w:tcPr>
           <w:p>
             <w:pPr>
               <w:pStyle w:val="Compact"/>
-              <w:spacing w:line="240" w:lineRule="auto"/>
+              <w:spacing w:line="240" w:lineRule="auto" w:after="0"/>
               <w:jc w:val="left"/>
             </w:pPr>
             <w:r>
@@ -937,11 +1175,21 @@
           </w:p>
         </w:tc>
         <w:tc>
-          <w:tcPr/>
+          <w:tcPr>
+            <w:tcW w:type="dxa" w:w="2154"/>
+            <w:tcMar>
+              <w:top w:w="70" w:type="dxa"/>
+              <w:bottom w:w="70" w:type="dxa"/>
+              <w:left w:w="100" w:type="dxa"/>
+              <w:right w:w="100" w:type="dxa"/>
+            </w:tcMar>
+            <w:vAlign w:val="center"/>
+            <w:shd w:val="clear" w:color="auto" w:fill="EDEDED"/>
+          </w:tcPr>
           <w:p>
             <w:pPr>
               <w:pStyle w:val="Compact"/>
-              <w:spacing w:line="240" w:lineRule="auto"/>
+              <w:spacing w:line="240" w:lineRule="auto" w:after="0"/>
               <w:jc w:val="left"/>
             </w:pPr>
             <w:r>
@@ -955,17 +1203,31 @@
         </w:tc>
       </w:tr>
       <w:tr>
+        <w:trPr>
+          <w:cantSplit/>
+        </w:trPr>
         <w:tc>
-          <w:tcPr/>
+          <w:tcPr>
+            <w:tcW w:type="dxa" w:w="2041"/>
+            <w:tcMar>
+              <w:top w:w="70" w:type="dxa"/>
+              <w:bottom w:w="70" w:type="dxa"/>
+              <w:left w:w="100" w:type="dxa"/>
+              <w:right w:w="100" w:type="dxa"/>
+            </w:tcMar>
+            <w:vAlign w:val="center"/>
+            <w:shd w:val="clear" w:color="auto" w:fill="FFFFFF"/>
+          </w:tcPr>
           <w:p>
             <w:pPr>
               <w:pStyle w:val="Compact"/>
-              <w:spacing w:line="240" w:lineRule="auto"/>
+              <w:spacing w:line="240" w:lineRule="auto" w:after="0"/>
               <w:jc w:val="left"/>
             </w:pPr>
             <w:r>
               <w:rPr>
                 <w:rFonts w:ascii="Times New Roman" w:hAnsi="Times New Roman" w:eastAsia="Times New Roman" w:cs="Times New Roman"/>
+                <w:b/>
                 <w:sz w:val="20"/>
               </w:rPr>
               <w:t xml:space="preserve">e) Propor a matriz de indicadores</w:t>
@@ -973,11 +1235,21 @@
           </w:p>
         </w:tc>
         <w:tc>
-          <w:tcPr/>
+          <w:tcPr>
+            <w:tcW w:type="dxa" w:w="3175"/>
+            <w:tcMar>
+              <w:top w:w="70" w:type="dxa"/>
+              <w:bottom w:w="70" w:type="dxa"/>
+              <w:left w:w="100" w:type="dxa"/>
+              <w:right w:w="100" w:type="dxa"/>
+            </w:tcMar>
+            <w:vAlign w:val="center"/>
+            <w:shd w:val="clear" w:color="auto" w:fill="FFFFFF"/>
+          </w:tcPr>
           <w:p>
             <w:pPr>
               <w:pStyle w:val="Compact"/>
-              <w:spacing w:line="240" w:lineRule="auto"/>
+              <w:spacing w:line="240" w:lineRule="auto" w:after="0"/>
               <w:jc w:val="left"/>
             </w:pPr>
             <w:r>
@@ -990,11 +1262,21 @@
           </w:p>
         </w:tc>
         <w:tc>
-          <w:tcPr/>
+          <w:tcPr>
+            <w:tcW w:type="dxa" w:w="2268"/>
+            <w:tcMar>
+              <w:top w:w="70" w:type="dxa"/>
+              <w:bottom w:w="70" w:type="dxa"/>
+              <w:left w:w="100" w:type="dxa"/>
+              <w:right w:w="100" w:type="dxa"/>
+            </w:tcMar>
+            <w:vAlign w:val="center"/>
+            <w:shd w:val="clear" w:color="auto" w:fill="FFFFFF"/>
+          </w:tcPr>
           <w:p>
             <w:pPr>
               <w:pStyle w:val="Compact"/>
-              <w:spacing w:line="240" w:lineRule="auto"/>
+              <w:spacing w:line="240" w:lineRule="auto" w:after="0"/>
               <w:jc w:val="left"/>
             </w:pPr>
             <w:r>
@@ -1007,11 +1289,21 @@
           </w:p>
         </w:tc>
         <w:tc>
-          <w:tcPr/>
+          <w:tcPr>
+            <w:tcW w:type="dxa" w:w="2154"/>
+            <w:tcMar>
+              <w:top w:w="70" w:type="dxa"/>
+              <w:bottom w:w="70" w:type="dxa"/>
+              <w:left w:w="100" w:type="dxa"/>
+              <w:right w:w="100" w:type="dxa"/>
+            </w:tcMar>
+            <w:vAlign w:val="center"/>
+            <w:shd w:val="clear" w:color="auto" w:fill="FFFFFF"/>
+          </w:tcPr>
           <w:p>
             <w:pPr>
               <w:pStyle w:val="Compact"/>
-              <w:spacing w:line="240" w:lineRule="auto"/>
+              <w:spacing w:line="240" w:lineRule="auto" w:after="0"/>
               <w:jc w:val="left"/>
             </w:pPr>
             <w:r>
@@ -1027,6 +1319,22 @@
     </w:tbl>
     <w:p>
       <w:pPr>
+        <w:pStyle w:val="Fonte"/>
+        <w:spacing w:line="240" w:lineRule="auto" w:before="40" w:after="240"/>
+        <w:ind/>
+        <w:jc w:val="left"/>
+      </w:pPr>
+      <w:r>
+        <w:rPr>
+          <w:rFonts w:ascii="Times New Roman" w:hAnsi="Times New Roman" w:eastAsia="Times New Roman" w:cs="Times New Roman"/>
+          <w:b w:val="0"/>
+          <w:sz w:val="20"/>
+        </w:rPr>
+        <w:t xml:space="preserve">Fonte: elaborado pelo autor.</w:t>
+      </w:r>
+    </w:p>
+    <w:p>
+      <w:pPr>
         <w:pStyle w:val="BodyText"/>
         <w:spacing w:line="360" w:lineRule="auto" w:before="0" w:after="120"/>
         <w:ind w:firstLine="709"/>
@@ -1105,31 +1413,70 @@
         <w:t xml:space="preserve">6 CRONOGRAMA</w:t>
       </w:r>
     </w:p>
+    <w:p>
+      <w:pPr>
+        <w:pStyle w:val="Legenda"/>
+        <w:spacing w:line="240" w:lineRule="auto" w:before="120" w:after="80"/>
+        <w:ind/>
+        <w:jc w:val="center"/>
+      </w:pPr>
+      <w:r>
+        <w:rPr>
+          <w:rFonts w:ascii="Times New Roman" w:hAnsi="Times New Roman" w:eastAsia="Times New Roman" w:cs="Times New Roman"/>
+          <w:b/>
+          <w:sz w:val="20"/>
+        </w:rPr>
+        <w:t xml:space="preserve">Quadro 2 – Cronograma de execução da pesquisa</w:t>
+      </w:r>
+    </w:p>
     <w:tbl>
       <w:tblPr>
-        <w:tblW w:type="pct" w:w="5000"/>
+        <w:tblLayout w:type="fixed"/>
         <w:tblLook w:firstRow="1" w:lastRow="0" w:firstColumn="0" w:lastColumn="0" w:noHBand="0" w:noVBand="0" w:val="0020"/>
-        <w:jc w:val="start"/>
+        <w:jc w:val="center"/>
+        <w:tblBorders>
+          <w:top w:val="single" w:sz="4" w:color="808080"/>
+          <w:left w:val="single" w:sz="4" w:color="808080"/>
+          <w:bottom w:val="single" w:sz="4" w:color="808080"/>
+          <w:right w:val="single" w:sz="4" w:color="808080"/>
+          <w:insideH w:val="single" w:sz="4" w:color="808080"/>
+          <w:insideV w:val="single" w:sz="4" w:color="808080"/>
+        </w:tblBorders>
+        <w:tblW w:w="9639" w:type="dxa"/>
+        <w:tblLayout w:type="fixed"/>
       </w:tblPr>
       <w:tblGrid>
-        <w:gridCol w:w="3960"/>
-        <w:gridCol w:w="3960"/>
+        <w:gridCol w:w="1814"/>
+        <w:gridCol w:w="7824"/>
       </w:tblGrid>
       <w:tr>
         <w:trPr>
           <w:tblHeader w:val="true"/>
+          <w:cantSplit/>
+          <w:tblHeader/>
         </w:trPr>
         <w:tc>
-          <w:tcPr/>
+          <w:tcPr>
+            <w:tcW w:type="dxa" w:w="1814"/>
+            <w:tcMar>
+              <w:top w:w="70" w:type="dxa"/>
+              <w:bottom w:w="70" w:type="dxa"/>
+              <w:left w:w="100" w:type="dxa"/>
+              <w:right w:w="100" w:type="dxa"/>
+            </w:tcMar>
+            <w:vAlign w:val="center"/>
+            <w:shd w:val="clear" w:color="auto" w:fill="BFBFBF"/>
+          </w:tcPr>
           <w:p>
             <w:pPr>
               <w:pStyle w:val="Compact"/>
-              <w:spacing w:line="240" w:lineRule="auto"/>
-              <w:jc w:val="left"/>
+              <w:spacing w:line="240" w:lineRule="auto" w:after="0"/>
+              <w:jc w:val="center"/>
             </w:pPr>
             <w:r>
               <w:rPr>
                 <w:rFonts w:ascii="Times New Roman" w:hAnsi="Times New Roman" w:eastAsia="Times New Roman" w:cs="Times New Roman"/>
+                <w:b/>
                 <w:sz w:val="20"/>
               </w:rPr>
               <w:t xml:space="preserve">Período</w:t>
@@ -1137,16 +1484,27 @@
           </w:p>
         </w:tc>
         <w:tc>
-          <w:tcPr/>
+          <w:tcPr>
+            <w:tcW w:type="dxa" w:w="7824"/>
+            <w:tcMar>
+              <w:top w:w="70" w:type="dxa"/>
+              <w:bottom w:w="70" w:type="dxa"/>
+              <w:left w:w="100" w:type="dxa"/>
+              <w:right w:w="100" w:type="dxa"/>
+            </w:tcMar>
+            <w:vAlign w:val="center"/>
+            <w:shd w:val="clear" w:color="auto" w:fill="BFBFBF"/>
+          </w:tcPr>
           <w:p>
             <w:pPr>
               <w:pStyle w:val="Compact"/>
-              <w:spacing w:line="240" w:lineRule="auto"/>
-              <w:jc w:val="left"/>
+              <w:spacing w:line="240" w:lineRule="auto" w:after="0"/>
+              <w:jc w:val="center"/>
             </w:pPr>
             <w:r>
               <w:rPr>
                 <w:rFonts w:ascii="Times New Roman" w:hAnsi="Times New Roman" w:eastAsia="Times New Roman" w:cs="Times New Roman"/>
+                <w:b/>
                 <w:sz w:val="20"/>
               </w:rPr>
               <w:t xml:space="preserve">Atividades</w:t>
@@ -1155,17 +1513,31 @@
         </w:tc>
       </w:tr>
       <w:tr>
+        <w:trPr>
+          <w:cantSplit/>
+        </w:trPr>
         <w:tc>
-          <w:tcPr/>
+          <w:tcPr>
+            <w:tcW w:type="dxa" w:w="1814"/>
+            <w:tcMar>
+              <w:top w:w="70" w:type="dxa"/>
+              <w:bottom w:w="70" w:type="dxa"/>
+              <w:left w:w="100" w:type="dxa"/>
+              <w:right w:w="100" w:type="dxa"/>
+            </w:tcMar>
+            <w:vAlign w:val="center"/>
+            <w:shd w:val="clear" w:color="auto" w:fill="FFFFFF"/>
+          </w:tcPr>
           <w:p>
             <w:pPr>
               <w:pStyle w:val="Compact"/>
-              <w:spacing w:line="240" w:lineRule="auto"/>
+              <w:spacing w:line="240" w:lineRule="auto" w:after="0"/>
               <w:jc w:val="left"/>
             </w:pPr>
             <w:r>
               <w:rPr>
                 <w:rFonts w:ascii="Times New Roman" w:hAnsi="Times New Roman" w:eastAsia="Times New Roman" w:cs="Times New Roman"/>
+                <w:b/>
                 <w:sz w:val="20"/>
               </w:rPr>
               <w:t xml:space="preserve">Ano 1 (2027)</w:t>
@@ -1173,11 +1545,21 @@
           </w:p>
         </w:tc>
         <w:tc>
-          <w:tcPr/>
+          <w:tcPr>
+            <w:tcW w:type="dxa" w:w="7824"/>
+            <w:tcMar>
+              <w:top w:w="70" w:type="dxa"/>
+              <w:bottom w:w="70" w:type="dxa"/>
+              <w:left w:w="100" w:type="dxa"/>
+              <w:right w:w="100" w:type="dxa"/>
+            </w:tcMar>
+            <w:vAlign w:val="center"/>
+            <w:shd w:val="clear" w:color="auto" w:fill="FFFFFF"/>
+          </w:tcPr>
           <w:p>
             <w:pPr>
               <w:pStyle w:val="Compact"/>
-              <w:spacing w:line="240" w:lineRule="auto"/>
+              <w:spacing w:line="240" w:lineRule="auto" w:after="0"/>
               <w:jc w:val="left"/>
             </w:pPr>
             <w:r>
@@ -1191,17 +1573,31 @@
         </w:tc>
       </w:tr>
       <w:tr>
+        <w:trPr>
+          <w:cantSplit/>
+        </w:trPr>
         <w:tc>
-          <w:tcPr/>
+          <w:tcPr>
+            <w:tcW w:type="dxa" w:w="1814"/>
+            <w:tcMar>
+              <w:top w:w="70" w:type="dxa"/>
+              <w:bottom w:w="70" w:type="dxa"/>
+              <w:left w:w="100" w:type="dxa"/>
+              <w:right w:w="100" w:type="dxa"/>
+            </w:tcMar>
+            <w:vAlign w:val="center"/>
+            <w:shd w:val="clear" w:color="auto" w:fill="EDEDED"/>
+          </w:tcPr>
           <w:p>
             <w:pPr>
               <w:pStyle w:val="Compact"/>
-              <w:spacing w:line="240" w:lineRule="auto"/>
+              <w:spacing w:line="240" w:lineRule="auto" w:after="0"/>
               <w:jc w:val="left"/>
             </w:pPr>
             <w:r>
               <w:rPr>
                 <w:rFonts w:ascii="Times New Roman" w:hAnsi="Times New Roman" w:eastAsia="Times New Roman" w:cs="Times New Roman"/>
+                <w:b/>
                 <w:sz w:val="20"/>
               </w:rPr>
               <w:t xml:space="preserve">Ano 2 (2028)</w:t>
@@ -1209,11 +1605,21 @@
           </w:p>
         </w:tc>
         <w:tc>
-          <w:tcPr/>
+          <w:tcPr>
+            <w:tcW w:type="dxa" w:w="7824"/>
+            <w:tcMar>
+              <w:top w:w="70" w:type="dxa"/>
+              <w:bottom w:w="70" w:type="dxa"/>
+              <w:left w:w="100" w:type="dxa"/>
+              <w:right w:w="100" w:type="dxa"/>
+            </w:tcMar>
+            <w:vAlign w:val="center"/>
+            <w:shd w:val="clear" w:color="auto" w:fill="EDEDED"/>
+          </w:tcPr>
           <w:p>
             <w:pPr>
               <w:pStyle w:val="Compact"/>
-              <w:spacing w:line="240" w:lineRule="auto"/>
+              <w:spacing w:line="240" w:lineRule="auto" w:after="0"/>
               <w:jc w:val="left"/>
             </w:pPr>
             <w:r>
@@ -1227,17 +1633,31 @@
         </w:tc>
       </w:tr>
       <w:tr>
+        <w:trPr>
+          <w:cantSplit/>
+        </w:trPr>
         <w:tc>
-          <w:tcPr/>
+          <w:tcPr>
+            <w:tcW w:type="dxa" w:w="1814"/>
+            <w:tcMar>
+              <w:top w:w="70" w:type="dxa"/>
+              <w:bottom w:w="70" w:type="dxa"/>
+              <w:left w:w="100" w:type="dxa"/>
+              <w:right w:w="100" w:type="dxa"/>
+            </w:tcMar>
+            <w:vAlign w:val="center"/>
+            <w:shd w:val="clear" w:color="auto" w:fill="FFFFFF"/>
+          </w:tcPr>
           <w:p>
             <w:pPr>
               <w:pStyle w:val="Compact"/>
-              <w:spacing w:line="240" w:lineRule="auto"/>
+              <w:spacing w:line="240" w:lineRule="auto" w:after="0"/>
               <w:jc w:val="left"/>
             </w:pPr>
             <w:r>
               <w:rPr>
                 <w:rFonts w:ascii="Times New Roman" w:hAnsi="Times New Roman" w:eastAsia="Times New Roman" w:cs="Times New Roman"/>
+                <w:b/>
                 <w:sz w:val="20"/>
               </w:rPr>
               <w:t xml:space="preserve">Ano 3 (2029)</w:t>
@@ -1245,11 +1665,21 @@
           </w:p>
         </w:tc>
         <w:tc>
-          <w:tcPr/>
+          <w:tcPr>
+            <w:tcW w:type="dxa" w:w="7824"/>
+            <w:tcMar>
+              <w:top w:w="70" w:type="dxa"/>
+              <w:bottom w:w="70" w:type="dxa"/>
+              <w:left w:w="100" w:type="dxa"/>
+              <w:right w:w="100" w:type="dxa"/>
+            </w:tcMar>
+            <w:vAlign w:val="center"/>
+            <w:shd w:val="clear" w:color="auto" w:fill="FFFFFF"/>
+          </w:tcPr>
           <w:p>
             <w:pPr>
               <w:pStyle w:val="Compact"/>
-              <w:spacing w:line="240" w:lineRule="auto"/>
+              <w:spacing w:line="240" w:lineRule="auto" w:after="0"/>
               <w:jc w:val="left"/>
             </w:pPr>
             <w:r>
@@ -1263,17 +1693,31 @@
         </w:tc>
       </w:tr>
       <w:tr>
+        <w:trPr>
+          <w:cantSplit/>
+        </w:trPr>
         <w:tc>
-          <w:tcPr/>
+          <w:tcPr>
+            <w:tcW w:type="dxa" w:w="1814"/>
+            <w:tcMar>
+              <w:top w:w="70" w:type="dxa"/>
+              <w:bottom w:w="70" w:type="dxa"/>
+              <w:left w:w="100" w:type="dxa"/>
+              <w:right w:w="100" w:type="dxa"/>
+            </w:tcMar>
+            <w:vAlign w:val="center"/>
+            <w:shd w:val="clear" w:color="auto" w:fill="EDEDED"/>
+          </w:tcPr>
           <w:p>
             <w:pPr>
               <w:pStyle w:val="Compact"/>
-              <w:spacing w:line="240" w:lineRule="auto"/>
+              <w:spacing w:line="240" w:lineRule="auto" w:after="0"/>
               <w:jc w:val="left"/>
             </w:pPr>
             <w:r>
               <w:rPr>
                 <w:rFonts w:ascii="Times New Roman" w:hAnsi="Times New Roman" w:eastAsia="Times New Roman" w:cs="Times New Roman"/>
+                <w:b/>
                 <w:sz w:val="20"/>
               </w:rPr>
               <w:t xml:space="preserve">Ano 4 (2030)</w:t>
@@ -1281,11 +1725,21 @@
           </w:p>
         </w:tc>
         <w:tc>
-          <w:tcPr/>
+          <w:tcPr>
+            <w:tcW w:type="dxa" w:w="7824"/>
+            <w:tcMar>
+              <w:top w:w="70" w:type="dxa"/>
+              <w:bottom w:w="70" w:type="dxa"/>
+              <w:left w:w="100" w:type="dxa"/>
+              <w:right w:w="100" w:type="dxa"/>
+            </w:tcMar>
+            <w:vAlign w:val="center"/>
+            <w:shd w:val="clear" w:color="auto" w:fill="EDEDED"/>
+          </w:tcPr>
           <w:p>
             <w:pPr>
               <w:pStyle w:val="Compact"/>
-              <w:spacing w:line="240" w:lineRule="auto"/>
+              <w:spacing w:line="240" w:lineRule="auto" w:after="0"/>
               <w:jc w:val="left"/>
             </w:pPr>
             <w:r>
@@ -1299,6 +1753,22 @@
         </w:tc>
       </w:tr>
     </w:tbl>
+    <w:p>
+      <w:pPr>
+        <w:pStyle w:val="Fonte"/>
+        <w:spacing w:line="240" w:lineRule="auto" w:before="40" w:after="240"/>
+        <w:ind/>
+        <w:jc w:val="left"/>
+      </w:pPr>
+      <w:r>
+        <w:rPr>
+          <w:rFonts w:ascii="Times New Roman" w:hAnsi="Times New Roman" w:eastAsia="Times New Roman" w:cs="Times New Roman"/>
+          <w:b w:val="0"/>
+          <w:sz w:val="20"/>
+        </w:rPr>
+        <w:t xml:space="preserve">Fonte: elaborado pelo autor.</w:t>
+      </w:r>
+    </w:p>
     <w:bookmarkEnd w:id="25"/>
     <w:bookmarkStart w:id="26" w:name="referências"/>
     <w:p>
@@ -3447,6 +3917,22 @@
       <w:rFonts w:asciiTheme="majorHAnsi" w:cstheme="majorBidi" w:eastAsiaTheme="majorEastAsia" w:hAnsiTheme="majorHAnsi" w:ascii="Times New Roman" w:hAnsi="Times New Roman"/>
       <w:b w:val="0"/>
       <w:bCs w:val="0"/>
+    </w:rPr>
+  </w:style>
+  <w:style w:type="paragraph" w:customStyle="1" w:styleId="Fonte">
+    <w:name w:val="Fonte"/>
+    <w:basedOn w:val="BodyText"/>
+    <w:qFormat/>
+    <w:rPr>
+      <w:rFonts w:ascii="Times New Roman" w:hAnsi="Times New Roman"/>
+    </w:rPr>
+  </w:style>
+  <w:style w:type="paragraph" w:customStyle="1" w:styleId="Legenda">
+    <w:name w:val="Legenda"/>
+    <w:basedOn w:val="BodyText"/>
+    <w:qFormat/>
+    <w:rPr>
+      <w:rFonts w:ascii="Times New Roman" w:hAnsi="Times New Roman"/>
     </w:rPr>
   </w:style>
   <w:style w:type="paragraph" w:customStyle="1" w:styleId="SourceCode">

</xml_diff>

<commit_message>
Revisa conectivos do anteprojeto com base no repositório conectivos
Co-Authored-By: Claude Opus 5.5 <noreply@anthropic.com>
Claude-Session: https://claude.ai/code/session_012kDm3eDcjoxunS5BBjgPmo
</commit_message>
<xml_diff>
--- a/entregas/anteprojeto.docx
+++ b/entregas/anteprojeto.docx
@@ -155,7 +155,7 @@
           <w:rFonts w:ascii="Times New Roman" w:hAnsi="Times New Roman" w:eastAsia="Times New Roman" w:cs="Times New Roman"/>
           <w:sz w:val="24"/>
         </w:rPr>
-        <w:t xml:space="preserve">Os dados mais recentes tornam essa pergunta urgente. Segundo o Anuário Brasileiro de Segurança Pública, Eunápolis e Porto Seguro figuram entre as quatro cidades mais violentas do país, com taxas de 85,1 e 71,2 mortes violentas intencionais por 100 mil habitantes, respectivamente, e lideram o país em mortes decorrentes de intervenção policial entre os municípios com mais de 100 mil habitantes, com 32,3 e 29,7 por 100 mil, respectivamente (FÓRUM BRASILEIRO DE SEGURANÇA PÚBLICA, 2026). Em Porto Seguro, a ação policial respondeu por 45% das 130 mortes violentas registradas em 2025. No plano estadual, a Bahia somou 1.570 mortes por intervenção policial no mesmo ano, o maior número absoluto do país. Esse padrão não é racialmente neutro: estudos sobre abordagem e letalidade policial demonstram que a pertinência racial opera como critério de suspeição e de uso da força, inclusive em Salvador (RAMOS; MUSUMECI, 2005; ANUNCIAÇÃO; TRAD; FERREIRA, 2020; SINHORETTO; BATITUCCI, 2023).</w:t>
+        <w:t xml:space="preserve">É nesse cenário que os dados mais recentes tornam essa pergunta urgente. De acordo com o Anuário Brasileiro de Segurança Pública, Eunápolis e Porto Seguro figuram entre as quatro cidades mais violentas do país, com taxas de 85,1 e 71,2 mortes violentas intencionais por 100 mil habitantes, respectivamente, e lideram o país em mortes decorrentes de intervenção policial entre os municípios com mais de 100 mil habitantes, com 32,3 e 29,7 por 100 mil, respectivamente (FÓRUM BRASILEIRO DE SEGURANÇA PÚBLICA, 2026). Em Porto Seguro, a ação policial respondeu por 45% das 130 mortes violentas registradas em 2025. No plano estadual, a Bahia somou 1.570 mortes por intervenção policial no mesmo ano, o maior número absoluto do país. Cumpre ressaltar que esse padrão não é racialmente neutro: estudos sobre abordagem e letalidade policial demonstram que a pertinência racial opera como critério de suspeição e de uso da força, inclusive em Salvador (RAMOS; MUSUMECI, 2005; ANUNCIAÇÃO; TRAD; FERREIRA, 2020; SINHORETTO; BATITUCCI, 2023).</w:t>
       </w:r>
     </w:p>
     <w:p>
@@ -185,7 +185,7 @@
           <w:rFonts w:ascii="Times New Roman" w:hAnsi="Times New Roman" w:eastAsia="Times New Roman" w:cs="Times New Roman"/>
           <w:sz w:val="24"/>
         </w:rPr>
-        <w:t xml:space="preserve">Nessa direção, estudo anterior, desenvolvido em mestrado profissional sobre indicadores de desempenho na Polícia Militar da Bahia, mostrou que os instrumentos de controle perdem eficácia quando atuam de forma isolada e desarticulada, e que faltam mecanismos de natureza preventiva e ética, e não apenas punitiva. Aquele trabalho, contudo, restringiu-se à análise bibliográfica e documental em escala estadual e não incorporou a dimensão racial. Assim, ficou por investigar como esses controles funcionam no território e como são percebidos pelas populações negras, quilombolas e indígenas policiadas, lacuna que a presente tese pretende enfrentar.</w:t>
+        <w:t xml:space="preserve">Nesse contexto, estudo anterior, desenvolvido em mestrado profissional sobre indicadores de desempenho na Polícia Militar da Bahia, mostrou que os instrumentos de controle perdem eficácia quando atuam de forma isolada e desarticulada, e que faltam mecanismos de natureza preventiva e ética, e não apenas punitiva. Aquele trabalho, contudo, restringiu-se à análise bibliográfica e documental em escala estadual e não incorporou a dimensão racial. Ficou por investigar, portanto, como esses controles funcionam no território e como são percebidos pelas populações negras, quilombolas e indígenas policiadas, lacuna que a presente tese pretende enfrentar.</w:t>
       </w:r>
     </w:p>
     <w:p>
@@ -200,7 +200,7 @@
           <w:rFonts w:ascii="Times New Roman" w:hAnsi="Times New Roman" w:eastAsia="Times New Roman" w:cs="Times New Roman"/>
           <w:sz w:val="24"/>
         </w:rPr>
-        <w:t xml:space="preserve">Diante disso, formula-se a seguinte questão de pesquisa:</w:t>
+        <w:t xml:space="preserve">Fixada essa premissa, formula-se a seguinte questão de pesquisa:</w:t>
       </w:r>
       <w:r>
         <w:rPr>
@@ -261,7 +261,7 @@
           <w:rFonts w:ascii="Times New Roman" w:hAnsi="Times New Roman" w:eastAsia="Times New Roman" w:cs="Times New Roman"/>
           <w:sz w:val="24"/>
         </w:rPr>
-        <w:t xml:space="preserve">Por essas razões, a proposta insere-se na Linha 1 do PPGES, ao tomar o Estado como conjunto heterogêneo de instituições e debruçar-se sobre as dinâmicas do exercício do poder, os processos de legitimação, a relação entre Estado e sociedade civil, o pluralismo jurídico e as instâncias de controle de programas de governo. Dialoga, ainda, com a produção das orientadoras indicadas sobre racismo, sistema de justiça e segurança pública (SANTOS, 2025) e sobre a letalidade e o encarceramento da juventude negra (OLIVEIRA; TORRES; TORRES, 2018).</w:t>
+        <w:t xml:space="preserve">Trata-se, portanto, de proposta que se insere na Linha 1 do PPGES, na medida em que toma o Estado como conjunto heterogêneo de instituições e se debruça sobre as dinâmicas do exercício do poder, os processos de legitimação, a relação entre Estado e sociedade civil, o pluralismo jurídico e as instâncias de controle de programas de governo. Dialoga, ainda, com a produção das orientadoras indicadas sobre racismo, sistema de justiça e segurança pública (SANTOS, 2025) e sobre a letalidade e o encarceramento da juventude negra (OLIVEIRA; TORRES; TORRES, 2018).</w:t>
       </w:r>
     </w:p>
     <w:bookmarkEnd w:id="20"/>
@@ -494,7 +494,7 @@
           <w:rFonts w:ascii="Times New Roman" w:hAnsi="Times New Roman" w:eastAsia="Times New Roman" w:cs="Times New Roman"/>
           <w:sz w:val="24"/>
         </w:rPr>
-        <w:t xml:space="preserve">No primeiro eixo, parte-se da definição weberiana do Estado como detentor do monopólio legítimo da força física (WEBER, 2004), o que faz da polícia a expressão mais visível desse poder no cotidiano. Nessa linha, Beetham (1991) acrescenta que a legitimidade não se esgota na legalidade: ela depende também de crenças compartilhadas e do consentimento expresso dos governados. A teoria da justiça procedimental aprofunda esse argumento ao demonstrar que as pessoas cooperam com a polícia e obedecem à lei sobretudo quando se sentem tratadas com respeito e imparcialidade, e não apenas quando percebem a polícia como eficaz (SUNSHINE; TYLER, 2003; TYLER, 2006). No Brasil, por sua vez, essa perspectiva foi incorporada ao debate sobre reforma policial por Zanetic et al. (2016) e operacionalizada empiricamente por Oliveira, Oliveira e Adorno (2019), que propuseram um modelo de mensuração da legitimidade policial em São Paulo.</w:t>
+        <w:t xml:space="preserve">No primeiro eixo, parte-se da definição weberiana do Estado como detentor do monopólio legítimo da força física (WEBER, 2004), o que faz da polícia a expressão mais visível desse poder no cotidiano. Nessa linha de raciocínio, Beetham (1991) acrescenta que a legitimidade não se esgota na legalidade: ela depende também de crenças compartilhadas e do consentimento expresso dos governados. Com efeito, a teoria da justiça procedimental aprofunda esse argumento ao demonstrar que as pessoas cooperam com a polícia e obedecem à lei sobretudo quando se sentem tratadas com respeito e imparcialidade, e não apenas quando percebem a polícia como eficaz (SUNSHINE; TYLER, 2003; TYLER, 2006). No Brasil, por sua vez, essa perspectiva foi incorporada ao debate sobre reforma policial por Zanetic et al. (2016) e operacionalizada empiricamente por Oliveira, Oliveira e Adorno (2019), que propuseram um modelo de mensuração da legitimidade policial em São Paulo.</w:t>
       </w:r>
     </w:p>
     <w:p>
@@ -524,7 +524,7 @@
           <w:rFonts w:ascii="Times New Roman" w:hAnsi="Times New Roman" w:eastAsia="Times New Roman" w:cs="Times New Roman"/>
           <w:sz w:val="24"/>
         </w:rPr>
-        <w:t xml:space="preserve">No terceiro eixo, Sapori (2007) discute a adoção da gestão por resultados na segurança pública brasileira, e Santos e Gomes (2021), em revisão sistemática, mostram que não há metodologia única para avaliar o desempenho policial, devendo a mensuração corresponder aos objetivos de cada organização. Complementarmente, Lui e Sales (2024) mapeiam a agenda do policiamento baseado em evidências. Quanto ao policiamento comunitário, Muniz e Paes-Machado (2010) problematizam as experiências baianas, e Ferreira, Rossoni e Oliveira (2022) demonstram que esse modelo, incluindo as Bases Comunitárias da Bahia, é atravessado por quatro lógicas institucionais, a militar, a profissional, a gerencial e a comunitária, cuja tensão ajuda a explicar por que as metas gerenciais frequentemente se sobrepõem à proximidade. A participação social, ademais, encontra limites na própria cultura policial: ao estudar os conselhos comunitários de segurança paulistas, Bueno, Lima e Teixeira (2016) mostram que o cidadão tende a ser tratado mais como demandante do que como sujeito da política.</w:t>
+        <w:t xml:space="preserve">No terceiro eixo, Sapori (2007) discute a adoção da gestão por resultados na segurança pública brasileira, e Santos e Gomes (2021), em revisão sistemática, mostram que não há metodologia única para avaliar o desempenho policial, devendo a mensuração corresponder aos objetivos de cada organização. Lui e Sales (2024), por sua vez, mapeiam a agenda do policiamento baseado em evidências. No que concerne ao policiamento comunitário, Muniz e Paes-Machado (2010) problematizam as experiências baianas, e Ferreira, Rossoni e Oliveira (2022) demonstram que esse modelo, incluindo as Bases Comunitárias da Bahia, é atravessado por quatro lógicas institucionais, a militar, a profissional, a gerencial e a comunitária, cuja tensão ajuda a explicar por que as metas gerenciais frequentemente se sobrepõem à proximidade. Não é menos verdade, contudo, que a participação social encontra limites na própria cultura policial: ao estudar os conselhos comunitários de segurança paulistas, Bueno, Lima e Teixeira (2016) mostram que o cidadão tende a ser tratado mais como demandante do que como sujeito da política.</w:t>
       </w:r>
     </w:p>
     <w:p>
@@ -539,7 +539,7 @@
           <w:rFonts w:ascii="Times New Roman" w:hAnsi="Times New Roman" w:eastAsia="Times New Roman" w:cs="Times New Roman"/>
           <w:sz w:val="24"/>
         </w:rPr>
-        <w:t xml:space="preserve">O quarto eixo confere ao projeto sua lente analítica. Almeida (2019) demonstra que o racismo é estrutural e se reproduz nas instituições mesmo sem intenção explícita, e Bento (2022) descreve o pacto narcísico da branquitude que sustenta essa reprodução nas organizações. No campo penal, Flauzina (2006) interpreta a seletividade do sistema como parte de um projeto genocida dirigido à população negra, leitura que encontra respaldo empírico nos dados sobre homicídio e encarceramento da juventude negra (OLIVEIRA; TORRES; TORRES, 2018) e na análise interseccional do encarceramento feminino negro (OLIVEIRA; SANTOS; ROCHA, 2021; AKOTIRENE, 2019). Especificamente quanto à Polícia Militar da Bahia, Silva (2021) evidenciou as ausências da discussão étnico-racial no currículo de formação policial, enquanto Santos (2025) examinou o impacto da Convenção Interamericana contra o Racismo sobre o sistema de justiça e segurança pública brasileiros, abrindo caminho para pensar o controle da polícia também como obrigação antirracista do Estado. Por fim, as categorias de amefricanidade (GONZALEZ, 1988) e de quilombismo (NASCIMENTO, 1980) permitem compreender periferias negras e comunidades quilombolas não como alvos do policiamento, mas como sujeitos políticos e portadores de formas próprias de organização e de juridicidade, o que dialoga com o pluralismo jurídico e a interculturalidade. É nessa chave que se indaga se o controle democrático e a accountability podem converter o policiamento comunitário em relação efetivamente legítima com esses territórios.</w:t>
+        <w:t xml:space="preserve">O quarto eixo confere ao projeto sua lente analítica. Na lição de Almeida (2019), o racismo é estrutural e se reproduz nas instituições mesmo sem intenção explícita, e Bento (2022) descreve o pacto narcísico da branquitude que sustenta essa reprodução nas organizações. No campo penal, Flauzina (2006) interpreta a seletividade do sistema como parte de um projeto genocida dirigido à população negra, leitura que encontra respaldo empírico nos dados sobre homicídio e encarceramento da juventude negra (OLIVEIRA; TORRES; TORRES, 2018) e na análise interseccional do encarceramento feminino negro (OLIVEIRA; SANTOS; ROCHA, 2021; AKOTIRENE, 2019). Especificamente quanto à Polícia Militar da Bahia, Silva (2021) evidenciou as ausências da discussão étnico-racial no currículo de formação policial, enquanto Santos (2025) examinou o impacto da Convenção Interamericana contra o Racismo sobre o sistema de justiça e segurança pública brasileiros, abrindo caminho para pensar o controle da polícia também como obrigação antirracista do Estado. Por fim, as categorias de amefricanidade (GONZALEZ, 1988) e de quilombismo (NASCIMENTO, 1980) permitem compreender periferias negras e comunidades quilombolas não como alvos do policiamento, mas como sujeitos políticos e portadores de formas próprias de organização e de juridicidade, o que dialoga com o pluralismo jurídico e a interculturalidade. É a partir daí que se indaga se o controle democrático e a accountability podem converter o policiamento comunitário em relação efetivamente legítima com esses territórios.</w:t>
       </w:r>
     </w:p>
     <w:p>
@@ -554,7 +554,7 @@
           <w:rFonts w:ascii="Times New Roman" w:hAnsi="Times New Roman" w:eastAsia="Times New Roman" w:cs="Times New Roman"/>
           <w:sz w:val="24"/>
         </w:rPr>
-        <w:t xml:space="preserve">Cabe destacar, ainda, que a confiança na polícia, variável central para esta pesquisa, mostra-se baixa no país, mas sensível ao contexto: Rolim e Hermann (2018) verificaram, em Porto Alegre, níveis de confiança inferiores aos observados em cidades menores. Tal achado justifica, por conseguinte, investigar um contexto interiorano como o do Extremo Sul baiano. Nesse quadro, a noção de pluralismo jurídico, presente na descrição da Linha 1, oferece chave analítica para a relação entre a polícia e os povos indígenas e comunidades tradicionais da região.</w:t>
+        <w:t xml:space="preserve">Cumpre registrar, ainda, que a confiança na polícia, variável central para esta pesquisa, mostra-se baixa no país, mas sensível ao contexto: Rolim e Hermann (2018) verificaram, em Porto Alegre, níveis de confiança inferiores aos observados em cidades menores. Tal achado justifica, por conseguinte, investigar um contexto interiorano como o do Extremo Sul baiano. Nessa perspectiva, a noção de pluralismo jurídico, presente na descrição da Linha 1, oferece chave analítica para a relação entre a polícia e os povos indígenas e comunidades tradicionais da região.</w:t>
       </w:r>
     </w:p>
     <w:bookmarkEnd w:id="22"/>
@@ -1361,7 +1361,7 @@
           <w:rFonts w:ascii="Times New Roman" w:hAnsi="Times New Roman" w:eastAsia="Times New Roman" w:cs="Times New Roman"/>
           <w:sz w:val="24"/>
         </w:rPr>
-        <w:t xml:space="preserve">O projeto será submetido ao Comitê de Ética em Pesquisa, nos termos das Resoluções CNS nº 466/2012 e nº 510/2016, assegurando-se o consentimento livre e esclarecido e o anonimato dos participantes. No caso de povos indígenas e comunidades tradicionais, haverá consulta prévia às lideranças e, quando exigido, apreciação pela Comissão Nacional de Ética em Pesquisa. Será igualmente solicitada a anuência institucional da Polícia Militar. O vínculo profissional do pesquisador com a instituição estudada será tratado com reflexividade, reconhecido tanto como limite potencial quanto como condição privilegiada de acesso ao campo.</w:t>
+        <w:t xml:space="preserve">O projeto será submetido ao Comitê de Ética em Pesquisa, nos termos das Resoluções CNS nº 466/2012 e nº 510/2016, assegurando-se o consentimento livre e esclarecido e o anonimato dos participantes. No caso de povos indígenas e comunidades tradicionais, haverá consulta prévia às lideranças e, quando exigido, apreciação pela Comissão Nacional de Ética em Pesquisa. De igual modo, será solicitada a anuência institucional da Polícia Militar. O vínculo profissional do pesquisador com a instituição estudada será tratado com reflexividade, reconhecido tanto como limite potencial quanto como condição privilegiada de acesso ao campo.</w:t>
       </w:r>
     </w:p>
     <w:bookmarkEnd w:id="23"/>

</xml_diff>

<commit_message>
Remove repetições de conectivos e corrige ordem dos dados do FBSP
Co-Authored-By: Claude Opus 5.5 <noreply@anthropic.com>
Claude-Session: https://claude.ai/code/session_012kDm3eDcjoxunS5BBjgPmo
</commit_message>
<xml_diff>
--- a/entregas/anteprojeto.docx
+++ b/entregas/anteprojeto.docx
@@ -155,7 +155,7 @@
           <w:rFonts w:ascii="Times New Roman" w:hAnsi="Times New Roman" w:eastAsia="Times New Roman" w:cs="Times New Roman"/>
           <w:sz w:val="24"/>
         </w:rPr>
-        <w:t xml:space="preserve">É nesse cenário que os dados mais recentes tornam essa pergunta urgente. De acordo com o Anuário Brasileiro de Segurança Pública, Eunápolis e Porto Seguro figuram entre as quatro cidades mais violentas do país, com taxas de 85,1 e 71,2 mortes violentas intencionais por 100 mil habitantes, respectivamente, e lideram o país em mortes decorrentes de intervenção policial entre os municípios com mais de 100 mil habitantes, com 32,3 e 29,7 por 100 mil, respectivamente (FÓRUM BRASILEIRO DE SEGURANÇA PÚBLICA, 2026). Em Porto Seguro, a ação policial respondeu por 45% das 130 mortes violentas registradas em 2025. No plano estadual, a Bahia somou 1.570 mortes por intervenção policial no mesmo ano, o maior número absoluto do país. Cumpre ressaltar que esse padrão não é racialmente neutro: estudos sobre abordagem e letalidade policial demonstram que a pertinência racial opera como critério de suspeição e de uso da força, inclusive em Salvador (RAMOS; MUSUMECI, 2005; ANUNCIAÇÃO; TRAD; FERREIRA, 2020; SINHORETTO; BATITUCCI, 2023).</w:t>
+        <w:t xml:space="preserve">É nesse cenário que os dados mais recentes tornam essa pergunta urgente. De acordo com o Anuário Brasileiro de Segurança Pública, Eunápolis e Porto Seguro figuram entre as quatro cidades mais violentas do país, com taxas de 85,1 e 71,2 mortes violentas intencionais por 100 mil habitantes, respectivamente, e lideram o país em mortes decorrentes de intervenção policial entre os municípios com mais de 100 mil habitantes, com 32,3 por 100 mil em Porto Seguro e 29,7 em Eunápolis (FÓRUM BRASILEIRO DE SEGURANÇA PÚBLICA, 2026). Em Porto Seguro, a ação policial respondeu por 45% das 130 mortes violentas registradas em 2025. No plano estadual, a Bahia somou 1.570 mortes por intervenção policial no mesmo ano, o maior número absoluto do país. Cumpre ressaltar que esse padrão não é racialmente neutro: estudos sobre abordagem e letalidade policial demonstram que a pertinência racial opera como critério de suspeição e de uso da força, inclusive em Salvador (RAMOS; MUSUMECI, 2005; ANUNCIAÇÃO; TRAD; FERREIRA, 2020; SINHORETTO; BATITUCCI, 2023).</w:t>
       </w:r>
     </w:p>
     <w:p>
@@ -170,7 +170,7 @@
           <w:rFonts w:ascii="Times New Roman" w:hAnsi="Times New Roman" w:eastAsia="Times New Roman" w:cs="Times New Roman"/>
           <w:sz w:val="24"/>
         </w:rPr>
-        <w:t xml:space="preserve">Ocorre que, na prática, a gestão desses programas apoia-se sobretudo em metas quantitativas, como a redução dos Crimes Violentos Letais e Intencionais (CVLI) e dos Crimes Violentos contra o Patrimônio (CVP), em registros de produtividade e em premiações por desempenho. Em outras palavras, tais instrumentos dizem muito sobre o que a polícia faz, mas pouco sobre como ela trata as pessoas com quem interage, e nada sobre quem, racialmente, suporta os custos dessa atuação. A aparência técnica e neutra desses controles pode, assim, encobrir a reprodução do racismo institucional, à semelhança do que Souza, Ferreira e Santos (2021) identificam no campo jurídico como dispositivo da branquitude.</w:t>
+        <w:t xml:space="preserve">Ocorre que, na prática, a gestão desses programas apoia-se predominantemente em metas quantitativas, como a redução dos Crimes Violentos Letais e Intencionais (CVLI) e dos Crimes Violentos contra o Patrimônio (CVP), em registros de produtividade e em premiações por desempenho. Em outras palavras, tais instrumentos dizem muito sobre o que a polícia faz, mas pouco sobre como ela trata as pessoas com quem interage, e nada sobre quem, racialmente, suporta os custos dessa atuação. A aparência técnica e neutra desses controles pode, assim, encobrir a reprodução do racismo institucional, à semelhança do que Souza, Ferreira e Santos (2021) identificam no campo jurídico como dispositivo da branquitude.</w:t>
       </w:r>
     </w:p>
     <w:p>
@@ -185,7 +185,7 @@
           <w:rFonts w:ascii="Times New Roman" w:hAnsi="Times New Roman" w:eastAsia="Times New Roman" w:cs="Times New Roman"/>
           <w:sz w:val="24"/>
         </w:rPr>
-        <w:t xml:space="preserve">Nesse contexto, estudo anterior, desenvolvido em mestrado profissional sobre indicadores de desempenho na Polícia Militar da Bahia, mostrou que os instrumentos de controle perdem eficácia quando atuam de forma isolada e desarticulada, e que faltam mecanismos de natureza preventiva e ética, e não apenas punitiva. Aquele trabalho, contudo, restringiu-se à análise bibliográfica e documental em escala estadual e não incorporou a dimensão racial. Ficou por investigar, portanto, como esses controles funcionam no território e como são percebidos pelas populações negras, quilombolas e indígenas policiadas, lacuna que a presente tese pretende enfrentar.</w:t>
+        <w:t xml:space="preserve">Nesse contexto, estudo anterior, desenvolvido em mestrado profissional sobre indicadores de desempenho na Polícia Militar da Bahia, mostrou que os instrumentos de controle perdem eficácia quando atuam de forma isolada e desarticulada, e que faltam mecanismos de natureza preventiva e ética, e não apenas punitiva. Aquele trabalho, contudo, restringiu-se à análise bibliográfica e documental em escala estadual e não incorporou a dimensão racial. Restou por investigar, assim, como esses controles funcionam no território e como são percebidos pelas populações negras, quilombolas e indígenas policiadas, lacuna que a presente tese pretende enfrentar.</w:t>
       </w:r>
     </w:p>
     <w:p>
@@ -524,7 +524,7 @@
           <w:rFonts w:ascii="Times New Roman" w:hAnsi="Times New Roman" w:eastAsia="Times New Roman" w:cs="Times New Roman"/>
           <w:sz w:val="24"/>
         </w:rPr>
-        <w:t xml:space="preserve">No terceiro eixo, Sapori (2007) discute a adoção da gestão por resultados na segurança pública brasileira, e Santos e Gomes (2021), em revisão sistemática, mostram que não há metodologia única para avaliar o desempenho policial, devendo a mensuração corresponder aos objetivos de cada organização. Lui e Sales (2024), por sua vez, mapeiam a agenda do policiamento baseado em evidências. No que concerne ao policiamento comunitário, Muniz e Paes-Machado (2010) problematizam as experiências baianas, e Ferreira, Rossoni e Oliveira (2022) demonstram que esse modelo, incluindo as Bases Comunitárias da Bahia, é atravessado por quatro lógicas institucionais, a militar, a profissional, a gerencial e a comunitária, cuja tensão ajuda a explicar por que as metas gerenciais frequentemente se sobrepõem à proximidade. Não é menos verdade, contudo, que a participação social encontra limites na própria cultura policial: ao estudar os conselhos comunitários de segurança paulistas, Bueno, Lima e Teixeira (2016) mostram que o cidadão tende a ser tratado mais como demandante do que como sujeito da política.</w:t>
+        <w:t xml:space="preserve">No terceiro eixo, Sapori (2007) discute a adoção da gestão por resultados na segurança pública brasileira, e Santos e Gomes (2021), em revisão sistemática, mostram que não há metodologia única para avaliar o desempenho policial, devendo a mensuração corresponder aos objetivos de cada organização. Em sentido complementar, Lui e Sales (2024) mapeiam a agenda do policiamento baseado em evidências. No que concerne ao policiamento comunitário, Muniz e Paes-Machado (2010) problematizam as experiências baianas, e Ferreira, Rossoni e Oliveira (2022) demonstram que esse modelo, incluindo as Bases Comunitárias da Bahia, é atravessado por quatro lógicas institucionais, a militar, a profissional, a gerencial e a comunitária, cuja tensão ajuda a explicar por que as metas gerenciais frequentemente se sobrepõem à proximidade. Não é menos verdade, contudo, que a participação social encontra limites na própria cultura policial: ao estudar os conselhos comunitários de segurança paulistas, Bueno, Lima e Teixeira (2016) mostram que o cidadão tende a ser tratado mais como demandante do que como sujeito da política.</w:t>
       </w:r>
     </w:p>
     <w:p>
@@ -539,7 +539,7 @@
           <w:rFonts w:ascii="Times New Roman" w:hAnsi="Times New Roman" w:eastAsia="Times New Roman" w:cs="Times New Roman"/>
           <w:sz w:val="24"/>
         </w:rPr>
-        <w:t xml:space="preserve">O quarto eixo confere ao projeto sua lente analítica. Na lição de Almeida (2019), o racismo é estrutural e se reproduz nas instituições mesmo sem intenção explícita, e Bento (2022) descreve o pacto narcísico da branquitude que sustenta essa reprodução nas organizações. No campo penal, Flauzina (2006) interpreta a seletividade do sistema como parte de um projeto genocida dirigido à população negra, leitura que encontra respaldo empírico nos dados sobre homicídio e encarceramento da juventude negra (OLIVEIRA; TORRES; TORRES, 2018) e na análise interseccional do encarceramento feminino negro (OLIVEIRA; SANTOS; ROCHA, 2021; AKOTIRENE, 2019). Especificamente quanto à Polícia Militar da Bahia, Silva (2021) evidenciou as ausências da discussão étnico-racial no currículo de formação policial, enquanto Santos (2025) examinou o impacto da Convenção Interamericana contra o Racismo sobre o sistema de justiça e segurança pública brasileiros, abrindo caminho para pensar o controle da polícia também como obrigação antirracista do Estado. Por fim, as categorias de amefricanidade (GONZALEZ, 1988) e de quilombismo (NASCIMENTO, 1980) permitem compreender periferias negras e comunidades quilombolas não como alvos do policiamento, mas como sujeitos políticos e portadores de formas próprias de organização e de juridicidade, o que dialoga com o pluralismo jurídico e a interculturalidade. É a partir daí que se indaga se o controle democrático e a accountability podem converter o policiamento comunitário em relação efetivamente legítima com esses territórios.</w:t>
+        <w:t xml:space="preserve">O quarto eixo confere ao projeto sua lente analítica. Na lição de Almeida (2019), o racismo é estrutural e se reproduz nas instituições mesmo sem intenção explícita, e Bento (2022) descreve o pacto narcísico da branquitude que sustenta essa reprodução nas organizações. No campo penal, Flauzina (2006) interpreta a seletividade do sistema como parte de um projeto genocida dirigido à população negra, leitura que encontra respaldo empírico nos dados sobre homicídio e encarceramento da juventude negra (OLIVEIRA; TORRES; TORRES, 2018) e na análise interseccional do encarceramento feminino negro (OLIVEIRA; SANTOS; ROCHA, 2021; AKOTIRENE, 2019). Especificamente quanto à Polícia Militar da Bahia, Silva (2021) evidenciou as ausências da discussão étnico-racial no currículo de formação policial, e Santos (2025) examinou o impacto da Convenção Interamericana contra o Racismo sobre o sistema de justiça e segurança pública brasileiros, abrindo caminho para pensar o controle da polícia também como obrigação antirracista do Estado. Por fim, as categorias de amefricanidade (GONZALEZ, 1988) e de quilombismo (NASCIMENTO, 1980) permitem compreender periferias negras e comunidades quilombolas não como alvos do policiamento, mas como sujeitos políticos e portadores de formas próprias de organização e de juridicidade, o que dialoga com o pluralismo jurídico e a interculturalidade. É a partir daí que se indaga se o controle democrático e a accountability podem converter o policiamento comunitário em relação efetivamente legítima com esses territórios.</w:t>
       </w:r>
     </w:p>
     <w:p>

</xml_diff>

<commit_message>
Alinha objetivos, hipótese e resultados à pergunta de pesquisa
Co-Authored-By: Claude Opus 5.5 <noreply@anthropic.com>
Claude-Session: https://claude.ai/code/session_012kDm3eDcjoxunS5BBjgPmo
</commit_message>
<xml_diff>
--- a/entregas/anteprojeto.docx
+++ b/entregas/anteprojeto.docx
@@ -140,7 +140,7 @@
           <w:rFonts w:ascii="Times New Roman" w:hAnsi="Times New Roman" w:eastAsia="Times New Roman" w:cs="Times New Roman"/>
           <w:sz w:val="24"/>
         </w:rPr>
-        <w:t xml:space="preserve">O policiamento comunitário chegou ao Brasil com uma promessa ambiciosa: aproximar a polícia da população e transformar a segurança pública numa tarefa compartilhada, voltada à prevenção e à redução do medo do crime. Na Bahia, essa promessa ganhou forma institucional nas Bases Comunitárias de Segurança, criadas no âmbito do Programa Pacto pela Vida, hoje reformulado como Bahia pela Paz. Em Porto Seguro, a Base Comunitária do Baianão/Frei Calixto foi implantada numa das áreas periféricas mais populosas do município. Passada mais de uma década, porém, permanece em aberto uma questão de fundo: quem controla essa polícia de proximidade, e com que efeitos sobre a sua legitimidade junto às populações negras que ela deveria proteger?</w:t>
+        <w:t xml:space="preserve">O policiamento comunitário chegou ao Brasil com uma promessa ambiciosa: aproximar a polícia da população e transformar a segurança pública numa tarefa compartilhada, voltada à prevenção e à redução do medo do crime. Na Bahia, essa promessa ganhou forma institucional nas Bases Comunitárias de Segurança, criadas no âmbito do Programa Pacto pela Vida, hoje reformulado como Bahia pela Paz. Em Porto Seguro, a Base Comunitária do Baianão/Frei Calixto foi implantada numa das áreas periféricas mais populosas do município. Passada mais de uma década, porém, permanece em aberto uma questão de fundo: quem controla essa polícia de proximidade, e com que efeitos sobre a sua legitimidade junto às populações negras e quilombolas que ela deveria proteger?</w:t>
       </w:r>
     </w:p>
     <w:p>
@@ -309,7 +309,7 @@
           <w:rFonts w:ascii="Times New Roman" w:hAnsi="Times New Roman" w:eastAsia="Times New Roman" w:cs="Times New Roman"/>
           <w:sz w:val="24"/>
         </w:rPr>
-        <w:t xml:space="preserve">analisar como os mecanismos de controle interno, externo e social do policiamento comunitário no Extremo Sul da Bahia se articulam e em que medida contribuem para a legitimidade democrática da polícia perante as populações negras e quilombolas dos territórios atendidos.</w:t>
+        <w:t xml:space="preserve">analisar em que medida o controle democrático e a accountability do policiamento comunitário, exercidos por instâncias internas, externas e sociais, conferem legitimidade à polícia junto às populações negras e quilombolas do Extremo Sul da Bahia.</w:t>
       </w:r>
     </w:p>
     <w:p>
@@ -380,7 +380,7 @@
           <w:rFonts w:ascii="Times New Roman" w:hAnsi="Times New Roman" w:eastAsia="Times New Roman" w:cs="Times New Roman"/>
           <w:sz w:val="24"/>
         </w:rPr>
-        <w:t xml:space="preserve">compreender as percepções de policiais, gestores e moradores acerca da justiça procedimental, da confiança e da possibilidade de controle da polícia;</w:t>
+        <w:t xml:space="preserve">compreender as percepções de policiais, gestores e moradores acerca da legitimidade da polícia, expressa na justiça procedimental e na confiança, e da possibilidade de controlá-la;</w:t>
       </w:r>
     </w:p>
     <w:p>
@@ -447,7 +447,7 @@
           <w:rFonts w:ascii="Times New Roman" w:hAnsi="Times New Roman" w:eastAsia="Times New Roman" w:cs="Times New Roman"/>
           <w:sz w:val="24"/>
         </w:rPr>
-        <w:t xml:space="preserve">os controles existentes operam de maneira fragmentada, predominantemente reativa e racialmente neutra apenas na aparência, o que produz conformidade com metas, mas pouca legitimidade junto às populações negras e quilombolas. Mecanismos articulados, abertos à participação comunitária e sensíveis às especificidades culturais dos territórios tenderiam a ampliar a confiança na polícia e a percepção de justiça procedimental.</w:t>
+        <w:t xml:space="preserve">o controle democrático e a accountability, tal como hoje operam, conferem pouca legitimidade à polícia junto às populações negras e quilombolas, porque são fragmentados, predominantemente reativos e racialmente neutros apenas na aparência, o que produz conformidade com metas, mas não confiança. Mecanismos articulados, abertos à participação comunitária e sensíveis às especificidades culturais dos territórios tenderiam a ampliar a confiança na polícia e a percepção de justiça procedimental.</w:t>
       </w:r>
     </w:p>
     <w:bookmarkEnd w:id="21"/>
@@ -539,7 +539,7 @@
           <w:rFonts w:ascii="Times New Roman" w:hAnsi="Times New Roman" w:eastAsia="Times New Roman" w:cs="Times New Roman"/>
           <w:sz w:val="24"/>
         </w:rPr>
-        <w:t xml:space="preserve">O quarto eixo confere ao projeto sua lente analítica. Na lição de Almeida (2019), o racismo é estrutural e se reproduz nas instituições mesmo sem intenção explícita, e Bento (2022) descreve o pacto narcísico da branquitude que sustenta essa reprodução nas organizações. No campo penal, Flauzina (2006) interpreta a seletividade do sistema como parte de um projeto genocida dirigido à população negra, leitura que encontra respaldo empírico nos dados sobre homicídio e encarceramento da juventude negra (OLIVEIRA; TORRES; TORRES, 2018) e na análise interseccional do encarceramento feminino negro (OLIVEIRA; SANTOS; ROCHA, 2021; AKOTIRENE, 2019). Especificamente quanto à Polícia Militar da Bahia, Silva (2021) evidenciou as ausências da discussão étnico-racial no currículo de formação policial, e Santos (2025) examinou o impacto da Convenção Interamericana contra o Racismo sobre o sistema de justiça e segurança pública brasileiros, abrindo caminho para pensar o controle da polícia também como obrigação antirracista do Estado. Por fim, as categorias de amefricanidade (GONZALEZ, 1988) e de quilombismo (NASCIMENTO, 1980) permitem compreender periferias negras e comunidades quilombolas não como alvos do policiamento, mas como sujeitos políticos e portadores de formas próprias de organização e de juridicidade, o que dialoga com o pluralismo jurídico e a interculturalidade. É a partir daí que se indaga se o controle democrático e a accountability podem converter o policiamento comunitário em relação efetivamente legítima com esses territórios.</w:t>
+        <w:t xml:space="preserve">O quarto eixo confere ao projeto sua lente analítica. Na lição de Almeida (2019), o racismo é estrutural e se reproduz nas instituições mesmo sem intenção explícita, e Bento (2022) descreve o pacto narcísico da branquitude que sustenta essa reprodução nas organizações. No campo penal, Flauzina (2006) interpreta a seletividade do sistema como parte de um projeto genocida dirigido à população negra, leitura que encontra respaldo empírico nos dados sobre homicídio e encarceramento da juventude negra (OLIVEIRA; TORRES; TORRES, 2018) e na análise interseccional do encarceramento feminino negro (OLIVEIRA; SANTOS; ROCHA, 2021; AKOTIRENE, 2019). Especificamente quanto à Polícia Militar da Bahia, Silva (2021) evidenciou as ausências da discussão étnico-racial no currículo de formação policial, e Santos (2025) examinou o impacto da Convenção Interamericana contra o Racismo sobre o sistema de justiça e segurança pública brasileiros, abrindo caminho para pensar o controle da polícia também como obrigação antirracista do Estado. Por fim, as categorias de amefricanidade (GONZALEZ, 1988) e de quilombismo (NASCIMENTO, 1980) permitem compreender periferias negras e comunidades quilombolas não como alvos do policiamento, mas como sujeitos políticos e portadores de formas próprias de organização e de juridicidade, o que dialoga com o pluralismo jurídico e a interculturalidade. É a partir daí que se indaga em que medida o controle democrático e a accountability conferem legitimidade à polícia nesses territórios.</w:t>
       </w:r>
     </w:p>
     <w:p>
@@ -1393,7 +1393,7 @@
           <w:rFonts w:ascii="Times New Roman" w:hAnsi="Times New Roman" w:eastAsia="Times New Roman" w:cs="Times New Roman"/>
           <w:sz w:val="24"/>
         </w:rPr>
-        <w:t xml:space="preserve">No plano acadêmico, espera-se construir um modelo analítico que compreenda o controle policial como sistema articulado e o relacione à legitimidade, e não apenas à eficiência, incorporando a dimensão racial ao debate sobre accountability policial, contribuição inédita para o estudo do interior baiano. No âmbito da Linha 1, a tese deverá oferecer evidências sobre os processos de legitimação do Estado, a relação entre burocracia policial e sociedade civil e a fiscalização de programas de governo. Por fim, no plano social e profissional, pretende-se entregar à Secretaria da Segurança Pública, ao Ministério Público e aos conselhos comunitários uma matriz de indicadores de legitimidade com recorte étnico-racial, além de divulgar os resultados em artigos científicos e em oficinas devolutivas nas comunidades participantes.</w:t>
+        <w:t xml:space="preserve">No plano acadêmico, espera-se responder em que medida o controle democrático e a accountability conferem legitimidade ao policiamento comunitário junto às populações negras e quilombolas, construindo um modelo analítico que compreenda o controle policial como sistema articulado e o relacione à legitimidade, e não apenas à eficiência, incorporando a dimensão racial ao debate sobre accountability policial, contribuição inédita para o estudo do interior baiano. No âmbito da Linha 1, a tese deverá oferecer evidências sobre os processos de legitimação do Estado, a relação entre burocracia policial e sociedade civil e a fiscalização de programas de governo. Por fim, no plano social e profissional, pretende-se entregar à Secretaria da Segurança Pública, ao Ministério Público e aos conselhos comunitários uma matriz de indicadores de legitimidade com recorte étnico-racial, além de divulgar os resultados em artigos científicos e em oficinas devolutivas nas comunidades participantes.</w:t>
       </w:r>
     </w:p>
     <w:bookmarkEnd w:id="24"/>

</xml_diff>

<commit_message>
Revisa justificativa com base na pergunta de pesquisa
Co-Authored-By: Claude Opus 5.5 <noreply@anthropic.com>
Claude-Session: https://claude.ai/code/session_012kDm3eDcjoxunS5BBjgPmo
</commit_message>
<xml_diff>
--- a/entregas/anteprojeto.docx
+++ b/entregas/anteprojeto.docx
@@ -231,7 +231,7 @@
           <w:rFonts w:ascii="Times New Roman" w:hAnsi="Times New Roman" w:eastAsia="Times New Roman" w:cs="Times New Roman"/>
           <w:sz w:val="24"/>
         </w:rPr>
-        <w:t xml:space="preserve">Do ponto de vista científico, o estudo desloca o debate da eficácia gerencial, isto é, se a polícia entrega resultados, para o problema da legitimação do poder, ou seja, se a polícia é reconhecida como justa e passível de controle pelos grupos que mais sofrem sua ação. Para tanto, articula a teoria da legitimidade procedimental, a literatura brasileira sobre controle da atividade policial e os estudos críticos sobre raça e Estado. Além disso, sua originalidade reside em tratar o controle como sistema, examinando em conjunto corregedoria, Ministério Público, ouvidoria, conselhos comunitários e imprensa, e em fazê-lo numa região interiorana marcada pelo turismo, por periferias urbanas negras e pela presença de povos indígenas e comunidades quilombolas, contexto pouco contemplado por uma produção concentrada nas capitais.</w:t>
+        <w:t xml:space="preserve">Do ponto de vista científico, responder a essa pergunta exige deslocar o debate da eficácia gerencial, isto é, se a polícia entrega resultados, para o problema da legitimação do poder, ou seja, se o controle democrático e a accountability tornam a polícia reconhecida como justa pelos grupos que mais sofrem sua ação. A literatura brasileira tem tratado separadamente o controle da atividade policial e a legitimidade policial, e raramente incorpora a dimensão racial a ambos. Para tanto, o estudo articula a teoria da legitimidade procedimental, a literatura sobre controle da atividade policial e os estudos críticos sobre raça e Estado. Além disso, sua originalidade reside em tratar o controle como sistema, examinando em conjunto corregedoria, Ministério Público, ouvidoria, conselhos comunitários e imprensa, e em fazê-lo numa região interiorana marcada pelo turismo, por periferias urbanas negras e pela presença de povos indígenas e comunidades quilombolas, contexto pouco contemplado por uma produção concentrada nas capitais.</w:t>
       </w:r>
     </w:p>
     <w:p>
@@ -246,7 +246,7 @@
           <w:rFonts w:ascii="Times New Roman" w:hAnsi="Times New Roman" w:eastAsia="Times New Roman" w:cs="Times New Roman"/>
           <w:sz w:val="24"/>
         </w:rPr>
-        <w:t xml:space="preserve">Na dimensão social, a segurança pública constitui questão prioritária para a qualidade de vida no Sul da Bahia. Espera-se que a pesquisa ofereça subsídios para a construção de indicadores de legitimidade com recorte étnico-racial, em diálogo com a agenda do Objetivo de Desenvolvimento Sustentável 18 (Igualdade Étnico-Racial), bem como para o fortalecimento do controle social em âmbito local.</w:t>
+        <w:t xml:space="preserve">Na dimensão social, a segurança pública constitui questão prioritária para a qualidade de vida no Sul da Bahia, e a confiança das populações negras e quilombolas na polícia é condição para que o policiamento comunitário cumpra a sua promessa de prevenção e de coprodução da segurança. Compreender em que medida os controles existentes produzem, ou corroem, essa confiança permite qualificar a própria política pública. Espera-se, assim, que a pesquisa ofereça subsídios para a construção de indicadores de legitimidade com recorte étnico-racial, em diálogo com a agenda do Objetivo de Desenvolvimento Sustentável 18 (Igualdade Étnico-Racial), bem como para o fortalecimento do controle social em âmbito local.</w:t>
       </w:r>
     </w:p>
     <w:p>

</xml_diff>

<commit_message>
Revisa metodologia para exequibilidade em 24 meses
Co-Authored-By: Claude Opus 5.5 <noreply@anthropic.com>
Claude-Session: https://claude.ai/code/session_012kDm3eDcjoxunS5BBjgPmo
</commit_message>
<xml_diff>
--- a/entregas/anteprojeto.docx
+++ b/entregas/anteprojeto.docx
@@ -586,7 +586,22 @@
           <w:rFonts w:ascii="Times New Roman" w:hAnsi="Times New Roman" w:eastAsia="Times New Roman" w:cs="Times New Roman"/>
           <w:sz w:val="24"/>
         </w:rPr>
-        <w:t xml:space="preserve">Trata-se de pesquisa de abordagem qualitativa, com apoio quantitativo descritivo, delineada como estudo de casos múltiplos em três recortes territoriais do Extremo Sul da Bahia. O caso principal é Porto Seguro, onde funciona a Base Comunitária de Segurança do Baianão/Frei Calixto e que registra a maior taxa de mortes por intervenção policial do país entre os de mais de 100 mil habitantes. Eunápolis, segunda colocada nesse indicador e sem base comunitária identificada, funcionará como caso de contraste. O terceiro recorte abrange comunidades quilombolas certificadas pela Fundação Cultural Palmares nos municípios de Caravelas e Nova Viçosa, como Volta Miúda e Helvécia, permitindo examinar a relação entre polícia e comunidades tradicionais. O quadro a seguir relaciona cada objetivo específico às fontes, aos instrumentos e à forma de análise.</w:t>
+        <w:t xml:space="preserve">Trata-se de pesquisa de abordagem qualitativa, com apoio quantitativo descritivo, delineada como estudo de casos múltiplos em três territórios do Extremo Sul da Bahia, escolhidos por sua relação direta com a pergunta de pesquisa. O caso principal é a área da Base Comunitária de Segurança do Baianão/Frei Calixto, em Porto Seguro, município que registra a maior taxa de mortes por intervenção policial do país entre os de mais de 100 mil habitantes. Eunápolis, segunda colocada nesse indicador e sem base comunitária identificada, funcionará como caso de contraste. O terceiro território é a comunidade quilombola de Helvécia, em Nova Viçosa, certificada pela Fundação Cultural Palmares, que permite examinar a relação entre polícia e comunidades tradicionais. A delimitação a três territórios da mesma região, acessíveis por rodovia a partir de Porto Seguro, torna o trabalho de campo exequível em 24 meses.</w:t>
+      </w:r>
+    </w:p>
+    <w:p>
+      <w:pPr>
+        <w:pStyle w:val="BodyText"/>
+        <w:spacing w:line="360" w:lineRule="auto" w:before="0" w:after="120"/>
+        <w:ind w:firstLine="709"/>
+        <w:jc w:val="both"/>
+      </w:pPr>
+      <w:r>
+        <w:rPr>
+          <w:rFonts w:ascii="Times New Roman" w:hAnsi="Times New Roman" w:eastAsia="Times New Roman" w:cs="Times New Roman"/>
+          <w:sz w:val="24"/>
+        </w:rPr>
+        <w:t xml:space="preserve">Cada termo da pergunta corresponde a um procedimento. O controle democrático e a accountability serão apreendidos pela análise documental das instâncias de controle e pelas entrevistas com seus agentes. A legitimidade será medida por questionário com escala de justiça procedimental, confiança e dever de obediência, adaptada do modelo de mensuração validado por Oliveira, Oliveira e Adorno (2019), e aprofundada em grupos focais. A dimensão racial atravessará todos os instrumentos, por meio da desagregação dos dados por raça/cor e da comparação entre os territórios. O quadro a seguir sintetiza esse desenho.</w:t>
       </w:r>
     </w:p>
     <w:p>
@@ -602,7 +617,7 @@
           <w:b/>
           <w:sz w:val="20"/>
         </w:rPr>
-        <w:t xml:space="preserve">Quadro 1 – Relação entre objetivos, fontes, instrumentos e análise</w:t>
+        <w:t xml:space="preserve">Quadro 1 – Relação entre objetivos, fontes, instrumentos, análise e período</w:t>
       </w:r>
     </w:p>
     <w:tbl>
@@ -622,10 +637,11 @@
         <w:tblLayout w:type="fixed"/>
       </w:tblPr>
       <w:tblGrid>
-        <w:gridCol w:w="2041"/>
-        <w:gridCol w:w="3175"/>
-        <w:gridCol w:w="2268"/>
-        <w:gridCol w:w="2154"/>
+        <w:gridCol w:w="1757"/>
+        <w:gridCol w:w="2778"/>
+        <w:gridCol w:w="1871"/>
+        <w:gridCol w:w="1927"/>
+        <w:gridCol w:w="1304"/>
       </w:tblGrid>
       <w:tr>
         <w:trPr>
@@ -635,7 +651,7 @@
         </w:trPr>
         <w:tc>
           <w:tcPr>
-            <w:tcW w:type="dxa" w:w="2041"/>
+            <w:tcW w:type="dxa" w:w="1757"/>
             <w:tcMar>
               <w:top w:w="70" w:type="dxa"/>
               <w:bottom w:w="70" w:type="dxa"/>
@@ -663,7 +679,7 @@
         </w:tc>
         <w:tc>
           <w:tcPr>
-            <w:tcW w:type="dxa" w:w="3175"/>
+            <w:tcW w:type="dxa" w:w="2778"/>
             <w:tcMar>
               <w:top w:w="70" w:type="dxa"/>
               <w:bottom w:w="70" w:type="dxa"/>
@@ -691,7 +707,7 @@
         </w:tc>
         <w:tc>
           <w:tcPr>
-            <w:tcW w:type="dxa" w:w="2268"/>
+            <w:tcW w:type="dxa" w:w="1871"/>
             <w:tcMar>
               <w:top w:w="70" w:type="dxa"/>
               <w:bottom w:w="70" w:type="dxa"/>
@@ -719,7 +735,7 @@
         </w:tc>
         <w:tc>
           <w:tcPr>
-            <w:tcW w:type="dxa" w:w="2154"/>
+            <w:tcW w:type="dxa" w:w="1928"/>
             <w:tcMar>
               <w:top w:w="70" w:type="dxa"/>
               <w:bottom w:w="70" w:type="dxa"/>
@@ -745,6 +761,34 @@
             </w:r>
           </w:p>
         </w:tc>
+        <w:tc>
+          <w:tcPr>
+            <w:tcW w:type="dxa" w:w="1304"/>
+            <w:tcMar>
+              <w:top w:w="70" w:type="dxa"/>
+              <w:bottom w:w="70" w:type="dxa"/>
+              <w:left w:w="100" w:type="dxa"/>
+              <w:right w:w="100" w:type="dxa"/>
+            </w:tcMar>
+            <w:vAlign w:val="center"/>
+            <w:shd w:val="clear" w:color="auto" w:fill="BFBFBF"/>
+          </w:tcPr>
+          <w:p>
+            <w:pPr>
+              <w:pStyle w:val="Compact"/>
+              <w:spacing w:line="240" w:lineRule="auto" w:after="0"/>
+              <w:jc w:val="center"/>
+            </w:pPr>
+            <w:r>
+              <w:rPr>
+                <w:rFonts w:ascii="Times New Roman" w:hAnsi="Times New Roman" w:eastAsia="Times New Roman" w:cs="Times New Roman"/>
+                <w:b/>
+                <w:sz w:val="20"/>
+              </w:rPr>
+              <w:t xml:space="preserve">Período</w:t>
+            </w:r>
+          </w:p>
+        </w:tc>
       </w:tr>
       <w:tr>
         <w:trPr>
@@ -752,7 +796,7 @@
         </w:trPr>
         <w:tc>
           <w:tcPr>
-            <w:tcW w:type="dxa" w:w="2041"/>
+            <w:tcW w:type="dxa" w:w="1757"/>
             <w:tcMar>
               <w:top w:w="70" w:type="dxa"/>
               <w:bottom w:w="70" w:type="dxa"/>
@@ -780,7 +824,7 @@
         </w:tc>
         <w:tc>
           <w:tcPr>
-            <w:tcW w:type="dxa" w:w="3175"/>
+            <w:tcW w:type="dxa" w:w="2778"/>
             <w:tcMar>
               <w:top w:w="70" w:type="dxa"/>
               <w:bottom w:w="70" w:type="dxa"/>
@@ -801,13 +845,13 @@
                 <w:rFonts w:ascii="Times New Roman" w:hAnsi="Times New Roman" w:eastAsia="Times New Roman" w:cs="Times New Roman"/>
                 <w:sz w:val="20"/>
               </w:rPr>
-              <w:t xml:space="preserve">Normas, relatórios da Corregedoria, do MP-BA e da Ouvidoria; atas de conselhos comunitários</w:t>
+              <w:t xml:space="preserve">Normas, relatórios da Corregedoria, do MP-BA e da Ouvidoria; atas do conselho comunitário</w:t>
             </w:r>
           </w:p>
         </w:tc>
         <w:tc>
           <w:tcPr>
-            <w:tcW w:type="dxa" w:w="2268"/>
+            <w:tcW w:type="dxa" w:w="1871"/>
             <w:tcMar>
               <w:top w:w="70" w:type="dxa"/>
               <w:bottom w:w="70" w:type="dxa"/>
@@ -834,7 +878,7 @@
         </w:tc>
         <w:tc>
           <w:tcPr>
-            <w:tcW w:type="dxa" w:w="2154"/>
+            <w:tcW w:type="dxa" w:w="1928"/>
             <w:tcMar>
               <w:top w:w="70" w:type="dxa"/>
               <w:bottom w:w="70" w:type="dxa"/>
@@ -855,7 +899,34 @@
                 <w:rFonts w:ascii="Times New Roman" w:hAnsi="Times New Roman" w:eastAsia="Times New Roman" w:cs="Times New Roman"/>
                 <w:sz w:val="20"/>
               </w:rPr>
-              <w:t xml:space="preserve">Análise documental e de fluxos institucionais</w:t>
+              <w:t xml:space="preserve">Análise documental e de fluxos</w:t>
+            </w:r>
+          </w:p>
+        </w:tc>
+        <w:tc>
+          <w:tcPr>
+            <w:tcW w:type="dxa" w:w="1304"/>
+            <w:tcMar>
+              <w:top w:w="70" w:type="dxa"/>
+              <w:bottom w:w="70" w:type="dxa"/>
+              <w:left w:w="100" w:type="dxa"/>
+              <w:right w:w="100" w:type="dxa"/>
+            </w:tcMar>
+            <w:vAlign w:val="center"/>
+            <w:shd w:val="clear" w:color="auto" w:fill="FFFFFF"/>
+          </w:tcPr>
+          <w:p>
+            <w:pPr>
+              <w:pStyle w:val="Compact"/>
+              <w:spacing w:line="240" w:lineRule="auto" w:after="0"/>
+              <w:jc w:val="left"/>
+            </w:pPr>
+            <w:r>
+              <w:rPr>
+                <w:rFonts w:ascii="Times New Roman" w:hAnsi="Times New Roman" w:eastAsia="Times New Roman" w:cs="Times New Roman"/>
+                <w:sz w:val="20"/>
+              </w:rPr>
+              <w:t xml:space="preserve">Meses 1 a 8</w:t>
             </w:r>
           </w:p>
         </w:tc>
@@ -866,7 +937,7 @@
         </w:trPr>
         <w:tc>
           <w:tcPr>
-            <w:tcW w:type="dxa" w:w="2041"/>
+            <w:tcW w:type="dxa" w:w="1757"/>
             <w:tcMar>
               <w:top w:w="70" w:type="dxa"/>
               <w:bottom w:w="70" w:type="dxa"/>
@@ -894,7 +965,7 @@
         </w:tc>
         <w:tc>
           <w:tcPr>
-            <w:tcW w:type="dxa" w:w="3175"/>
+            <w:tcW w:type="dxa" w:w="2778"/>
             <w:tcMar>
               <w:top w:w="70" w:type="dxa"/>
               <w:bottom w:w="70" w:type="dxa"/>
@@ -915,13 +986,13 @@
                 <w:rFonts w:ascii="Times New Roman" w:hAnsi="Times New Roman" w:eastAsia="Times New Roman" w:cs="Times New Roman"/>
                 <w:sz w:val="20"/>
               </w:rPr>
-              <w:t xml:space="preserve">Bases de dados da SSP-BA, planos de metas e registros de mortes por intervenção policial desagregados por raça/cor</w:t>
+              <w:t xml:space="preserve">Dados da SSP-BA e do FBSP sobre mortes por intervenção policial, por raça/cor (2015-2025)</w:t>
             </w:r>
           </w:p>
         </w:tc>
         <w:tc>
           <w:tcPr>
-            <w:tcW w:type="dxa" w:w="2268"/>
+            <w:tcW w:type="dxa" w:w="1871"/>
             <w:tcMar>
               <w:top w:w="70" w:type="dxa"/>
               <w:bottom w:w="70" w:type="dxa"/>
@@ -942,13 +1013,13 @@
                 <w:rFonts w:ascii="Times New Roman" w:hAnsi="Times New Roman" w:eastAsia="Times New Roman" w:cs="Times New Roman"/>
                 <w:sz w:val="20"/>
               </w:rPr>
-              <w:t xml:space="preserve">Coleta de séries históricas (2015-2026)</w:t>
+              <w:t xml:space="preserve">Coleta de séries históricas</w:t>
             </w:r>
           </w:p>
         </w:tc>
         <w:tc>
           <w:tcPr>
-            <w:tcW w:type="dxa" w:w="2154"/>
+            <w:tcW w:type="dxa" w:w="1928"/>
             <w:tcMar>
               <w:top w:w="70" w:type="dxa"/>
               <w:bottom w:w="70" w:type="dxa"/>
@@ -973,6 +1044,33 @@
             </w:r>
           </w:p>
         </w:tc>
+        <w:tc>
+          <w:tcPr>
+            <w:tcW w:type="dxa" w:w="1304"/>
+            <w:tcMar>
+              <w:top w:w="70" w:type="dxa"/>
+              <w:bottom w:w="70" w:type="dxa"/>
+              <w:left w:w="100" w:type="dxa"/>
+              <w:right w:w="100" w:type="dxa"/>
+            </w:tcMar>
+            <w:vAlign w:val="center"/>
+            <w:shd w:val="clear" w:color="auto" w:fill="EDEDED"/>
+          </w:tcPr>
+          <w:p>
+            <w:pPr>
+              <w:pStyle w:val="Compact"/>
+              <w:spacing w:line="240" w:lineRule="auto" w:after="0"/>
+              <w:jc w:val="left"/>
+            </w:pPr>
+            <w:r>
+              <w:rPr>
+                <w:rFonts w:ascii="Times New Roman" w:hAnsi="Times New Roman" w:eastAsia="Times New Roman" w:cs="Times New Roman"/>
+                <w:sz w:val="20"/>
+              </w:rPr>
+              <w:t xml:space="preserve">Meses 1 a 8</w:t>
+            </w:r>
+          </w:p>
+        </w:tc>
       </w:tr>
       <w:tr>
         <w:trPr>
@@ -980,7 +1078,7 @@
         </w:trPr>
         <w:tc>
           <w:tcPr>
-            <w:tcW w:type="dxa" w:w="2041"/>
+            <w:tcW w:type="dxa" w:w="1757"/>
             <w:tcMar>
               <w:top w:w="70" w:type="dxa"/>
               <w:bottom w:w="70" w:type="dxa"/>
@@ -1008,7 +1106,7 @@
         </w:tc>
         <w:tc>
           <w:tcPr>
-            <w:tcW w:type="dxa" w:w="3175"/>
+            <w:tcW w:type="dxa" w:w="2778"/>
             <w:tcMar>
               <w:top w:w="70" w:type="dxa"/>
               <w:bottom w:w="70" w:type="dxa"/>
@@ -1029,13 +1127,13 @@
                 <w:rFonts w:ascii="Times New Roman" w:hAnsi="Times New Roman" w:eastAsia="Times New Roman" w:cs="Times New Roman"/>
                 <w:sz w:val="20"/>
               </w:rPr>
-              <w:t xml:space="preserve">Cerca de 30 participantes: policiais, gestores, promotores de justiça, conselheiros e lideranças comunitárias e quilombolas</w:t>
+              <w:t xml:space="preserve">30 entrevistados: 8 policiais e gestores, 2 promotores, 2 da Corregedoria e da Ouvidoria, 6 conselheiros e 12 lideranças comunitárias e quilombolas</w:t>
             </w:r>
           </w:p>
         </w:tc>
         <w:tc>
           <w:tcPr>
-            <w:tcW w:type="dxa" w:w="2268"/>
+            <w:tcW w:type="dxa" w:w="1871"/>
             <w:tcMar>
               <w:top w:w="70" w:type="dxa"/>
               <w:bottom w:w="70" w:type="dxa"/>
@@ -1062,7 +1160,7 @@
         </w:tc>
         <w:tc>
           <w:tcPr>
-            <w:tcW w:type="dxa" w:w="2154"/>
+            <w:tcW w:type="dxa" w:w="1928"/>
             <w:tcMar>
               <w:top w:w="70" w:type="dxa"/>
               <w:bottom w:w="70" w:type="dxa"/>
@@ -1087,6 +1185,33 @@
             </w:r>
           </w:p>
         </w:tc>
+        <w:tc>
+          <w:tcPr>
+            <w:tcW w:type="dxa" w:w="1304"/>
+            <w:tcMar>
+              <w:top w:w="70" w:type="dxa"/>
+              <w:bottom w:w="70" w:type="dxa"/>
+              <w:left w:w="100" w:type="dxa"/>
+              <w:right w:w="100" w:type="dxa"/>
+            </w:tcMar>
+            <w:vAlign w:val="center"/>
+            <w:shd w:val="clear" w:color="auto" w:fill="FFFFFF"/>
+          </w:tcPr>
+          <w:p>
+            <w:pPr>
+              <w:pStyle w:val="Compact"/>
+              <w:spacing w:line="240" w:lineRule="auto" w:after="0"/>
+              <w:jc w:val="left"/>
+            </w:pPr>
+            <w:r>
+              <w:rPr>
+                <w:rFonts w:ascii="Times New Roman" w:hAnsi="Times New Roman" w:eastAsia="Times New Roman" w:cs="Times New Roman"/>
+                <w:sz w:val="20"/>
+              </w:rPr>
+              <w:t xml:space="preserve">Meses 9 a 18</w:t>
+            </w:r>
+          </w:p>
+        </w:tc>
       </w:tr>
       <w:tr>
         <w:trPr>
@@ -1094,7 +1219,7 @@
         </w:trPr>
         <w:tc>
           <w:tcPr>
-            <w:tcW w:type="dxa" w:w="2041"/>
+            <w:tcW w:type="dxa" w:w="1757"/>
             <w:tcMar>
               <w:top w:w="70" w:type="dxa"/>
               <w:bottom w:w="70" w:type="dxa"/>
@@ -1122,7 +1247,7 @@
         </w:tc>
         <w:tc>
           <w:tcPr>
-            <w:tcW w:type="dxa" w:w="3175"/>
+            <w:tcW w:type="dxa" w:w="2778"/>
             <w:tcMar>
               <w:top w:w="70" w:type="dxa"/>
               <w:bottom w:w="70" w:type="dxa"/>
@@ -1143,13 +1268,13 @@
                 <w:rFonts w:ascii="Times New Roman" w:hAnsi="Times New Roman" w:eastAsia="Times New Roman" w:cs="Times New Roman"/>
                 <w:sz w:val="20"/>
               </w:rPr>
-              <w:t xml:space="preserve">Moradores do Baianão e de Eunápolis e membros das comunidades quilombolas</w:t>
+              <w:t xml:space="preserve">Cerca de 120 moradores (40 por território) e 3 grupos focais, um por território</w:t>
             </w:r>
           </w:p>
         </w:tc>
         <w:tc>
           <w:tcPr>
-            <w:tcW w:type="dxa" w:w="2268"/>
+            <w:tcW w:type="dxa" w:w="1871"/>
             <w:tcMar>
               <w:top w:w="70" w:type="dxa"/>
               <w:bottom w:w="70" w:type="dxa"/>
@@ -1170,13 +1295,13 @@
                 <w:rFonts w:ascii="Times New Roman" w:hAnsi="Times New Roman" w:eastAsia="Times New Roman" w:cs="Times New Roman"/>
                 <w:sz w:val="20"/>
               </w:rPr>
-              <w:t xml:space="preserve">Grupos focais (de dois a quatro) e questionário breve sobre confiança</w:t>
+              <w:t xml:space="preserve">Questionário com escala de legitimidade e grupos focais</w:t>
             </w:r>
           </w:p>
         </w:tc>
         <w:tc>
           <w:tcPr>
-            <w:tcW w:type="dxa" w:w="2154"/>
+            <w:tcW w:type="dxa" w:w="1928"/>
             <w:tcMar>
               <w:top w:w="70" w:type="dxa"/>
               <w:bottom w:w="70" w:type="dxa"/>
@@ -1197,7 +1322,34 @@
                 <w:rFonts w:ascii="Times New Roman" w:hAnsi="Times New Roman" w:eastAsia="Times New Roman" w:cs="Times New Roman"/>
                 <w:sz w:val="20"/>
               </w:rPr>
-              <w:t xml:space="preserve">Análise comparativa e interseccional</w:t>
+              <w:t xml:space="preserve">Estatística descritiva e análise interseccional</w:t>
+            </w:r>
+          </w:p>
+        </w:tc>
+        <w:tc>
+          <w:tcPr>
+            <w:tcW w:type="dxa" w:w="1304"/>
+            <w:tcMar>
+              <w:top w:w="70" w:type="dxa"/>
+              <w:bottom w:w="70" w:type="dxa"/>
+              <w:left w:w="100" w:type="dxa"/>
+              <w:right w:w="100" w:type="dxa"/>
+            </w:tcMar>
+            <w:vAlign w:val="center"/>
+            <w:shd w:val="clear" w:color="auto" w:fill="EDEDED"/>
+          </w:tcPr>
+          <w:p>
+            <w:pPr>
+              <w:pStyle w:val="Compact"/>
+              <w:spacing w:line="240" w:lineRule="auto" w:after="0"/>
+              <w:jc w:val="left"/>
+            </w:pPr>
+            <w:r>
+              <w:rPr>
+                <w:rFonts w:ascii="Times New Roman" w:hAnsi="Times New Roman" w:eastAsia="Times New Roman" w:cs="Times New Roman"/>
+                <w:sz w:val="20"/>
+              </w:rPr>
+              <w:t xml:space="preserve">Meses 9 a 18</w:t>
             </w:r>
           </w:p>
         </w:tc>
@@ -1208,7 +1360,7 @@
         </w:trPr>
         <w:tc>
           <w:tcPr>
-            <w:tcW w:type="dxa" w:w="2041"/>
+            <w:tcW w:type="dxa" w:w="1757"/>
             <w:tcMar>
               <w:top w:w="70" w:type="dxa"/>
               <w:bottom w:w="70" w:type="dxa"/>
@@ -1236,7 +1388,7 @@
         </w:tc>
         <w:tc>
           <w:tcPr>
-            <w:tcW w:type="dxa" w:w="3175"/>
+            <w:tcW w:type="dxa" w:w="2778"/>
             <w:tcMar>
               <w:top w:w="70" w:type="dxa"/>
               <w:bottom w:w="70" w:type="dxa"/>
@@ -1263,7 +1415,7 @@
         </w:tc>
         <w:tc>
           <w:tcPr>
-            <w:tcW w:type="dxa" w:w="2268"/>
+            <w:tcW w:type="dxa" w:w="1871"/>
             <w:tcMar>
               <w:top w:w="70" w:type="dxa"/>
               <w:bottom w:w="70" w:type="dxa"/>
@@ -1290,7 +1442,7 @@
         </w:tc>
         <w:tc>
           <w:tcPr>
-            <w:tcW w:type="dxa" w:w="2154"/>
+            <w:tcW w:type="dxa" w:w="1928"/>
             <w:tcMar>
               <w:top w:w="70" w:type="dxa"/>
               <w:bottom w:w="70" w:type="dxa"/>
@@ -1315,6 +1467,33 @@
             </w:r>
           </w:p>
         </w:tc>
+        <w:tc>
+          <w:tcPr>
+            <w:tcW w:type="dxa" w:w="1304"/>
+            <w:tcMar>
+              <w:top w:w="70" w:type="dxa"/>
+              <w:bottom w:w="70" w:type="dxa"/>
+              <w:left w:w="100" w:type="dxa"/>
+              <w:right w:w="100" w:type="dxa"/>
+            </w:tcMar>
+            <w:vAlign w:val="center"/>
+            <w:shd w:val="clear" w:color="auto" w:fill="FFFFFF"/>
+          </w:tcPr>
+          <w:p>
+            <w:pPr>
+              <w:pStyle w:val="Compact"/>
+              <w:spacing w:line="240" w:lineRule="auto" w:after="0"/>
+              <w:jc w:val="left"/>
+            </w:pPr>
+            <w:r>
+              <w:rPr>
+                <w:rFonts w:ascii="Times New Roman" w:hAnsi="Times New Roman" w:eastAsia="Times New Roman" w:cs="Times New Roman"/>
+                <w:sz w:val="20"/>
+              </w:rPr>
+              <w:t xml:space="preserve">Meses 19 a 24</w:t>
+            </w:r>
+          </w:p>
+        </w:tc>
       </w:tr>
     </w:tbl>
     <w:p>
@@ -1347,6 +1526,37 @@
           <w:b/>
           <w:sz w:val="24"/>
         </w:rPr>
+        <w:t xml:space="preserve">Viabilidade e riscos.</w:t>
+      </w:r>
+      <w:r>
+        <w:rPr>
+          <w:rFonts w:ascii="Times New Roman" w:hAnsi="Times New Roman" w:eastAsia="Times New Roman" w:cs="Times New Roman"/>
+          <w:sz w:val="24"/>
+        </w:rPr>
+        <w:t xml:space="preserve"> </w:t>
+      </w:r>
+      <w:r>
+        <w:rPr>
+          <w:rFonts w:ascii="Times New Roman" w:hAnsi="Times New Roman" w:eastAsia="Times New Roman" w:cs="Times New Roman"/>
+          <w:sz w:val="24"/>
+        </w:rPr>
+        <w:t xml:space="preserve">Os dados por raça/cor podem não estar disponíveis em todas as bases da SSP-BA. Nesse caso, serão utilizados os dados do Fórum Brasileiro de Segurança Pública e reiterados os pedidos via Lei de Acesso à Informação. Eventual recusa de anuência da Polícia Militar não inviabiliza o estudo, pois a análise documental, os questionários e os grupos focais com moradores independem dela.</w:t>
+      </w:r>
+    </w:p>
+    <w:p>
+      <w:pPr>
+        <w:pStyle w:val="BodyText"/>
+        <w:spacing w:line="360" w:lineRule="auto" w:before="0" w:after="120"/>
+        <w:ind w:firstLine="709"/>
+        <w:jc w:val="both"/>
+      </w:pPr>
+      <w:r>
+        <w:rPr>
+          <w:bCs/>
+          <w:rFonts w:ascii="Times New Roman" w:hAnsi="Times New Roman" w:eastAsia="Times New Roman" w:cs="Times New Roman"/>
+          <w:b/>
+          <w:sz w:val="24"/>
+        </w:rPr>
         <w:t xml:space="preserve">Considerações éticas.</w:t>
       </w:r>
       <w:r>
@@ -1361,7 +1571,7 @@
           <w:rFonts w:ascii="Times New Roman" w:hAnsi="Times New Roman" w:eastAsia="Times New Roman" w:cs="Times New Roman"/>
           <w:sz w:val="24"/>
         </w:rPr>
-        <w:t xml:space="preserve">O projeto será submetido ao Comitê de Ética em Pesquisa, nos termos das Resoluções CNS nº 466/2012 e nº 510/2016, assegurando-se o consentimento livre e esclarecido e o anonimato dos participantes. No caso de povos indígenas e comunidades tradicionais, haverá consulta prévia às lideranças e, quando exigido, apreciação pela Comissão Nacional de Ética em Pesquisa. De igual modo, será solicitada a anuência institucional da Polícia Militar. O vínculo profissional do pesquisador com a instituição estudada será tratado com reflexividade, reconhecido tanto como limite potencial quanto como condição privilegiada de acesso ao campo.</w:t>
+        <w:t xml:space="preserve">O projeto será submetido ao Comitê de Ética em Pesquisa, nos termos das Resoluções CNS nº 466/2012 e nº 510/2016, assegurando-se o consentimento livre e esclarecido e o anonimato dos participantes. Na comunidade quilombola, a pesquisa será precedida de consulta à associação representativa e de anuência formal das lideranças. De igual modo, será solicitada a anuência institucional da Polícia Militar. O vínculo profissional do pesquisador com a instituição estudada será tratado com reflexividade, reconhecido tanto como limite potencial quanto como condição privilegiada de acesso ao campo.</w:t>
       </w:r>
     </w:p>
     <w:bookmarkEnd w:id="23"/>
@@ -1567,7 +1777,7 @@
                 <w:rFonts w:ascii="Times New Roman" w:hAnsi="Times New Roman" w:eastAsia="Times New Roman" w:cs="Times New Roman"/>
                 <w:sz w:val="20"/>
               </w:rPr>
-              <w:t xml:space="preserve">Cumprimento de disciplinas; revisão de literatura; pesquisa documental e pedidos via Lei de Acesso à Informação; submissão ao Comitê de Ética</w:t>
+              <w:t xml:space="preserve">Cumprimento de disciplinas; revisão de literatura; pesquisa documental e pedidos via Lei de Acesso à Informação (meses 1 a 8); submissão ao Comitê de Ética (mês 3); início das entrevistas e dos questionários após a aprovação (mês 9)</w:t>
             </w:r>
           </w:p>
         </w:tc>
@@ -1627,7 +1837,7 @@
                 <w:rFonts w:ascii="Times New Roman" w:hAnsi="Times New Roman" w:eastAsia="Times New Roman" w:cs="Times New Roman"/>
                 <w:sz w:val="20"/>
               </w:rPr>
-              <w:t xml:space="preserve">Entrevistas e grupos focais; análise das séries de indicadores; exame de qualificação</w:t>
+              <w:t xml:space="preserve">Conclusão das entrevistas, dos questionários e dos grupos focais (até o mês 18); exame de qualificação; oficina devolutiva (meses 19 a 24)</w:t>
             </w:r>
           </w:p>
         </w:tc>
@@ -1687,7 +1897,7 @@
                 <w:rFonts w:ascii="Times New Roman" w:hAnsi="Times New Roman" w:eastAsia="Times New Roman" w:cs="Times New Roman"/>
                 <w:sz w:val="20"/>
               </w:rPr>
-              <w:t xml:space="preserve">Análise dos dados; publicação de artigos; oficina devolutiva</w:t>
+              <w:t xml:space="preserve">Análise integrada dos dados; publicação de artigos</w:t>
             </w:r>
           </w:p>
         </w:tc>
@@ -1747,7 +1957,7 @@
                 <w:rFonts w:ascii="Times New Roman" w:hAnsi="Times New Roman" w:eastAsia="Times New Roman" w:cs="Times New Roman"/>
                 <w:sz w:val="20"/>
               </w:rPr>
-              <w:t xml:space="preserve">Elaboração da matriz de indicadores; redação final; defesa</w:t>
+              <w:t xml:space="preserve">Consolidação da matriz de indicadores; redação final; defesa</w:t>
             </w:r>
           </w:p>
         </w:tc>

</xml_diff>

<commit_message>
Revisa resultados esperados conforme item 5.2.3 do edital
Co-Authored-By: Claude Opus 5.5 <noreply@anthropic.com>
Claude-Session: https://claude.ai/code/session_012kDm3eDcjoxunS5BBjgPmo
</commit_message>
<xml_diff>
--- a/entregas/anteprojeto.docx
+++ b/entregas/anteprojeto.docx
@@ -1603,7 +1603,22 @@
           <w:rFonts w:ascii="Times New Roman" w:hAnsi="Times New Roman" w:eastAsia="Times New Roman" w:cs="Times New Roman"/>
           <w:sz w:val="24"/>
         </w:rPr>
-        <w:t xml:space="preserve">No plano acadêmico, espera-se responder em que medida o controle democrático e a accountability conferem legitimidade ao policiamento comunitário junto às populações negras e quilombolas, construindo um modelo analítico que compreenda o controle policial como sistema articulado e o relacione à legitimidade, e não apenas à eficiência, incorporando a dimensão racial ao debate sobre accountability policial, contribuição inédita para o estudo do interior baiano. No âmbito da Linha 1, a tese deverá oferecer evidências sobre os processos de legitimação do Estado, a relação entre burocracia policial e sociedade civil e a fiscalização de programas de governo. Por fim, no plano social e profissional, pretende-se entregar à Secretaria da Segurança Pública, ao Ministério Público e aos conselhos comunitários uma matriz de indicadores de legitimidade com recorte étnico-racial, além de divulgar os resultados em artigos científicos e em oficinas devolutivas nas comunidades participantes.</w:t>
+        <w:t xml:space="preserve">Espera-se, em primeiro lugar, responder em que medida o controle democrático e a accountability conferem legitimidade ao policiamento comunitário junto às populações negras e quilombolas do Extremo Sul da Bahia. Para a área de conhecimento, a principal contribuição será um modelo analítico que articule, num mesmo quadro, controle policial, legitimidade e raça, dimensões que a literatura brasileira costuma examinar separadamente. A originalidade reside, ainda, na aplicação de uma escala validada de legitimidade policial a territórios interioranos, periféricos e quilombolas, contexto ausente dos estudos concentrados nas capitais. No âmbito da Linha 1, a tese oferecerá evidências empíricas sobre os processos de legitimação do Estado, a relação entre burocracia policial e sociedade civil e a fiscalização de programas de governo.</w:t>
+      </w:r>
+    </w:p>
+    <w:p>
+      <w:pPr>
+        <w:pStyle w:val="BodyText"/>
+        <w:spacing w:line="360" w:lineRule="auto" w:before="0" w:after="120"/>
+        <w:ind w:firstLine="709"/>
+        <w:jc w:val="both"/>
+      </w:pPr>
+      <w:r>
+        <w:rPr>
+          <w:rFonts w:ascii="Times New Roman" w:hAnsi="Times New Roman" w:eastAsia="Times New Roman" w:cs="Times New Roman"/>
+          <w:sz w:val="24"/>
+        </w:rPr>
+        <w:t xml:space="preserve">Para a sociedade, o principal produto será a matriz de indicadores de legitimidade com recorte étnico-racial, construída com os atores locais e alinhada à agenda do ODS 18. Ela será entregue à Secretaria da Segurança Pública, ao Ministério Público e aos conselhos comunitários, e os resultados serão apresentados à comunidade de Helvécia e aos moradores do Baianão e de Eunápolis em oficinas devolutivas. Para o campo profissional, espera-se oferecer subsídios à formação policial e à atuação das instâncias de controle, de modo a que a avaliação do policiamento comunitário considere não apenas o que a polícia produz, mas também como e sobre quem ela atua. Por fim, estão previstos ao menos dois artigos em periódicos da área e a apresentação dos resultados em eventos científicos.</w:t>
       </w:r>
     </w:p>
     <w:bookmarkEnd w:id="24"/>

</xml_diff>

<commit_message>
Revisa introdução e partes restantes
Co-Authored-By: Claude Opus 5.5 <noreply@anthropic.com>
Claude-Session: https://claude.ai/code/session_012kDm3eDcjoxunS5BBjgPmo
</commit_message>
<xml_diff>
--- a/entregas/anteprojeto.docx
+++ b/entregas/anteprojeto.docx
@@ -140,7 +140,7 @@
           <w:rFonts w:ascii="Times New Roman" w:hAnsi="Times New Roman" w:eastAsia="Times New Roman" w:cs="Times New Roman"/>
           <w:sz w:val="24"/>
         </w:rPr>
-        <w:t xml:space="preserve">O policiamento comunitário chegou ao Brasil com uma promessa ambiciosa: aproximar a polícia da população e transformar a segurança pública numa tarefa compartilhada, voltada à prevenção e à redução do medo do crime. Na Bahia, essa promessa ganhou forma institucional nas Bases Comunitárias de Segurança, criadas no âmbito do Programa Pacto pela Vida, hoje reformulado como Bahia pela Paz. Em Porto Seguro, a Base Comunitária do Baianão/Frei Calixto foi implantada numa das áreas periféricas mais populosas do município. Passada mais de uma década, porém, permanece em aberto uma questão de fundo: quem controla essa polícia de proximidade, e com que efeitos sobre a sua legitimidade junto às populações negras e quilombolas que ela deveria proteger?</w:t>
+        <w:t xml:space="preserve">O policiamento comunitário chegou ao Brasil com uma promessa ambiciosa: aproximar a polícia da população e transformar a segurança pública numa tarefa compartilhada, voltada à prevenção e à redução do medo do crime. Na Bahia, essa promessa ganhou forma institucional nas Bases Comunitárias de Segurança, criadas no âmbito do Programa Pacto pela Vida, hoje reformulado como Bahia pela Paz. Em Porto Seguro, a Base Comunitária do Baianão/Frei Calixto foi implantada numa área periférica do município. Passada mais de uma década, porém, permanece em aberto uma questão de fundo: quem controla essa polícia de proximidade, e com que efeitos sobre a sua legitimidade junto às populações negras e quilombolas que ela deveria proteger?</w:t>
       </w:r>
     </w:p>
     <w:p>
@@ -155,7 +155,7 @@
           <w:rFonts w:ascii="Times New Roman" w:hAnsi="Times New Roman" w:eastAsia="Times New Roman" w:cs="Times New Roman"/>
           <w:sz w:val="24"/>
         </w:rPr>
-        <w:t xml:space="preserve">É nesse cenário que os dados mais recentes tornam essa pergunta urgente. De acordo com o Anuário Brasileiro de Segurança Pública, Eunápolis e Porto Seguro figuram entre as quatro cidades mais violentas do país, com taxas de 85,1 e 71,2 mortes violentas intencionais por 100 mil habitantes, respectivamente, e lideram o país em mortes decorrentes de intervenção policial entre os municípios com mais de 100 mil habitantes, com 32,3 por 100 mil em Porto Seguro e 29,7 em Eunápolis (FÓRUM BRASILEIRO DE SEGURANÇA PÚBLICA, 2026). Em Porto Seguro, a ação policial respondeu por 45% das 130 mortes violentas registradas em 2025. No plano estadual, a Bahia somou 1.570 mortes por intervenção policial no mesmo ano, o maior número absoluto do país. Cumpre ressaltar que esse padrão não é racialmente neutro: estudos sobre abordagem e letalidade policial demonstram que a pertinência racial opera como critério de suspeição e de uso da força, inclusive em Salvador (RAMOS; MUSUMECI, 2005; ANUNCIAÇÃO; TRAD; FERREIRA, 2020; SINHORETTO; BATITUCCI, 2023).</w:t>
+        <w:t xml:space="preserve">É nesse cenário que os dados mais recentes tornam essa pergunta urgente. De acordo com o Anuário Brasileiro de Segurança Pública, Eunápolis e Porto Seguro figuram entre as quatro cidades mais violentas do país, com taxas de 85,1 e 71,2 mortes violentas intencionais por 100 mil habitantes, respectivamente, e ocupam as duas primeiras posições do país em mortes decorrentes de intervenção policial entre os municípios com mais de 100 mil habitantes, com 32,3 por 100 mil em Porto Seguro e 29,7 em Eunápolis (FÓRUM BRASILEIRO DE SEGURANÇA PÚBLICA, 2026). Em Porto Seguro, a ação policial respondeu por 45% das 130 mortes violentas registradas em 2025. No plano estadual, a Bahia somou 1.570 mortes por intervenção policial no mesmo ano, o maior número absoluto do país. Cumpre ressaltar que esse padrão não é racialmente neutro: estudos sobre abordagem e letalidade policial demonstram que a pertinência racial opera como critério de suspeição e de uso da força, inclusive em Salvador (RAMOS; MUSUMECI, 2005; ANUNCIAÇÃO; TRAD; FERREIRA, 2020; SINHORETTO; BATITUCCI, 2023).</w:t>
       </w:r>
     </w:p>
     <w:p>
@@ -170,7 +170,7 @@
           <w:rFonts w:ascii="Times New Roman" w:hAnsi="Times New Roman" w:eastAsia="Times New Roman" w:cs="Times New Roman"/>
           <w:sz w:val="24"/>
         </w:rPr>
-        <w:t xml:space="preserve">Ocorre que, na prática, a gestão desses programas apoia-se predominantemente em metas quantitativas, como a redução dos Crimes Violentos Letais e Intencionais (CVLI) e dos Crimes Violentos contra o Patrimônio (CVP), em registros de produtividade e em premiações por desempenho. Em outras palavras, tais instrumentos dizem muito sobre o que a polícia faz, mas pouco sobre como ela trata as pessoas com quem interage, e nada sobre quem, racialmente, suporta os custos dessa atuação. A aparência técnica e neutra desses controles pode, assim, encobrir a reprodução do racismo institucional, à semelhança do que Souza, Ferreira e Santos (2021) identificam no campo jurídico como dispositivo da branquitude.</w:t>
+        <w:t xml:space="preserve">Ocorre que, na prática, a gestão desses programas apoia-se predominantemente em metas quantitativas, como a redução dos Crimes Violentos Letais e Intencionais (CVLI) e dos Crimes Violentos contra o Patrimônio (CVP), em registros de produtividade e em premiações por desempenho. Em outras palavras, tais instrumentos dizem muito sobre o que a polícia faz, mas pouco sobre como ela trata as pessoas com quem interage, e nada sobre quem, racialmente, suporta os custos dessa atuação. A aparência técnica e neutra desses controles pode, por conseguinte, encobrir a reprodução do racismo institucional, à semelhança do que Souza, Ferreira e Santos (2021) identificam no campo jurídico como dispositivo da branquitude.</w:t>
       </w:r>
     </w:p>
     <w:p>
@@ -246,7 +246,7 @@
           <w:rFonts w:ascii="Times New Roman" w:hAnsi="Times New Roman" w:eastAsia="Times New Roman" w:cs="Times New Roman"/>
           <w:sz w:val="24"/>
         </w:rPr>
-        <w:t xml:space="preserve">Na dimensão social, a segurança pública constitui questão prioritária para a qualidade de vida no Sul da Bahia, e a confiança das populações negras e quilombolas na polícia é condição para que o policiamento comunitário cumpra a sua promessa de prevenção e de coprodução da segurança. Compreender em que medida os controles existentes produzem, ou corroem, essa confiança permite qualificar a própria política pública. Espera-se, assim, que a pesquisa ofereça subsídios para a construção de indicadores de legitimidade com recorte étnico-racial, em diálogo com a agenda do Objetivo de Desenvolvimento Sustentável 18 (Igualdade Étnico-Racial), bem como para o fortalecimento do controle social em âmbito local.</w:t>
+        <w:t xml:space="preserve">Na dimensão social, a segurança pública constitui questão prioritária para a qualidade de vida no Sul da Bahia, e a confiança das populações negras e quilombolas na polícia é condição para que o policiamento comunitário cumpra a sua promessa de prevenção e de coprodução da segurança. Compreender em que medida os controles existentes produzem, ou corroem, essa confiança permite qualificar a própria política pública. Daí a expectativa de que a pesquisa ofereça subsídios para a construção de indicadores de legitimidade com recorte étnico-racial, em diálogo com a agenda do Objetivo de Desenvolvimento Sustentável 18 (Igualdade Étnico-Racial), bem como para o fortalecimento do controle social em âmbito local.</w:t>
       </w:r>
     </w:p>
     <w:p>

</xml_diff>